<commit_message>
PL copy synced with Wave 27 (mechanisms + citation fixes)
Co-Authored-By: Claude Opus 5.5 <noreply@anthropic.com>
</commit_message>
<xml_diff>
--- a/output/IPB_Grzegorz_Piotrowski_PL.docx
+++ b/output/IPB_Grzegorz_Piotrowski_PL.docx
@@ -387,7 +387,7 @@
           <w:p>
             <w:r/>
             <w:r>
-              <w:t>1. Przegląd literatury obejmujący transfer z symulacji do rzeczywistości, randomizację domeny i adaptację domenową, neuronową rekonstrukcję scen na podstawie danych rzeczywistych (np. 3D Gaussian Splatting) oraz uczenie głębokie w nawigacji robotów i manipulacji robotycznej, w tym udział w wewnętrznej grupie czytelniczej (reading group).</w:t>
+              <w:t>1. Przegląd literatury obejmujący transfer z symulacji do rzeczywistości, randomizację domeny i adaptację domenową, neuronową rekonstrukcję scen na podstawie danych rzeczywistych (np. 3D Gaussian Splatting) oraz uczenie głębokie w nawigacji robotów i manipulacji robotycznej, w tym udział w wewnętrznej grupie czytelniczej.</w:t>
             </w:r>
           </w:p>
           <w:p>
@@ -397,7 +397,7 @@
           </w:p>
           <w:p>
             <w:r>
-              <w:t>3. Przygotowanie środowiska badawczego do nawigacji robotów i manipulacji robotycznej, ze wspólnymi narzędziami do rekonstrukcji i zasobami obliczeniowymi. W przypadku nawigacji obejmuje ono nagrania rzeczywistych scen, cyfrowe bliźniaki w symulatorze nawigacji oraz oparte na zbiorze danych rozwiązanie zastępcze (proxy), które mierzy lukę związaną z wiernością rekonstrukcji. W przypadku manipulacji obejmuje ono cyfrowe bliźniaki rzeczywistych scen stołowych, zbudowane na podstawie obrazów z publicznych zbiorów danych robotycznych i zestawione z opublikowanymi wynikami tych samych polityk na rzeczywistych robotach.</w:t>
+              <w:t>3. Przygotowanie środowiska badawczego do nawigacji robotów i manipulacji robotycznej, ze wspólnymi narzędziami do rekonstrukcji i zasobami obliczeniowymi. W przypadku nawigacji obejmuje ono nagrania rzeczywistych scen, cyfrowe bliźniaki w symulatorze nawigacji oraz opartą na zbiorze danych miarę zastępczą (proxy), która mierzy lukę związaną z wiernością rekonstrukcji. W przypadku manipulacji obejmuje ono cyfrowe bliźniaki rzeczywistych scen stołowych, zbudowane na podstawie obrazów z publicznych zbiorów danych robotycznych i zestawione z opublikowanymi wynikami tych samych polityk na rzeczywistych robotach.</w:t>
             </w:r>
           </w:p>
           <w:p>
@@ -431,12 +431,12 @@
           </w:p>
           <w:p>
             <w:r>
-              <w:t>2. Zakończenie badań nad szkodliwymi błędami rekonstrukcji w obu zadaniach oraz nad randomizacją każdego obszaru cyfrowego bliźniaka zgodnie z niepewnością jego rekonstrukcji i znaczeniem dla zadania.</w:t>
+              <w:t>2. Zakończenie badań nad szkodliwymi błędami rekonstrukcji w obu zadaniach oraz nad randomizacją każdego obszaru cyfrowego bliźniaka zgodnie z jego szacowanym błędem rekonstrukcji i znaczeniem dla zadania.</w:t>
             </w:r>
           </w:p>
           <w:p>
             <w:r>
-              <w:t>3. Napisanie artykułu naukowego na konferencję z listy ministerialnej, dotyczącego błędów rekonstrukcji decydujących o generalizacji w nawigacji i manipulacji; planowane zgłoszenie na konferencję lub do czasopisma z listy ministerialnej poświęcone robotyce i fizycznej sztucznej inteligencji, np. ICRA 2028 lub IEEE Robotics and Automation Letters (RA-L).</w:t>
+              <w:t>3. Napisanie artykułu naukowego na konferencję z listy ministerialnej, dotyczącego błędów rekonstrukcji decydujących o generalizacji w nawigacji i manipulacji; planowane zgłoszenie na konferencję robotyczną lub do czasopisma z listy ministerialnej ukierunkowanych na fizyczną sztuczną inteligencję, np. ICRA 2028 lub IEEE Robotics and Automation Letters (RA-L).</w:t>
             </w:r>
           </w:p>
           <w:p>
@@ -480,7 +480,7 @@
           </w:p>
           <w:p>
             <w:r>
-              <w:t>2. Zakończenie badań nad lokalizacją luki między symulacją a rzeczywistością wewnątrz modeli obu zadań oraz nad dopasowaniem reprezentacji na tym etapie.</w:t>
+              <w:t>2. Zakończenie badań nad lokalizacją luki między symulacją a rzeczywistością wewnątrz modeli obu zadań oraz nad wyrównywaniem reprezentacji na tym etapie.</w:t>
             </w:r>
           </w:p>
           <w:p>
@@ -636,17 +636,17 @@
     </w:p>
     <w:p>
       <w:r>
-        <w:t>Uczenie głębokie poczyniło ogromne postępy w widzeniu komputerowym i przetwarzaniu języka naturalnego, w dużej mierze dzięki olbrzymim ilościom danych zebranych z internetu. Fizyczna sztuczna inteligencja, czyli sztuczna inteligencja w robotach i innych systemach ucieleśnionych (embodied), które postrzegają świat rzeczywisty i w nim działają, nie może polegać na takich danych. Jej modele potrzebują danych z interakcji, których zbieranie za pomocą rzeczywistych robotów jest powolne, kosztowne, a czasem niebezpieczne, dlatego zwykle trenuje się je w symulacji. W ostatnim czasie cyfrowe bliźniaki, czyli symulacje zbudowane na podstawie danych rzeczywistych, stały się obiecującą alternatywą dla ręcznie tworzonych symulatorów. Metody neuronowej rekonstrukcji scen, takie jak 3D Gaussian Splatting, przekształcają krótkie nagranie rzeczywistego miejsca w fotorealistycznego cyfrowego bliźniaka, w którym model można trenować na dużą skalę. Dane rzeczywiste zamienia się w symulację, w niej trenuje się model, a następnie przenosi się go z powrotem do rzeczywistości, co tworzy pętlę rzeczywistość–symulacja–rzeczywistość (rzeczywistość–symulacja–rzeczywistość).</w:t>
+        <w:t>Uczenie głębokie poczyniło ogromne postępy w widzeniu komputerowym i przetwarzaniu języka naturalnego, w dużej mierze dzięki olbrzymim ilościom danych zebranych z internetu. Fizyczna sztuczna inteligencja, czyli sztuczna inteligencja w robotach i innych systemach ucieleśnionych, które postrzegają świat rzeczywisty i w nim działają, nie może polegać na takich danych. Jej modele potrzebują danych z interakcji, których zbieranie za pomocą rzeczywistych robotów jest powolne, kosztowne, a czasem niebezpieczne, dlatego zwykle trenuje się je w symulacji. W ostatnim czasie cyfrowe bliźniaki, czyli symulacje zbudowane na podstawie danych rzeczywistych, stały się obiecującą alternatywą dla ręcznie tworzonych symulatorów. Metody neuronowej rekonstrukcji scen, takie jak 3D Gaussian Splatting, przekształcają krótkie nagranie rzeczywistego miejsca w fotorealistycznego cyfrowego bliźniaka, w którym model można trenować na dużą skalę. Dane rzeczywiste zamienia się w symulację, w niej trenuje się model, a następnie przenosi się go z powrotem do rzeczywistości, co tworzy pętlę rzeczywistość–symulacja–rzeczywistość.</w:t>
       </w:r>
     </w:p>
     <w:p>
       <w:r>
-        <w:t>Wartość tej pętli zależy jednak od tego, jak dobrze wytrenowane modele generalizują. Model, który dobrze działa w symulacji, często zawodzi w rzeczywistości, ponieważ żadna symulacja nie odwzorowuje świata rzeczywistego dokładnie: wygląd, geometria, oświetlenie i fizyka są jedynie przybliżone, a błędy rekonstrukcji różnią się między obszarami sceny. Wynikający z tego spadek skuteczności nazywa się luką między symulacją a rzeczywistością. Jest ona spowodowana przesunięciem między rozkładami danych symulowanych i rzeczywistych, stanowi więc szczególny przypadek uczenia przy przesunięciu rozkładu (distribution shift) i jedną z głównych przeszkód dla fizycznej sztucznej inteligencji. Dotychczas zaproponowane metody mają kilka ograniczeń. Randomizacja domeny, nawet dopasowana do danych rzeczywistych, zmienia kilka globalnych parametrów niezależnie od tego, gdzie symulacja jest niedokładna, a reprezentacje niezmiennicze mogą pomijać informacje potrzebne do wykonania zadania. Ponadto nieliczne dane rzeczywiste wykorzystywane do adaptacji służą zwykle do korekty albo modelu, albo symulacji, ale nie obu jednocześnie. Wreszcie większość metod jest ewaluowana na jednym zadaniu i kilku scenach, a nie wiadomo, które właściwości cyfrowego bliźniaka i wyuczonych reprezentacji decydują o tym, czy model generalizuje do rzeczywistości.</w:t>
+        <w:t>Wartość tej pętli zależy jednak od tego, jak dobrze wytrenowane modele generalizują. Model, który dobrze działa w symulacji, często zawodzi w rzeczywistości, ponieważ żadna symulacja nie odwzorowuje świata rzeczywistego dokładnie: wygląd, geometria, oświetlenie i fizyka są jedynie przybliżone, a błędy rekonstrukcji różnią się między obszarami sceny. Wynikający z tego spadek skuteczności nazywa się luką między symulacją a rzeczywistością. Jest ona spowodowana przesunięciem między rozkładami danych symulowanych i rzeczywistych, stanowi więc szczególny przypadek uczenia przy przesunięciu rozkładu i jedną z głównych przeszkód dla fizycznej sztucznej inteligencji. Dotychczas zaproponowane metody mają kilka ograniczeń. Randomizacja domeny, nawet dopasowana do danych rzeczywistych, zmienia kilka globalnych parametrów niezależnie od tego, gdzie symulacja jest niedokładna, a reprezentacje niezmiennicze mogą pomijać informacje potrzebne do wykonania zadania. Ponadto nieliczne dane rzeczywiste wykorzystywane do adaptacji służą zwykle do korekty albo modelu, albo symulacji, ale nie obu jednocześnie. Wreszcie większość metod jest ewaluowana na jednym zadaniu i kilku scenach, a nie wiadomo, które właściwości cyfrowego bliźniaka i wyuczonych reprezentacji decydują o tym, czy model generalizuje do rzeczywistości.</w:t>
       </w:r>
     </w:p>
     <w:p>
       <w:r>
-        <w:t>Dlatego celem rozprawy jest poprawa zdolności generalizacji modeli uczenia głębokiego w transferze rzeczywistość–symulacja–rzeczywistość za pomocą metod uczenia reprezentacji, w tych punktach pętli, w których powstaje luka między symulacją a rzeczywistością. Badania skupią się na zrozumieniu, które błędy rekonstrukcji cyfrowego bliźniaka szkodzą generalizacji, na lokalizacji miejsca wewnątrz modelu, w którym powstaje luka, i jej redukcji w tym miejscu, a także na wyborze niewielkiej ilości danych rzeczywistych, która najefektywniej koryguje zarówno cyfrowego bliźniaka, jak i model. Badania zweryfikują również, czy uzyskane ulepszenia przenoszą się na niewidziane wcześniej środowiska oraz z jednego zadania fizycznego na inne, a także które właściwości przesunięcia rozkładu wyjaśniają, kiedy tak się dzieje. Metody nie będą powiązane z konkretnym zadaniem; jako dwa równorzędne środowiska testowe planowane są nawigacja robotów i manipulacja robotyczna. W przypadku nawigacji publiczne nagrania rzeczywistych scen, w których drugie, niezależne nagranie pozwala zmierzyć lukę związaną z wiernością rekonstrukcji, zostaną uzupełnione rzeczywistym robotem, dostarczającym głównych dowodów dotyczących różnic w aktuacji i czujnikach. W przypadku manipulacji cyfrowe bliźniaki rzeczywistych scen stołowych zostaną zbudowane na podstawie obrazów z publicznych zbiorów danych robotycznych i porównane z opublikowanymi wynikami tych samych polityk na rzeczywistych robotach. Oprócz bardziej niezawodnych modeli badania mogą pomóc wyjaśnić, dlaczego modele trenowane na danych syntetycznych odnoszą sukces lub zawodzą na danych rzeczywistych, co ma znaczenie dla uczenia maszynowego w ogóle.</w:t>
+        <w:t>Dlatego celem rozprawy jest poprawa zdolności generalizacji modeli uczenia głębokiego w transferze rzeczywistość–symulacja–rzeczywistość za pomocą metod, które analizują i wyrównują wyuczone reprezentacje modeli, stosowanych w tych punktach pętli, w których powstaje luka między symulacją a rzeczywistością. Badania skupią się na zrozumieniu, które błędy rekonstrukcji cyfrowego bliźniaka szkodzą generalizacji, na lokalizacji etapu modelu, na którym informacja o zadaniu zostaje utracona dla rzeczywistych danych wejściowych, i zmniejszeniu luki na tym etapie, a także na wyborze, przy ustalonym budżecie, niewielkiej ilości danych rzeczywistych, która najlepiej koryguje zarówno cyfrowego bliźniaka, jak i model. Badania zweryfikują również, czy uzyskane ulepszenia przenoszą się na niewidziane wcześniej środowiska oraz z jednego zadania fizycznego na inne, a także czy zmierzone wcześniej właściwości przesunięcia rozkładu pozwalają przewidzieć, kiedy tak się dzieje. Metody nie będą powiązane z konkretnym zadaniem; jako dwa równorzędne środowiska testowe planowane są nawigacja robotów i manipulacja robotyczna. W przypadku nawigacji lukę związaną z wiernością rekonstrukcji zmierzy drugie, niezależne nagranie zawarte w publicznych nagraniach rzeczywistych scen, a jeśli dostęp na to pozwoli, rzeczywisty robot posłuży do sprawdzenia kierunku wyników i trafności tej miary zastępczej. W przypadku manipulacji cyfrowe bliźniaki rzeczywistych scen stołowych zostaną zbudowane na podstawie obrazów z publicznych zbiorów danych robotycznych i porównane z opublikowanymi wynikami tych samych polityk na rzeczywistych robotach. Oprócz bardziej niezawodnych modeli badania mogą pomóc wyjaśnić, dlaczego modele trenowane na danych syntetycznych odnoszą sukces lub zawodzą na danych rzeczywistych, co ma znaczenie dla uczenia maszynowego w ogóle.</w:t>
       </w:r>
     </w:p>
     <w:p>
@@ -664,37 +664,37 @@
     </w:p>
     <w:p>
       <w:r>
-        <w:t>Modele uczenia głębokiego do nawigacji i manipulacji potrzebują więcej doświadczenia, niż mogą zapewnić rzeczywiste roboty, dlatego zwykle trenuje się je w symulacji. Jednak skuteczność w symulacji może słabo przewidywać skuteczność w świecie rzeczywistym, jeśli symulator nie jest starannie dostrojony [1]. Luka między symulacją a rzeczywistością jest przypadkiem uczenia przy przesunięciu rozkładu. Teoria adaptacji domenowej ogranicza od góry błąd modelu w domenie docelowej przez jego błąd w domenie źródłowej, rozbieżność między oboma rozkładami oraz łączny błąd najlepszego pojedynczego modelu w obu domenach [2]. Traktowane wyłącznie jako motywacja, ograniczenie to sugeruje, by rozkład treningowy obejmował rzeczywistość, by model był niewrażliwy na pozostałą rozbieżność oraz, ponieważ niezmienniczość nie może zmniejszyć błędu łącznego, by korygować symulację w kierunku rzeczywistości.</w:t>
+        <w:t>Modele uczenia głębokiego do nawigacji i manipulacji potrzebują więcej doświadczenia, niż mogą zapewnić rzeczywiste roboty, dlatego zwykle trenuje się je w symulacji. Jednak skuteczność w symulacji może słabo przewidywać skuteczność w świecie rzeczywistym, jeśli symulator nie jest starannie dostrojony [1]. Luka między symulacją a rzeczywistością jest przypadkiem uczenia przy przesunięciu rozkładu. Teoria adaptacji domenowej ogranicza od góry błąd modelu w domenie docelowej przez jego błąd w domenie źródłowej, rozbieżność między oboma rozkładami oraz błąd wspólny najlepszego pojedynczego modelu w obu domenach [2]. Traktowane wyłącznie jako motywacja, ograniczenie to sugeruje, by rozkład treningowy obejmował rzeczywistość, by model był niewrażliwy na pozostałą rozbieżność oraz, ponieważ niezmienniczość nie jest ukierunkowana na błąd wspólny i może go nawet zwiększać, by korygować symulację w kierunku rzeczywistości, co może bezpośrednio zmniejszyć ten błąd.</w:t>
       </w:r>
     </w:p>
     <w:p>
       <w:r>
-        <w:t>Randomizacja domeny zmienia parametry symulatora, takie jak tekstury, tak aby rzeczywistość jawiła się jako jeszcze jedna wariacja [3]. Zbyt szeroka randomizacja prowadzi do zachowawczego działania, dlatego późniejsze prace kształtują jej rozkład, dopasowując go do kilku rzeczywistych przebiegów (rollouts) [4] lub maksymalizując jego entropię przy zachowaniu skuteczności wykonania zadania [5]. Metody te dostrajają kilka globalnych parametrów syntetycznego symulatora i nie uwzględniają błędów zmieniających się w obrębie sceny.</w:t>
+        <w:t>Randomizacja domeny zmienia parametry symulatora, takie jak tekstury, tak aby rzeczywistość jawiła się jako jeszcze jedna wariacja [3]. Zbyt szeroka randomizacja prowadzi do zachowawczego działania, dlatego późniejsze prace kształtują jej rozkład, dopasowując go do kilku rzeczywistych przebiegów [4] lub maksymalizując jego entropię przy zachowaniu skuteczności wykonania zadania [5]. Metody te dostrajają kilka globalnych parametrów syntetycznego symulatora i nie uwzględniają błędów zmieniających się w obrębie sceny.</w:t>
       </w:r>
     </w:p>
     <w:p>
       <w:r>
-        <w:t>Inną możliwością jest niezmienniczość. Trening z przeciwnikiem domenowym (domain-adversarial training) dopasowuje cechy między domenami [6]. W robotyce dopasowanie łącznych rozkładów obserwacji i akcji w danych symulowanych i rzeczywistych poprawiło w rzeczywistości działanie polityk trenowanych wspólnie na obu rodzajach danych (co-training), czyli modeli odwzorowujących obserwacje na akcje [7]. Jednak niezmienniczość przy niskim błędzie w domenie źródłowej nie gwarantuje transferu, ponieważ może zwiększać składnik błędu łącznego [8], a pełna niezmienniczość może usuwać informacje o zadaniu. Skuteczny wspólny trening na danych symulowanych i rzeczywistych dopasowuje obie domeny, zachowując jednocześnie możliwość ich rozróżnienia [9], zatem sama rozdzielność domen nie pokazuje, w którym miejscu luka szkodzi zadaniu. Niezmienniczość jest też zwykle wymuszana w stałym miejscu, na wejściu lub na cechach końcowych.</w:t>
+        <w:t>Inną możliwością jest niezmienniczość. Trening z przeciwnikiem domenowym (domain-adversarial training) wyrównuje cechy między domenami [6]. W robotyce wyrównanie łącznych rozkładów obserwacji i akcji w danych symulowanych i rzeczywistych poprawiło w rzeczywistości działanie polityk trenowanych wspólnie na obu rodzajach danych, czyli modeli odwzorowujących obserwacje na akcje [7]. Jednak niezmienniczość przy niskim błędzie w domenie źródłowej nie gwarantuje transferu, ponieważ może zwiększać składnik błędu wspólnego, gdy rozkłady etykiet, tutaj akcji, różnią się między domenami [8], a pełna niezmienniczość może usuwać informacje o zadaniu. Skuteczny wspólny trening na danych symulowanych i rzeczywistych wyrównuje obie domeny, zachowując jednocześnie możliwość ich rozróżnienia [9], zatem sama rozdzielność domen nie pokazuje, w którym miejscu luka szkodzi zadaniu. Niezmienniczość jest też zwykle wymuszana w miejscach wybranych z góry, takich jak wejście, cechy końcowe lub ustalone warstwy, a nie tam, gdzie według pomiarów powstaje luka.</w:t>
       </w:r>
     </w:p>
     <w:p>
       <w:r>
-        <w:t>Cyfrowe bliźniaki są podejściem nowszym. 3D Gaussian Splatting [10] rekonstruuje fotorealistyczne sceny ze zwykłych zdjęć. W manipulacji bliźniaki wykorzystano do trenowania polityk na podstawie skanu docelowej sceny [11], do przenoszenia polityk opartych na obrazach do rzeczywistości bez danych rzeczywistych [12] oraz do ukierunkowania uczenia ze wzmocnieniem w świecie rzeczywistym na podstawie nagrania wykonanego telefonem [13]. Sparowane ewaluacje w symulacji i w rzeczywistości pokazały, że sceny wizualnie dopasowane do rzeczywistych obrazów dwóch konfiguracji robotów odzwierciedlają skuteczność tych samych polityk w świecie rzeczywistym [14]. W nawigacji polityki trenowano w bliźniakach zbudowanych z nagrania pomieszczenia wykonanego telefonem [15] oraz z monokularowego nagrania wideo scen miejskich [16]. Wpływ czynników symulacji badano głównie globalnie, np. randomizacji, fotorealizmu i realizmu fizyki w rzeczywistej manipulacji [17] lub wierności istotnej dla zadania w robotycznej ultrasonografii [18]. Dla obu zadań otwarte pozostaje pytanie, które błędy rekonstrukcji zmieniające się w obrębie sceny szkodzą generalizacji oraz jak zmienność w treningu powinna odpowiadać niepewności rekonstrukcji każdego obszaru.</w:t>
+        <w:t>Cyfrowe bliźniaki są podejściem nowszym. 3D Gaussian Splatting [10] rekonstruuje fotorealistyczne sceny ze zdjęć wykonanych z wielu punktów widzenia. W manipulacji bliźniaki wykorzystano do trenowania polityk na podstawie skanu docelowej sceny [11], do przenoszenia polityk opartych na obrazach do rzeczywistości bez demonstracji w świecie rzeczywistym [12] oraz do ukierunkowania uczenia ze wzmocnieniem w świecie rzeczywistym na podstawie nagrania wykonanego telefonem [13]. Sparowane ewaluacje w symulacji i w rzeczywistości pokazały, że sceny dopasowane do rzeczywistych obrazów i kontrolerów dwóch konfiguracji robotów odzwierciedlają skuteczność tych samych polityk w świecie rzeczywistym [14]. W nawigacji polityki dostrajano w bliźniakach zbudowanych z nagrania pomieszczenia wykonanego telefonem [15] i trenowano w bliźniakach zbudowanych z monokularowych nagrań wideo scen miejskich [16]. Wpływ czynników symulacji badano głównie globalnie, np. randomizacji, fotorealizmu i realizmu fizyki w rzeczywistej manipulacji [17]. Dla całych przestrzeni roboczych podobieństwo cech wstępnie wytrenowanego modelu między widokami renderowanymi a rzeczywistymi przewidywało zgodność skuteczności w symulacji i w rzeczywistości lepiej niż LPIPS czy PSNR [18]. Dla obu zadań otwarte pozostaje pytanie, które błędy rekonstrukcji zmieniające się w obrębie sceny szkodzą generalizacji oraz jak zmienność w treningu powinna odpowiadać błędowi rekonstrukcji i znaczeniu dla zadania każdego obszaru.</w:t>
       </w:r>
     </w:p>
     <w:p>
       <w:r>
-        <w:t>Niejasne jest również, w którym miejscu wewnątrz modelu powstaje luka. Sondowanie (probing), czyli odczytywanie informacji ze stanów ukrytych za pomocą prostych klasyfikatorów, wykazało, że dostrajanie na akcjach pogarsza reprezentacje wizualne polityk robotów [19], a najlepsze warstwy do adaptacji zależą od rodzaju przesunięcia [20]. W modelach trenowanych w bliźniakach nie zlokalizowano dotąd etapu, na którym informacja o zadaniu dostępna w symulacji przestaje być możliwa do odtworzenia z danych rzeczywistych.</w:t>
+        <w:t>Niejasne jest również, w którym miejscu wewnątrz modelu powstaje luka. Sondowanie stanów ukrytych, czyli odczytywanie z nich informacji za pomocą prostych klasyfikatorów, wykazało, że dostrajanie na akcjach pogarsza reprezentacje wizualne modeli wizja–język–akcja (vision-language-action, VLA) [19]. Niezależnie od tego badania nad dostrajaniem wybranych warstw pokazały, że najlepsze warstwy do adaptacji zależą od rodzaju przesunięcia [20]. Według naszej wiedzy w modelach trenowanych w bliźniakach nie zlokalizowano dotąd etapu, na którym informacja o zadaniu dostępna w symulacji przestaje być możliwa do odtworzenia z danych rzeczywistych.</w:t>
       </w:r>
     </w:p>
     <w:p>
       <w:r>
-        <w:t>Pozostałą lukę zwykle zmniejsza się za pomocą niewielkiej ilości danych rzeczywistych. Wspólny trening z małym zbiorem danych rzeczywistych przynosi duże korzyści [21], a aktywna identyfikacja systemu zbiera rzeczywiste trajektorie najbardziej informatywne pod względem fizyki [22]. Najbliższa praca wykorzystuje bliźniaka do znajdowania konfiguracji podatnych na niepowodzenia na potrzeby rzeczywistych przebiegów [13]. Metody te korygują albo model, albo symulację. Według naszej wiedzy nie badano korekty obu na podstawie tych samych wybranych danych, kierowanej niepewnością rekonstrukcji bliźniaka.</w:t>
+        <w:t>Pozostałą lukę zmniejsza się za pomocą niewielkiej ilości danych rzeczywistych. Wspólny trening z małym zbiorem danych rzeczywistych przynosi duże korzyści [21], a aktywna identyfikacja systemu projektuje w symulacji politykę eksploracji, której rzeczywista trajektoria niesie najwięcej informacji o parametrach fizycznych [22]. Najbliższa praca wykorzystuje bliźniaka do znajdowania konfiguracji podatnych na niepowodzenia na potrzeby rzeczywistych przebiegów [13]. Prace te wykorzystują wybrane dane rzeczywiste do korekty albo modelu, albo symulacji. Według naszej wiedzy nie badano korekty obu na podstawie tych samych wybranych danych.</w:t>
       </w:r>
     </w:p>
     <w:p>
       <w:r>
-        <w:t>Wreszcie lukę można rozłożyć na czynniki zmienności, których uporządkowanie według trudności jest w dużej mierze zgodne między symulacją a rzeczywistością [23]. Rzadko sprawdza się, czy pomiary wykonane przed zastosowaniem metody przewidują, lepiej niż proste wskaźniki, takie jak wielkość luki, czy jej korzyść przeniesie się na nową scenę lub na inne zadanie.</w:t>
+        <w:t>Lukę można też rozłożyć na czynniki zmienności, których uporządkowanie według trudności jest w dużej mierze zgodne między symulacją a rzeczywistością [23]. Rzadko sprawdza się, czy pomiary wykonane przed zastosowaniem metody przewidują, lepiej niż proste wskaźniki, takie jak wielkość luki, czy jej korzyść przeniesie się na nową scenę lub na inne zadanie.</w:t>
       </w:r>
     </w:p>
     <w:p>
@@ -747,7 +747,7 @@
     </w:p>
     <w:p>
       <w:r>
-        <w:t>[9] Lei, Y., et al. (2026). A Mechanistic Analysis of Sim-and-Real Co-Training in Generative Robot Policies. arXiv:2604.13645.</w:t>
+        <w:t>[9] Lei, Y., et al. (2026). A mechanistic analysis of sim-and-real co-training in generative robot policies. arXiv preprint arXiv:2604.13645.</w:t>
       </w:r>
     </w:p>
     <w:p>
@@ -767,7 +767,7 @@
     </w:p>
     <w:p>
       <w:r>
-        <w:t>[13] Xu, Q., et al. (2026). TwinRL: Digital twin-driven reinforcement learning for real-world robotic manipulation. arXiv:2602.09023.</w:t>
+        <w:t>[13] Xu, Q., et al. (2026). TwinRL-VLA: Digital twin-driven reinforcement learning for real-world robotic manipulation. ACM MM (arXiv:2602.09023).</w:t>
       </w:r>
     </w:p>
     <w:p>
@@ -787,12 +787,12 @@
     </w:p>
     <w:p>
       <w:r>
-        <w:t>[17] Jin, R., et al. (2026). Grounding Sim-to-Real Generalization in Robotic Manipulation: An Empirical Study with Vision-Language-Action Models. arXiv:2603.22876.</w:t>
+        <w:t>[17] Jin, R., et al. (2026). Grounding sim-to-real generalization in robotic manipulation: An empirical study with vision-language-action models. ECCV.</w:t>
       </w:r>
     </w:p>
     <w:p>
       <w:r>
-        <w:t>[18] Qian, Y., et al. (2026). Task-Relevant Feature-Dynamics Fidelity Enables Zero-Shot Sim-to-Real Transfer for Robotic Ultrasound Scanning. arXiv:2608.29516.</w:t>
+        <w:t>[18] Wang, X., et al. (2026). ReVeal: A reconstruction-aware real-to-sim framework for VLA policy evaluation. arXiv preprint arXiv:2609.23910.</w:t>
       </w:r>
     </w:p>
     <w:p>
@@ -830,7 +830,7 @@
     </w:p>
     <w:p>
       <w:r>
-        <w:t>Badania prowadzone w ramach proponowanej rozprawy doktorskiej mają na celu zbadanie następujących pytań badawczych, każdego w dwóch zadaniach fizycznej sztucznej inteligencji: nawigacji robotów i manipulacji robotycznej.</w:t>
+        <w:t>Badania prowadzone w ramach proponowanej rozprawy doktorskiej dotyczą następujących pytań badawczych, każdego w dwóch zadaniach fizycznej sztucznej inteligencji: nawigacji robotów i manipulacji robotycznej.</w:t>
       </w:r>
     </w:p>
     <w:p>
@@ -844,7 +844,7 @@
         <w:t>Które błędy rekonstrukcji cyfrowego bliźniaka, zmieniające się w obrębie sceny, decydują o tym, jak dobrze generalizują trenowane w nim modele nawigacji i manipulacji?</w:t>
       </w:r>
       <w:r>
-        <w:t xml:space="preserve"> Teoria adaptacji domenowej, wykorzystana tu jako motywacja, ogranicza od góry błąd modelu w rzeczywistości przez jego błąd w symulacji, rozbieżność między rozkładem symulowanym i rzeczywistym oraz składnik błędu łącznego. Cyfrowy bliźniak pomieszczenia lub sceny stołowej odtwarza wygląd, geometrię i oświetlenie jedynie w przybliżeniu, a jego błędy różnią się między obszarami sceny. </w:t>
+        <w:t xml:space="preserve"> Błędy bliźniaka w wyglądzie, geometrii i oświetleniu różnią się w obrębie sceny. </w:t>
       </w:r>
       <w:r>
         <w:rPr>
@@ -853,7 +853,7 @@
         <w:t>Hipoteza:</w:t>
       </w:r>
       <w:r>
-        <w:t xml:space="preserve"> Szkodliwość błędu rekonstrukcji lepiej przewiduje zmiana, jaką wywołuje on w reprezentacji ustalonego modelu referencyjnego na wydzielonych (held-out) sparowanych widokach, niż jego wielkość w obrazie lub geometrii. Niezależnie od tego randomizacja każdego obszaru proporcjonalnie do niepewności jego rekonstrukcji i znaczenia dla zadania zapewnia lepszą generalizację niż randomizacja jednorodna. Aby to sprawdzić, w badaniach komponenty bliźniaka będą zastępowane dokładniejszym odniesieniem, a efekt tej zamiany będzie mierzony. Jeśli szkodliwość będzie zależeć od wielkości błędu, samo to przypisanie zostanie przedstawione jako wynik, a trzecie pytanie będzie się opierać wyłącznie na niepewności rekonstrukcji i wrażliwości akcji.</w:t>
+        <w:t xml:space="preserve"> Spadek skuteczności wywołany przez każdy typ błędu rekonstrukcji w danym obszarze lepiej niż wielkość błędu w obrazie lub geometrii, np. PSNR, LPIPS lub błąd głębi, przewiduje odległość cech ustalonego, wstępnie wytrenowanego kodera wizualnego między wydzielonymi widokami renderowanymi z tym błędem i bez niego. Niezależnie od tego randomizacja wyglądu i geometrii każdego obszaru z siłą rosnącą wraz z jego szacowanym błędem rekonstrukcji i znaczeniem dla zadania zapewnia lepszą generalizację niż jednorodna randomizacja o tej samej łącznej sile. Aby to sprawdzić, jeden typ błędu naraz będzie korygowany w wybranych obszarach, np. geometria na podstawie skanu laserowego, lub wprowadzany do referencyjnej rekonstrukcji o wysokiej wierności. Jeśli szkodliwość będzie zależeć od wielkości błędu, zostanie to przedstawione jako wynik, a trzecie pytanie będzie się opierać na niepewności rekonstrukcji i wrażliwości akcji, choć niepewność nie wychwytuje błędów odtwarzanych w sposób powtarzalny.</w:t>
       </w:r>
     </w:p>
     <w:p>
@@ -864,10 +864,10 @@
         <w:rPr>
           <w:b/>
         </w:rPr>
-        <w:t>W którym miejscu wewnątrz modelu trenowanego w symulacji powstaje luka sim-to-real i czy dopasowanie reprezentacji na tym etapie może ją zmniejszyć?</w:t>
+        <w:t>Na którym etapie modelu trenowanego lub dostrajanego w bliźniaku rzeczywiste dane wejściowe po raz pierwszy tracą informację o zadaniu dostępną dla symulowanych danych wejściowych i czy wyrównywanie reprezentacji na tym etapie zmniejsza lukę między symulacją a rzeczywistością?</w:t>
       </w:r>
       <w:r>
-        <w:t xml:space="preserve"> Modele trenowane w symulacji mogą opierać się na cechach nieobecnych w rzeczywistości, takich jak artefakty rekonstrukcji. Nawet w modelach, które dobrze się przenoszą, symulowane i rzeczywiste dane wejściowe pozostają rozróżnialne, dlatego lukę lepiej lokalizować na podstawie informacji o zadaniu, którą model traci dla rzeczywistych danych wejściowych. </w:t>
+        <w:t xml:space="preserve"> </w:t>
       </w:r>
       <w:r>
         <w:rPr>
@@ -876,7 +876,7 @@
         <w:t>Hipoteza:</w:t>
       </w:r>
       <w:r>
-        <w:t xml:space="preserve"> W obu zadaniach istnieje pierwszy etap modelu, na którym informacji o zadaniu możliwej do odczytania z symulowanych danych wejściowych nie da się już odczytać z rzeczywistych. Dopasowanie reprezentacji symulowanych i rzeczywistych na tym etapie, na podstawie kilku sparowanych widoków, zapewnia lepszą generalizację niż ich dopasowanie na wejściu, na cechach końcowych lub na wszystkich etapach. Sondowanie (probing) stanów ukrytych pozwoli zlokalizować ten etap przed jakąkolwiek interwencją.</w:t>
+        <w:t xml:space="preserve"> W obu zadaniach istnieje możliwy do wskazania najwcześniejszy etap lub wąski zakres etapów, na którym sonda liniowa wytrenowana na symulowanych stanach ukrytych traci na sparowanych stanach rzeczywistych dokładność w stopniu znacznie przekraczającym poziom odniesienia wyznaczony przez zadanie kontrolne, a utracona informacja wpływa na akcje. Dostrajanie warstw do tego etapu z funkcją straty dopasowującą rzeczywiste reprezentacje do sparowanych reprezentacji symulowanych na podstawie kilku widoków zmniejsza lukę bardziej niż ta sama funkcja straty zastosowana na wejściu, na cechach końcowych, na wszystkich etapach lub w warstwach wybranych według istniejących kryteriów, przy tej samej ilości danych i tym samym nakładzie. Sondy z zadaniami kontrolnymi pozwolą zlokalizować ten etap, a podmiana sondowanej podprzestrzeni stanów ukrytych z symulowanych danych wejściowych do rzeczywistych (activation patching) sprawdzi, czy model korzysta z tej informacji.</w:t>
       </w:r>
     </w:p>
     <w:p>
@@ -887,10 +887,10 @@
         <w:rPr>
           <w:b/>
         </w:rPr>
-        <w:t>Które dane rzeczywiste, wybrane przy ograniczonym budżecie, najefektywniej korygują zarówno symulację, jak i model?</w:t>
+        <w:t>Które dane rzeczywiste, wybrane przy ustalonym budżecie, najbardziej zmniejszają lukę między symulacją a rzeczywistością, gdy służą do korekty zarówno cyfrowego bliźniaka, jak i modelu?</w:t>
       </w:r>
       <w:r>
-        <w:t xml:space="preserve"> Dane rzeczywiste są kosztowne, a istniejące metody wykorzystują je do korekty albo modelu, albo symulacji. Niezmienniczość nie zmniejsza składnika błędu łącznego, który maleje jedynie w miarę zbliżania się symulacji do rzeczywistości. </w:t>
+        <w:t xml:space="preserve"> Istniejące metody korygują albo model, albo symulację, albo oba na podstawie różnych, niewybieranych celowo danych rzeczywistych. Wymuszanie niezmienniczości nie jest ukierunkowane na składnik błędu wspólnego w ograniczeniu z teorii adaptacji domenowej i może go zwiększać, gdy dane symulowane i rzeczywiste wymagają różnych akcji, natomiast zbliżanie symulacji do rzeczywistości może go bezpośrednio zmniejszyć. </w:t>
       </w:r>
       <w:r>
         <w:rPr>
@@ -899,7 +899,7 @@
         <w:t>Hipoteza:</w:t>
       </w:r>
       <w:r>
-        <w:t xml:space="preserve"> Korekta zarówno cyfrowego bliźniaka, jak i modelu na podstawie tych samych wybranych danych rzeczywistych zmniejsza lukę bardziej niż korekta tylko jednego z nich. Dane należy wybierać tam, gdzie według przewidywań bliźniak odbiega od rzeczywistości w sposób istotny dla zadania, co szacuje się na podstawie niepewności rekonstrukcji, odległości między reprezentacjami widoków symulowanych i rzeczywistych oraz wrażliwości przewidywanej akcji. Oczekuje się, że taki wybór okaże się lepszy od wyboru losowego i wyboru kierowanego niepowodzeniami. Reguły wyboru zostaną porównane przy równych budżetach w obu zadaniach, przy czym nieetykietowane obrazy rzeczywiste będą liczone jako dane rzeczywiste.</w:t>
+        <w:t xml:space="preserve"> Przy równym budżecie wykorzystanie tych samych wybranych danych rzeczywistych do korekty zarówno bliźniaka, jak i modelu zmniejsza lukę bardziej niż korekta tylko jednego z nich. Kandydackie widoki są oceniane według niepewności rekonstrukcji w ich pozie kamery, według tego, jak bardzo zmienia się przewidywana akcja, gdy bliźniak jest zaburzany w granicach tej niepewności, oraz, jeśli dostępny jest nieetykietowany obraz rzeczywisty, według odległości między reprezentacjami widoku renderowanego i rzeczywistego. Wybór ten zostanie porównany z wyborem losowym i wyborem kierowanym niepowodzeniami w zakresie budżetów liczonych w obrazach rzeczywistych dla nawigacji oraz w rzeczywistych epizodach lub klatkach dla manipulacji, z uwzględnieniem obrazów nieetykietowanych.</w:t>
       </w:r>
     </w:p>
     <w:p>
@@ -910,10 +910,10 @@
         <w:rPr>
           <w:b/>
         </w:rPr>
-        <w:t>Czy ulepszenia generalizują na niewidziane wcześniej środowiska i z jednego zadania na drugie oraz które właściwości przesunięcia rozkładu wyjaśniają, kiedy tak się dzieje?</w:t>
+        <w:t>Czy metody zastosowane z niezmienionymi ustawieniami poprawiają generalizację w niewidzianych wcześniej scenach i w drugim zadaniu oraz czy zmierzone wcześniej właściwości przesunięcia rozkładu pozwalają przewidzieć, kiedy tak się dzieje?</w:t>
       </w:r>
       <w:r>
-        <w:t xml:space="preserve"> Użyteczna metoda powinna działać poza pojedynczą sceną lub zadaniem. Opracowane metody zostaną zatem zastosowane z niezmienionymi ustawieniami do wielu wydzielonych scen obu zadań, a ulepszenie uzyskane w jednym zadaniu zostanie sprawdzone w drugim. </w:t>
+        <w:t xml:space="preserve"> </w:t>
       </w:r>
       <w:r>
         <w:rPr>
@@ -922,7 +922,7 @@
         <w:t>Hipoteza:</w:t>
       </w:r>
       <w:r>
-        <w:t xml:space="preserve"> Przypisanie luki z pierwszego pytania i jej lokalizację z drugiego można zmierzyć w nowej scenie lub nowym zadaniu przed zastosowaniem metody. Pomiary te przewidują, czy ulepszenie się przeniesie, także między zadaniami, lepiej niż proste wskaźniki, takie jak surowa wielkość luki lub rozbieżność na poziomie obrazu. Przewidywanie to zostanie sprawdzone na wielu wydzielonych scenach nawigacji i manipulacji.</w:t>
+        <w:t xml:space="preserve"> Przypisanie luki z pierwszego pytania i jej lokalizacja z drugiego, zmierzone w nowej scenie lub nowym zadaniu na podstawie rekonstrukcji referencyjnej i kilku sparowanych widoków, bez stosowania metody, są w przekroju wydzielonych scen silniej skorelowane rangowo ze zmniejszeniem luki osiąganym przez metodę niż proste wskaźniki, takie jak luka modelu bazowego lub rozbieżność na poziomie obrazu. Zostanie to sprawdzone na wielu wydzielonych scenach nawigacji z użyciem testów dla korelacji zależnych, a eksploracyjnie także na scenach manipulacji i między zadaniami.</w:t>
       </w:r>
     </w:p>
     <w:p>
@@ -935,12 +935,12 @@
     </w:p>
     <w:p>
       <w:r>
-        <w:t>Proponowana rozprawa doktorska ma przyczynić się do rozwoju dyscypliny naukowej poprzez podjęcie problemu generalizacji modeli uczenia głębokiego trenowanych w symulacjach zbudowanych na podstawie danych rzeczywistych, który pozostaje jedną z głównych przeszkód w stosowaniu uczenia maszynowego w fizycznej sztucznej inteligencji. Założeniem roboczym rozprawy jest to, że luka sim-to-real wynika głównie z ograniczonego zbioru rozbieżności istotnych dla zadania. Można je zidentyfikować wśród błędów rekonstrukcji cyfrowego bliźniaka, zlokalizować wewnątrz modelu i zmniejszyć za pomocą niewielkiej ilości dobrze dobranych danych rzeczywistych. Metody mają być ogólne, tj. niezwiązane z konkretnym robotem, sceną ani zadaniem, i zostaną zbadane w nawigacji robotów i manipulacji robotycznej.</w:t>
+        <w:t>Proponowana rozprawa doktorska ma przyczynić się do rozwoju dyscypliny naukowej poprzez podjęcie problemu generalizacji modeli uczenia głębokiego trenowanych w symulacjach zbudowanych na podstawie danych rzeczywistych, który pozostaje jedną z głównych przeszkód w stosowaniu uczenia maszynowego w fizycznej sztucznej inteligencji. Założeniem roboczym rozprawy jest to, że luka między symulacją a rzeczywistością wynika głównie z ograniczonego zbioru rozbieżności istotnych dla zadania. Można je zidentyfikować wśród błędów rekonstrukcji cyfrowego bliźniaka, zlokalizować wewnątrz modelu i zmniejszyć za pomocą niewielkiej ilości dobrze dobranych danych rzeczywistych. Metody mają być ogólne, tj. niezwiązane z konkretnym robotem, sceną ani zadaniem, i zostaną zbadane w nawigacji robotów i manipulacji robotycznej.</w:t>
       </w:r>
     </w:p>
     <w:p>
       <w:r>
-        <w:t>Po pierwsze, badania mają zapewnić lepsze zrozumienie tego, które błędy rekonstrukcji cyfrowego bliźniaka szkodzą generalizacji, wraz z metodą, która wprowadza zmienność do bliźniaka zgodnie z tą wiedzą, a nie jednorodnie. Po drugie, ich celem jest opracowanie sposobu znajdowania miejsca wewnątrz modelu głębokiego, w którym powstaje luka sim-to-real, oraz jej redukcji na tym etapie. Po trzecie, mają one zaproponować regułę wyboru niewielkiej ilości danych rzeczywistych, która koryguje zarówno cyfrowego bliźniaka, jak i model. Wreszcie zbadane zostanie, kiedy takie ulepszenia przenoszą się na niewidziane wcześniej środowiska i między zadaniami. Wiedza ta mogłaby uzupełnić obecnie dominujące heurystyki randomizacji podejściami lepiej uzasadnionymi i bardziej interpretowalnymi.</w:t>
+        <w:t>Po pierwsze, badania mają zapewnić lepsze zrozumienie tego, które błędy rekonstrukcji cyfrowego bliźniaka szkodzą generalizacji, wraz z metodą, która wprowadza zmienność do bliźniaka zgodnie z tą wiedzą, a nie jednorodnie. Po drugie, ich celem jest opracowanie sposobu lokalizowania etapu modelu głębokiego, na którym informacja o zadaniu dostępna dla symulowanych danych wejściowych zostaje utracona dla rzeczywistych, z wykorzystaniem sond z zadaniami kontrolnymi i interwencji przyczynowych, oraz zmniejszania luki przez wyrównywanie reprezentacji symulowanych i rzeczywistych na tym etapie. Po trzecie, mają one zaproponować regułę wyboru niewielkiej ilości danych rzeczywistych, która koryguje zarówno cyfrowego bliźniaka, jak i model. Wreszcie zbadane zostanie, kiedy takie ulepszenia przenoszą się na niewidziane wcześniej środowiska i między zadaniami. Wiedza ta mogłaby uzupełnić obecnie dominujące heurystyki randomizacji podejściami lepiej uzasadnionymi i bardziej interpretowalnymi.</w:t>
       </w:r>
     </w:p>
     <w:p>
@@ -958,12 +958,12 @@
     </w:p>
     <w:p>
       <w:r>
-        <w:t>Badania będą prowadzone zgodnie z metodami powszechnie przyjętymi w projektach z zakresu uczenia maszynowego i uczenia robotów. Ponieważ nie istnieje ugruntowana teoria gwarantująca generalizację z symulacji do rzeczywistości, dominująca część pracy będzie miała charakter empiryczny. Teoria adaptacji domenowej wiąże błąd modelu w rzeczywistości z jego błędem w symulacji i z rozbieżnością między nimi. Jest ona wykorzystywana jako motywacja, a właściwości proponowanych metod będą w miarę możliwości analizowane teoretycznie.</w:t>
+        <w:t>Badania będą prowadzone zgodnie z metodami powszechnie przyjętymi w projektach z zakresu uczenia maszynowego i uczenia robotów. Ponieważ nie istnieje ugruntowana teoria gwarantująca generalizację z symulacji do rzeczywistości, dominująca część pracy będzie miała charakter empiryczny. Teoria adaptacji domenowej wiąże błąd modelu w rzeczywistości z jego błędem w symulacji, rozbieżnością między oboma rozkładami oraz błędem najlepszego modelu w obu domenach. Jest ona wykorzystywana jako motywacja, a właściwości proponowanych metod będą w miarę możliwości analizowane teoretycznie.</w:t>
       </w:r>
     </w:p>
     <w:p>
       <w:r>
-        <w:t>Metody zostaną zbadane w dwóch zadaniach fizycznej sztucznej inteligencji, nawigacji robotów i manipulacji robotycznej, które korzystają ze wspólnych narzędzi do rekonstrukcji. Cyfrowe bliźniaki będą budowane z rzeczywistych obrazów za pomocą neuronowej rekonstrukcji scen, np. 3D Gaussian Splatting, i łączone z symulatorami do nawigacji (np. Habitat) i manipulacji (np. ManiSkill3). Modele odwzorowujące obrazy z kamery na akcje będą trenowane lub dostrajane w tych symulatorach, w miarę możliwości począwszy od modeli wstępnie wytrenowanych.</w:t>
+        <w:t>Metody zostaną zbadane w dwóch zadaniach fizycznej sztucznej inteligencji, nawigacji robotów i manipulacji robotycznej, które korzystają ze wspólnych narzędzi do rekonstrukcji. Cyfrowe bliźniaki będą budowane z rzeczywistych obrazów za pomocą neuronowej rekonstrukcji scen, np. 3D Gaussian Splatting [10], i łączone z symulatorami do nawigacji (np. Habitat) i manipulacji (np. ManiSkill3). Modele odwzorowujące obrazy z kamery na akcje będą trenowane lub dostrajane w tych symulatorach, w miarę możliwości począwszy od modeli wstępnie wytrenowanych.</w:t>
       </w:r>
     </w:p>
     <w:p>
@@ -973,17 +973,17 @@
     </w:p>
     <w:p>
       <w:r>
-        <w:t>W ramach pierwszego pytania badawczego zbadane zostaną warianty bliźniaka, w których skorygowano jeden typ błędu rekonstrukcji, aby przypisać lukę poszczególnym typom błędów, a także randomizacja kierowana niepewnością rekonstrukcji i znaczeniem dla zadania. W ramach drugiego pytania proste sondy (probes) na stanach ukrytych modeli pokażą, na którym etapie informacja o zadaniu możliwa do odczytania w symulacji zostaje utracona dla rzeczywistych danych wejściowych, a dopasowanie na tym etapie zostanie porównane z alternatywami. Trzecie pytanie dotyczy sposobów wyboru niewielkiej ilości danych rzeczywistych wykorzystywanych do korekty zarówno bliźniaka, jak i modelu. W ramach czwartego pytania metody zostaną zastosowane do wydzielonych scen obu zadań w celu sprawdzenia, czy zmierzone przypisanie i lokalizacja przewidują ulepszenie lepiej niż proste predyktory.</w:t>
+        <w:t>W ramach pierwszego pytania badawczego zbadane zostaną warianty bliźniaka, w których jeden typ błędu rekonstrukcji jest korygowany w wybranych obszarach na podstawie dokładniejszego odniesienia, np. skanów laserowych ze ScanNet++, lub wprowadzany w kontrolowany sposób, co pozwoli przypisać lukę poszczególnym typom błędów. Zbadana zostanie też randomizacja wyglądu i geometrii, której siła w każdym obszarze odpowiada szacowanemu błędowi rekonstrukcji i znaczeniu dla zadania, w porównaniu z jednorodną randomizacją o tej samej łącznej sile. W ramach drugiego pytania sondy liniowe z zadaniami kontrolnymi, trenowane na symulowanych stanach ukrytych i testowane na sparowanych stanach rzeczywistych, pokażą, na którym etapie informacja o zadaniu zostaje utracona dla rzeczywistych danych wejściowych. Interwencje przyczynowe na stanach ukrytych sprawdzą, czy model wykorzystuje tę informację, a sparowana funkcja straty wyrównująca reprezentacje, dołączona na tym etapie, zostanie porównana z tą samą funkcją straty na wejściu, na cechach końcowych, na wszystkich etapach oraz w warstwach wybranych według istniejących kryteriów. W ramach trzeciego pytania reguły wyboru niewielkiej ilości danych rzeczywistych zostaną porównane przy równych budżetach z wyborem losowym i wyborem kierowanym niepowodzeniami. Wybrane dane posłużą do udoskonalenia rekonstrukcji bliźniaka i zostaną włączone do treningu modelu, a korekta obu zostanie porównana z korektą tylko jednego z nich. W ramach czwartego pytania metody zostaną zastosowane do wydzielonych scen obu zadań w celu sprawdzenia, czy przypisanie i lokalizacja zmierzone przed zastosowaniem metody przewidują jej zysk w każdej scenie lepiej niż proste predyktory; posłużą do tego korelacje rangowe porównywane za pomocą testów dla korelacji zależnych.</w:t>
       </w:r>
     </w:p>
     <w:p>
       <w:r>
-        <w:t>Ewaluacja będzie się opierać na standardowych metrykach, takich jak odsetek sukcesów (success rate), oraz na luce sim-to-real, mierzonej na wydzielonych scenach w obu zadaniach i uzupełnianej, tam gdzie to możliwe, miarami w otwartej pętli (open-loop) na rzeczywistych klatkach. Metody będą porównywane z odpowiednimi metodami bazowymi przy porównywalnym nakładzie treningowym i porównywalnej ilości danych rzeczywistych. W celu uzyskania wiarygodnych wyników zostaną zastosowane metody statystyczne, w tym powtarzanie przebiegów dla różnych ziaren losowości i scen oraz testy statystyczne przy porównaniach, a badania ablacyjne pozwolą określić wkład poszczególnych komponentów. Dane do treningu, wyboru modelu i końcowej ewaluacji będą rozdzielone. Jeśli dostęp na to pozwoli, wybrane wyniki zostaną zweryfikowane na rzeczywistym robocie we współpracy z laboratorium robotyki uczelni.</w:t>
+        <w:t>Ewaluacja będzie się opierać na standardowych metrykach, takich jak odsetek sukcesów, oraz na luce między symulacją a rzeczywistością, tj. różnicy między skutecznością tego samego modelu w bliźniaku i w rzeczywistości lub w jej referencyjnym odpowiedniku, mierzonej osobno dla każdej wydzielonej sceny w obu zadaniach i uzupełnianej, tam gdzie to możliwe, miarami w otwartej pętli (open-loop) na rzeczywistych klatkach. Metody będą porównywane z odpowiednimi metodami bazowymi przy porównywalnym nakładzie treningowym i porównywalnej ilości danych rzeczywistych. W celu uzyskania wiarygodnych wyników zostaną zastosowane metody statystyczne, w tym powtarzanie przebiegów dla różnych ziaren losowości i scen oraz testy statystyczne przy porównaniach, a badania ablacyjne pozwolą określić wkład poszczególnych komponentów. Dane do treningu, wyboru modelu i końcowej ewaluacji będą rozdzielone. Jeśli dostęp na to pozwoli, rzeczywisty robot w laboratorium robotyki uczelni zostanie wykorzystany do sprawdzenia kierunku wybranych wyników i trafności miary zastępczej opartej na zbiorze danych.</w:t>
       </w:r>
     </w:p>
     <w:p>
       <w:r>
-        <w:t>Eksperymenty będą implementowane głównie w języku Python z użyciem biblioteki PyTorch, przy zarządzaniu kodem źródłowym w systemie Git, i uruchamiane na klastrach GPU Katedry, WCSS i PLGrid. Kod i dane będą udostępniane, o ile pozwolą na to licencje, zgodnie ze standardami otwartej nauki. Wyniki zostaną opublikowane na czołowych konferencjach z listy ministerialnej, takich jak ICRA, IROS, RSS, IEEE RA-L, a także NeurIPS, ICML, ICLR i CVPR, oraz zaprezentowane na mniejszych wydarzeniach, takich jak MLinPL.</w:t>
+        <w:t>Eksperymenty będą implementowane głównie w języku Python z użyciem biblioteki PyTorch, przy zarządzaniu kodem źródłowym w systemie Git, i uruchamiane na klastrach GPU Katedry, WCSS i PLGrid. Kod i dane będą udostępniane, o ile pozwolą na to licencje, zgodnie ze standardami otwartej nauki. Wyniki zostaną opublikowane na czołowych konferencjach z listy ministerialnej, takich jak ICRA, IROS, RSS i IEEE RA-L, a także NeurIPS, ICML, ICLR i CVPR, oraz zaprezentowane na mniejszych wydarzeniach, takich jak MLinPL.</w:t>
       </w:r>
     </w:p>
     <w:p>

</xml_diff>

<commit_message>
PL copy synced with Wave 28 restyle and critic fixes
Co-Authored-By: Claude Opus 5.5 <noreply@anthropic.com>
</commit_message>
<xml_diff>
--- a/output/IPB_Grzegorz_Piotrowski_PL.docx
+++ b/output/IPB_Grzegorz_Piotrowski_PL.docx
@@ -329,12 +329,7 @@
           <w:p>
             <w:r/>
             <w:r>
-              <w:t>1. Udział w zajęciach Szkoły Doktorskiej.</w:t>
-            </w:r>
-          </w:p>
-          <w:p>
-            <w:r>
-              <w:t>2. Zapoznanie się z badaniami prowadzonymi w Katedrze Sztucznej Inteligencji i wybór obszaru badawczego wspólnie z promotorem.</w:t>
+              <w:t>Udział w zajęciach Szkoły Doktorskiej; zapoznanie się z literaturą i rozważenie możliwych kierunków badań</w:t>
             </w:r>
           </w:p>
         </w:tc>
@@ -358,12 +353,7 @@
           <w:p>
             <w:r/>
             <w:r>
-              <w:t>1. Udział w zajęciach Szkoły Doktorskiej.</w:t>
-            </w:r>
-          </w:p>
-          <w:p>
-            <w:r>
-              <w:t>2. Doprecyzowanie tematu rozprawy doktorskiej i przygotowanie Indywidualnego Planu Badawczego.</w:t>
+              <w:t>Udział w zajęciach Szkoły Doktorskiej; przegląd literatury; wybór tematu rozprawy doktorskiej wspólnie z promotorem; przygotowanie Indywidualnego Planu Badawczego</w:t>
             </w:r>
           </w:p>
         </w:tc>
@@ -387,22 +377,7 @@
           <w:p>
             <w:r/>
             <w:r>
-              <w:t>1. Przegląd literatury obejmujący transfer z symulacji do rzeczywistości, randomizację domeny i adaptację domenową, neuronową rekonstrukcję scen na podstawie danych rzeczywistych (np. 3D Gaussian Splatting) oraz uczenie głębokie w nawigacji robotów i manipulacji robotycznej, w tym udział w wewnętrznej grupie czytelniczej.</w:t>
-            </w:r>
-          </w:p>
-          <w:p>
-            <w:r>
-              <w:t>2. Identyfikacja najważniejszych luk badawczych w zakresie generalizacji modeli uczenia głębokiego trenowanych w symulacjach zbudowanych na podstawie danych rzeczywistych.</w:t>
-            </w:r>
-          </w:p>
-          <w:p>
-            <w:r>
-              <w:t>3. Przygotowanie środowiska badawczego do nawigacji robotów i manipulacji robotycznej, ze wspólnymi narzędziami do rekonstrukcji i zasobami obliczeniowymi. W przypadku nawigacji obejmuje ono nagrania rzeczywistych scen, cyfrowe bliźniaki w symulatorze nawigacji oraz opartą na zbiorze danych miarę zastępczą (proxy), która mierzy lukę związaną z wiernością rekonstrukcji. W przypadku manipulacji obejmuje ono cyfrowe bliźniaki rzeczywistych scen stołowych, zbudowane na podstawie obrazów z publicznych zbiorów danych robotycznych i zestawione z opublikowanymi wynikami tych samych polityk na rzeczywistych robotach.</w:t>
-            </w:r>
-          </w:p>
-          <w:p>
-            <w:r>
-              <w:t>4. Rozpoczęcie badań nad tym, które błędy rekonstrukcji cyfrowego bliźniaka, zmieniające się w obrębie sceny, decydują o generalizacji trenowanych w nim modeli nawigacji i manipulacji.</w:t>
+              <w:t>Przygotowanie środowiska badawczego (cyfrowe bliźniaki, symulatory, publiczne zbiory danych); wstępne eksperymenty dotyczące szkodliwych błędów rekonstrukcji (RQ1)</w:t>
             </w:r>
           </w:p>
         </w:tc>
@@ -426,32 +401,7 @@
           <w:p>
             <w:r/>
             <w:r>
-              <w:t>1. Kontynuacja przeglądu literatury, w tym udział w wewnętrznej grupie czytelniczej omawiającej nowe metody transferu z symulacji do rzeczywistości i fizycznej sztucznej inteligencji.</w:t>
-            </w:r>
-          </w:p>
-          <w:p>
-            <w:r>
-              <w:t>2. Zakończenie badań nad szkodliwymi błędami rekonstrukcji w obu zadaniach oraz nad randomizacją każdego obszaru cyfrowego bliźniaka zgodnie z jego szacowanym błędem rekonstrukcji i znaczeniem dla zadania.</w:t>
-            </w:r>
-          </w:p>
-          <w:p>
-            <w:r>
-              <w:t>3. Napisanie artykułu naukowego na konferencję z listy ministerialnej, dotyczącego błędów rekonstrukcji decydujących o generalizacji w nawigacji i manipulacji; planowane zgłoszenie na konferencję robotyczną lub do czasopisma z listy ministerialnej ukierunkowanych na fizyczną sztuczną inteligencję, np. ICRA 2028 lub IEEE Robotics and Automation Letters (RA-L).</w:t>
-            </w:r>
-          </w:p>
-          <w:p>
-            <w:r>
-              <w:t>4. Rozpoczęcie badań nad lokalizacją luki między symulacją a rzeczywistością wewnątrz modeli nawigacji i manipulacji, z pierwszymi wynikami dotyczącymi etapu, na którym informacja o zadaniu zostaje utracona dla rzeczywistych danych wejściowych.</w:t>
-            </w:r>
-          </w:p>
-          <w:p>
-            <w:r>
-              <w:t>5. Przygotowanie wniosku o grant badawczy Preludium do Narodowego Centrum Nauki.</w:t>
-            </w:r>
-          </w:p>
-          <w:p>
-            <w:r>
-              <w:t>6. Udział w międzynarodowej konferencji naukowej.</w:t>
+              <w:t>Dalsze eksperymenty dotyczące RQ1; przygotowanie i zgłoszenie pierwszej publikacji na konferencję lub do czasopisma z zakresu robotyki (np. ICRA lub RA-L); pierwsze eksperymenty dotyczące RQ2</w:t>
             </w:r>
           </w:p>
         </w:tc>
@@ -475,27 +425,7 @@
           <w:p>
             <w:r/>
             <w:r>
-              <w:t>1. Kontynuacja przeglądu literatury, w tym udział w wewnętrznej grupie czytelniczej omawiającej nowe metody transferu z symulacji do rzeczywistości i fizycznej sztucznej inteligencji.</w:t>
-            </w:r>
-          </w:p>
-          <w:p>
-            <w:r>
-              <w:t>2. Zakończenie badań nad lokalizacją luki między symulacją a rzeczywistością wewnątrz modeli obu zadań oraz nad wyrównywaniem reprezentacji na tym etapie.</w:t>
-            </w:r>
-          </w:p>
-          <w:p>
-            <w:r>
-              <w:t>3. Napisanie artykułu naukowego na konferencję z listy ministerialnej, dotyczącego lokalizacji luki między symulacją a rzeczywistością wewnątrz modeli głębokich, np. ICML 2028 lub CVPR 2028.</w:t>
-            </w:r>
-          </w:p>
-          <w:p>
-            <w:r>
-              <w:t>4. Badania nad doborem danych rzeczywistych przy ograniczonym budżecie w celu korekty zarówno cyfrowego bliźniaka, jak i modelu w obu zadaniach.</w:t>
-            </w:r>
-          </w:p>
-          <w:p>
-            <w:r>
-              <w:t>5. Rozpoczęcie badań nad przewidywaniem, czy uzyskane ulepszenia przenoszą się na niewidziane wcześniej środowiska oraz między nawigacją a manipulacją.</w:t>
+              <w:t>Eksperymenty dotyczące lokalizacji luki wewnątrz modeli i wyrównywania reprezentacji (RQ2); przygotowanie publikacji naukowej</w:t>
             </w:r>
           </w:p>
         </w:tc>
@@ -519,27 +449,7 @@
           <w:p>
             <w:r/>
             <w:r>
-              <w:t>1. Kontynuacja przeglądu literatury, w tym udział w wewnętrznej grupie czytelniczej omawiającej nowe metody transferu z symulacji do rzeczywistości i fizycznej sztucznej inteligencji.</w:t>
-            </w:r>
-          </w:p>
-          <w:p>
-            <w:r>
-              <w:t>2. Zakończenie badań nad doborem danych rzeczywistych oraz nad przewidywaniem przenoszenia się ulepszeń między środowiskami i zadaniami, uzupełnionych kontrolowanymi badaniami parametrów fizycznych w symulatorze z ukrytymi parametrami.</w:t>
-            </w:r>
-          </w:p>
-          <w:p>
-            <w:r>
-              <w:t>3. Napisanie artykułu naukowego na konferencję z listy ministerialnej, dotyczącego doboru danych rzeczywistych przy ograniczonym budżecie i przewidywania transferu, np. NeurIPS 2028.</w:t>
-            </w:r>
-          </w:p>
-          <w:p>
-            <w:r>
-              <w:t>4. Wstępna walidacja opracowanych metod na rzeczywistym robocie, jeśli pozwoli na to dostęp do laboratorium robotyki Politechniki Wrocławskiej.</w:t>
-            </w:r>
-          </w:p>
-          <w:p>
-            <w:r>
-              <w:t>5. Staż naukowy w zagranicznej grupie badawczej zajmującej się uczeniem robotów, jeśli pozwolą na to środki finansowe.</w:t>
+              <w:t>Eksperymenty dotyczące doboru danych rzeczywistych (RQ3) oraz transferu do niewidzianych scen i między zadaniami (RQ4); przygotowanie publikacji; testy na rzeczywistym robocie, jeśli pozwoli na to dostęp</w:t>
             </w:r>
           </w:p>
         </w:tc>
@@ -563,27 +473,7 @@
           <w:p>
             <w:r/>
             <w:r>
-              <w:t>1. Kontynuacja przeglądu literatury, w tym udział w wewnętrznej grupie czytelniczej omawiającej nowe metody transferu z symulacji do rzeczywistości i fizycznej sztucznej inteligencji.</w:t>
-            </w:r>
-          </w:p>
-          <w:p>
-            <w:r>
-              <w:t>2. Zakończenie eksperymentów oraz, jeśli to możliwe, walidacji na rzeczywistym robocie.</w:t>
-            </w:r>
-          </w:p>
-          <w:p>
-            <w:r>
-              <w:t>3. Napisanie artykułu naukowego podsumowującego wyniki na konferencję lub do czasopisma z listy ministerialnej.</w:t>
-            </w:r>
-          </w:p>
-          <w:p>
-            <w:r>
-              <w:t>4. Udział w międzynarodowej konferencji naukowej.</w:t>
-            </w:r>
-          </w:p>
-          <w:p>
-            <w:r>
-              <w:t>5. Przygotowanie struktury i konspektu rozprawy doktorskiej.</w:t>
+              <w:t>Końcowe eksperymenty i zgłoszenie artykułu na konferencję lub do czasopisma; pierwsza wersja rozprawy doktorskiej</w:t>
             </w:r>
           </w:p>
         </w:tc>
@@ -607,7 +497,7 @@
           <w:p>
             <w:r/>
             <w:r>
-              <w:t>Redakcja rozprawy doktorskiej i przygotowanie ostatecznej wersji dokumentu.</w:t>
+              <w:t>Ukończenie, poprawienie i złożenie rozprawy doktorskiej</w:t>
             </w:r>
           </w:p>
         </w:tc>
@@ -636,22 +526,27 @@
     </w:p>
     <w:p>
       <w:r>
-        <w:t>Uczenie głębokie poczyniło ogromne postępy w widzeniu komputerowym i przetwarzaniu języka naturalnego, w dużej mierze dzięki olbrzymim ilościom danych zebranych z internetu. Fizyczna sztuczna inteligencja, czyli sztuczna inteligencja w robotach i innych systemach ucieleśnionych, które postrzegają świat rzeczywisty i w nim działają, nie może polegać na takich danych. Jej modele potrzebują danych z interakcji, których zbieranie za pomocą rzeczywistych robotów jest powolne, kosztowne, a czasem niebezpieczne, dlatego zwykle trenuje się je w symulacji. W ostatnim czasie cyfrowe bliźniaki, czyli symulacje zbudowane na podstawie danych rzeczywistych, stały się obiecującą alternatywą dla ręcznie tworzonych symulatorów. Metody neuronowej rekonstrukcji scen, takie jak 3D Gaussian Splatting, przekształcają krótkie nagranie rzeczywistego miejsca w fotorealistycznego cyfrowego bliźniaka, w którym model można trenować na dużą skalę. Dane rzeczywiste zamienia się w symulację, w niej trenuje się model, a następnie przenosi się go z powrotem do rzeczywistości, co tworzy pętlę rzeczywistość–symulacja–rzeczywistość.</w:t>
+        <w:t>Uczenie głębokie przyniosło ogromny postęp w widzeniu komputerowym i przetwarzaniu języka, w dużej mierze dzięki olbrzymim ilościom danych zebranych z internetu. Fizyczna sztuczna inteligencja, czyli sztuczna inteligencja w robotach i innych systemach, które postrzegają rzeczywisty świat i działają w nim, nie może opierać się na takich danych. Zbieranie danych z interakcji z rzeczywistymi robotami jest powolne, kosztowne i czasem niebezpieczne, dlatego modele robotów trenuje się zwykle w symulacji. W ostatnim czasie obiecującą alternatywą dla ręcznie tworzonych symulatorów stały się cyfrowe bliźniaki, czyli symulacje zbudowane na podstawie danych rzeczywistych. Metody neuronowej rekonstrukcji scen, takie jak 3D Gaussian Splatting, zamieniają krótkie nagranie rzeczywistego miejsca w fotorealistyczną kopię, w której można wytrenować model, a następnie przenieść go z powrotem do rzeczywistości.</w:t>
       </w:r>
     </w:p>
     <w:p>
       <w:r>
-        <w:t>Wartość tej pętli zależy jednak od tego, jak dobrze wytrenowane modele generalizują. Model, który dobrze działa w symulacji, często zawodzi w rzeczywistości, ponieważ żadna symulacja nie odwzorowuje świata rzeczywistego dokładnie: wygląd, geometria, oświetlenie i fizyka są jedynie przybliżone, a błędy rekonstrukcji różnią się między obszarami sceny. Wynikający z tego spadek skuteczności nazywa się luką między symulacją a rzeczywistością. Jest ona spowodowana przesunięciem między rozkładami danych symulowanych i rzeczywistych, stanowi więc szczególny przypadek uczenia przy przesunięciu rozkładu i jedną z głównych przeszkód dla fizycznej sztucznej inteligencji. Dotychczas zaproponowane metody mają kilka ograniczeń. Randomizacja domeny, nawet dopasowana do danych rzeczywistych, zmienia kilka globalnych parametrów niezależnie od tego, gdzie symulacja jest niedokładna, a reprezentacje niezmiennicze mogą pomijać informacje potrzebne do wykonania zadania. Ponadto nieliczne dane rzeczywiste wykorzystywane do adaptacji służą zwykle do korekty albo modelu, albo symulacji, ale nie obu jednocześnie. Wreszcie większość metod jest ewaluowana na jednym zadaniu i kilku scenach, a nie wiadomo, które właściwości cyfrowego bliźniaka i wyuczonych reprezentacji decydują o tym, czy model generalizuje do rzeczywistości.</w:t>
+        <w:t>Model, który dobrze działa w swoim cyfrowym bliźniaku, często jednak zawodzi w rzeczywistości, a jeszcze częściej w miejscach, których nigdy nie widział. Żaden cyfrowy bliźniak nie odtwarza świata dokładnie. Wygląd, geometria, oświetlenie i fizyka są jedynie przybliżone, a błędy rekonstrukcji różnią się między obszarami sceny. Wynikający z tego spadek skuteczności nazywa się luką między symulacją a rzeczywistością. Jest to przypadek uczenia przy przesunięciu rozkładu i jedna z głównych przeszkód na drodze rozwoju fizycznej sztucznej inteligencji.</w:t>
       </w:r>
     </w:p>
     <w:p>
       <w:r>
-        <w:t>Dlatego celem rozprawy jest poprawa zdolności generalizacji modeli uczenia głębokiego w transferze rzeczywistość–symulacja–rzeczywistość za pomocą metod, które analizują i wyrównują wyuczone reprezentacje modeli, stosowanych w tych punktach pętli, w których powstaje luka między symulacją a rzeczywistością. Badania skupią się na zrozumieniu, które błędy rekonstrukcji cyfrowego bliźniaka szkodzą generalizacji, na lokalizacji etapu modelu, na którym informacja o zadaniu zostaje utracona dla rzeczywistych danych wejściowych, i zmniejszeniu luki na tym etapie, a także na wyborze, przy ustalonym budżecie, niewielkiej ilości danych rzeczywistych, która najlepiej koryguje zarówno cyfrowego bliźniaka, jak i model. Badania zweryfikują również, czy uzyskane ulepszenia przenoszą się na niewidziane wcześniej środowiska oraz z jednego zadania fizycznego na inne, a także czy zmierzone wcześniej właściwości przesunięcia rozkładu pozwalają przewidzieć, kiedy tak się dzieje. Metody nie będą powiązane z konkretnym zadaniem; jako dwa równorzędne środowiska testowe planowane są nawigacja robotów i manipulacja robotyczna. W przypadku nawigacji lukę związaną z wiernością rekonstrukcji zmierzy drugie, niezależne nagranie zawarte w publicznych nagraniach rzeczywistych scen, a jeśli dostęp na to pozwoli, rzeczywisty robot posłuży do sprawdzenia kierunku wyników i trafności tej miary zastępczej. W przypadku manipulacji cyfrowe bliźniaki rzeczywistych scen stołowych zostaną zbudowane na podstawie obrazów z publicznych zbiorów danych robotycznych i porównane z opublikowanymi wynikami tych samych polityk na rzeczywistych robotach. Oprócz bardziej niezawodnych modeli badania mogą pomóc wyjaśnić, dlaczego modele trenowane na danych syntetycznych odnoszą sukces lub zawodzą na danych rzeczywistych, co ma znaczenie dla uczenia maszynowego w ogóle.</w:t>
+        <w:t>Stosowane obecnie metody rozwiązują ten problem tylko częściowo. Randomizacja domeny zmienia kilka globalnych parametrów symulatora, niezależnie od tego, gdzie cyfrowy bliźniak rzeczywiście jest błędny. Reprezentacje niezmiennicze mogą odrzucać informacje potrzebne do wykonania zadania. Nieliczne dane rzeczywiste zebrane w celu adaptacji służą zwykle do poprawienia albo modelu, albo symulacji, ale nie obu jednocześnie. Większość metod jest też oceniana na jednym zadaniu i kilku scenach, więc nie wiadomo, które właściwości cyfrowego bliźniaka i wyuczonych reprezentacji decydują o tym, czy model będzie działał w rzeczywistości.</w:t>
       </w:r>
     </w:p>
     <w:p>
       <w:r>
-        <w:t>Wyniki mogą znaleźć zastosowanie w robotyce usługowej, logistycznej i asystującej, gdzie robota można by wytrenować w cyfrowej kopii nowego magazynu, szpitala lub domu, a następnie, po niewielkiej adaptacji w świecie rzeczywistym, niezawodnie działałby on w tym miejscu. Dotyczą one również innych dziedzin, w których modele są trenowane na danych symulowanych lub zrekonstruowanych i wdrażane na rzeczywistych danych z czujników, takich jak jazda autonomiczna czy roboty inspekcyjne.</w:t>
+        <w:t>Celem moich badań jest zmniejszenie tej luki za pomocą metod, które analizują reprezentacje wyuczone przez modele i wyrównują je na tym etapie, na którym luka powstaje. Chcę ustalić, które błędy rekonstrukcji cyfrowego bliźniaka rzeczywiście szkodzą modelowi, na którym etapie wewnątrz modelu informacja o zadaniu zostaje utracona dla rzeczywistych danych wejściowych oraz jaki niewielki zbiór danych rzeczywistych najlepiej poprawia zarówno cyfrowego bliźniaka, jak i model. Sprawdzę również, czy uzyskane poprawy przenoszą się na niewidziane sceny oraz z jednego zadania na drugie. Zbadam dwa zadania o równej wadze, nawigację robotów i manipulację robotyczną, a wszystkie wyniki będę mierzył na scenach, które nie były używane do treningu.</w:t>
+      </w:r>
+    </w:p>
+    <w:p>
+      <w:r>
+        <w:t>Wyniki mogą znaleźć zastosowanie w robotyce usługowej, logistycznej i asystującej, gdzie robota można by wytrenować w cyfrowej kopii nowego magazynu, szpitala lub domu, a następnie, po niewielkiej adaptacji w rzeczywistym świecie, niezawodnie tam wykorzystywać. Dotyczą one także autonomicznej jazdy i robotów inspekcyjnych, których modele również są trenowane na danych symulowanych lub zrekonstruowanych.</w:t>
       </w:r>
     </w:p>
     <w:p>
@@ -664,37 +559,200 @@
     </w:p>
     <w:p>
       <w:r>
-        <w:t>Modele uczenia głębokiego do nawigacji i manipulacji potrzebują więcej doświadczenia, niż mogą zapewnić rzeczywiste roboty, dlatego zwykle trenuje się je w symulacji. Jednak skuteczność w symulacji może słabo przewidywać skuteczność w świecie rzeczywistym, jeśli symulator nie jest starannie dostrojony [1]. Luka między symulacją a rzeczywistością jest przypadkiem uczenia przy przesunięciu rozkładu. Teoria adaptacji domenowej ogranicza od góry błąd modelu w domenie docelowej przez jego błąd w domenie źródłowej, rozbieżność między oboma rozkładami oraz błąd wspólny najlepszego pojedynczego modelu w obu domenach [2]. Traktowane wyłącznie jako motywacja, ograniczenie to sugeruje, by rozkład treningowy obejmował rzeczywistość, by model był niewrażliwy na pozostałą rozbieżność oraz, ponieważ niezmienniczość nie jest ukierunkowana na błąd wspólny i może go nawet zwiększać, by korygować symulację w kierunku rzeczywistości, co może bezpośrednio zmniejszyć ten błąd.</w:t>
+        <w:t>Modele uczenia głębokiego do nawigacji robotów i manipulacji robotycznej potrzebują więcej doświadczenia, niż mogą dostarczyć rzeczywiste roboty, dlatego zwykle trenuje się je w symulacji. Badanie dotyczące nawigacji wykazało, że skuteczność w symulacji może słabo przewidywać skuteczność w rzeczywistości, jeśli symulator nie zostanie starannie dostrojony [1]. Luka między symulacją a rzeczywistością jest szczególnym przypadkiem przesunięcia rozkładu. Teoria adaptacji domenowej ogranicza błąd modelu w domenie docelowej przez jego błąd w domenie źródłowej, rozbieżność między oboma rozkładami oraz łączny błąd najlepszego pojedynczego modelu w obu domenach [2]. Traktuję to ograniczenie wyłącznie jako motywację. Sugeruje ono, by rozkład treningowy obejmował rzeczywistość, by model był niewrażliwy na pozostałą rozbieżność oraz, ponieważ niezmienniczość nie jest ukierunkowana na błąd łączny, a nawet może go zwiększyć, by korygować symulację w stronę rzeczywistości, co może bezpośrednio zmniejszyć ten błąd.</w:t>
       </w:r>
     </w:p>
     <w:p>
       <w:r>
-        <w:t>Randomizacja domeny zmienia parametry symulatora, takie jak tekstury, tak aby rzeczywistość jawiła się jako jeszcze jedna wariacja [3]. Zbyt szeroka randomizacja prowadzi do zachowawczego działania, dlatego późniejsze prace kształtują jej rozkład, dopasowując go do kilku rzeczywistych przebiegów [4] lub maksymalizując jego entropię przy zachowaniu skuteczności wykonania zadania [5]. Metody te dostrajają kilka globalnych parametrów syntetycznego symulatora i nie uwzględniają błędów zmieniających się w obrębie sceny.</w:t>
+        <w:t>Szeroko stosowanym podejściem jest randomizacja domeny, która zmienia parametry symulatora, takie jak tekstury, tak aby rzeczywistość jawiła się modelowi jako jeszcze jeden wariant [3]. Zbyt szeroka randomizacja prowadzi do zachowawczego działania, dlatego późniejsze prace kształtują jej rozkład, dopasowując go do kilku rzeczywistych przebiegów [4] lub maksymalizując jego entropię przy zachowaniu skuteczności w zadaniu [5]. Metody te dostrajają kilka globalnych parametrów syntetycznego symulatora. Nie uwzględniają błędów zmieniających się w obrębie sceny, typowych dla cyfrowych bliźniaków zrekonstruowanych z danych rzeczywistych.</w:t>
       </w:r>
     </w:p>
     <w:p>
       <w:r>
-        <w:t>Inną możliwością jest niezmienniczość. Trening z przeciwnikiem domenowym (domain-adversarial training) wyrównuje cechy między domenami [6]. W robotyce wyrównanie łącznych rozkładów obserwacji i akcji w danych symulowanych i rzeczywistych poprawiło w rzeczywistości działanie polityk trenowanych wspólnie na obu rodzajach danych, czyli modeli odwzorowujących obserwacje na akcje [7]. Jednak niezmienniczość przy niskim błędzie w domenie źródłowej nie gwarantuje transferu, ponieważ może zwiększać składnik błędu wspólnego, gdy rozkłady etykiet, tutaj akcji, różnią się między domenami [8], a pełna niezmienniczość może usuwać informacje o zadaniu. Skuteczny wspólny trening na danych symulowanych i rzeczywistych wyrównuje obie domeny, zachowując jednocześnie możliwość ich rozróżnienia [9], zatem sama rozdzielność domen nie pokazuje, w którym miejscu luka szkodzi zadaniu. Niezmienniczość jest też zwykle wymuszana w miejscach wybranych z góry, takich jak wejście, cechy końcowe lub ustalone warstwy, a nie tam, gdzie według pomiarów powstaje luka.</w:t>
+        <w:t>Innym podejściem jest uczynienie modelu niezmienniczym względem domeny. Trening domenowo-adwersarialny sprawia, że cechy obu domen stają się nierozróżnialne dla klasyfikatora domeny [6]. W robotyce wyrównanie łącznych rozkładów obserwacji i akcji w danych symulowanych i rzeczywistych poprawiło w rzeczywistości działanie polityk trenowanych wspólnie na obu rodzajach danych, czyli modeli odwzorowujących obserwacje na akcje [7]. Niezmienniczość przy niskim błędzie w domenie źródłowej nie gwarantuje jednak transferu. Może ona zwiększać składnik błędu łącznego, gdy rozkłady etykiet, tutaj akcji, różnią się między domenami [8], a pełna niezmienniczość może odrzucać informacje o zadaniu. Niedawna analiza wykazała, że skuteczny trening wspólny na danych symulowanych i rzeczywistych wyrównuje obie domeny, zachowując zarazem ich rozróżnialność [9], zatem sama separowalność domen nie pokazuje, gdzie luka szkodzi zadaniu. Niezmienniczość jest też zwykle wymuszana w miejscach wybranych z góry, takich jak wejście, cechy końcowe lub ustalone warstwy, a nie tam, gdzie według pomiarów luka powstaje.</w:t>
       </w:r>
     </w:p>
     <w:p>
       <w:r>
-        <w:t>Cyfrowe bliźniaki są podejściem nowszym. 3D Gaussian Splatting [10] rekonstruuje fotorealistyczne sceny ze zdjęć wykonanych z wielu punktów widzenia. W manipulacji bliźniaki wykorzystano do trenowania polityk na podstawie skanu docelowej sceny [11], do przenoszenia polityk opartych na obrazach do rzeczywistości bez demonstracji w świecie rzeczywistym [12] oraz do ukierunkowania uczenia ze wzmocnieniem w świecie rzeczywistym na podstawie nagrania wykonanego telefonem [13]. Sparowane ewaluacje w symulacji i w rzeczywistości pokazały, że sceny dopasowane do rzeczywistych obrazów i kontrolerów dwóch konfiguracji robotów odzwierciedlają skuteczność tych samych polityk w świecie rzeczywistym [14]. W nawigacji polityki dostrajano w bliźniakach zbudowanych z nagrania pomieszczenia wykonanego telefonem [15] i trenowano w bliźniakach zbudowanych z monokularowych nagrań wideo scen miejskich [16]. Wpływ czynników symulacji badano głównie globalnie, np. randomizacji, fotorealizmu i realizmu fizyki w rzeczywistej manipulacji [17]. Dla całych przestrzeni roboczych podobieństwo cech wstępnie wytrenowanego modelu między widokami renderowanymi a rzeczywistymi przewidywało zgodność skuteczności w symulacji i w rzeczywistości lepiej niż LPIPS czy PSNR [18]. Dla obu zadań otwarte pozostaje pytanie, które błędy rekonstrukcji zmieniające się w obrębie sceny szkodzą generalizacji oraz jak zmienność w treningu powinna odpowiadać błędowi rekonstrukcji i znaczeniu dla zadania każdego obszaru.</w:t>
+        <w:t>Nowszym kierunkiem są cyfrowe bliźniaki budowane na podstawie danych rzeczywistych. 3D Gaussian Splatting [10] rekonstruuje fotorealistyczne sceny z wielowidokowych zdjęć i renderuje je w czasie rzeczywistym. W manipulacji cyfrowe bliźniaki wykorzystano do trenowania polityk na podstawie skanu docelowej sceny [11], do przenoszenia polityk opartych na obrazach do rzeczywistości bez rzeczywistych demonstracji [12] oraz do ukierunkowania uczenia ze wzmocnieniem w rzeczywistym świecie na podstawie nagrania telefonem [13]. Badanie SIMPLER [14] wykazało, na podstawie sparowanych ocen w symulacji i w rzeczywistości, że sceny i sterowniki dopasowane do rzeczywistych obrazów dwóch konfiguracji robotów odzwierciedlają rzeczywistą skuteczność tych samych polityk. W nawigacji polityki dostrajano w cyfrowych bliźniakach zbudowanych z nagrania pomieszczenia telefonem [15] oraz trenowano w cyfrowych bliźniakach zbudowanych z monokularnych nagrań miejskich [16]. Wpływ czynników symulacji badano głównie globalnie, na przykład randomizacji, fotorealizmu i realizmu fizyki w rzeczywistej manipulacji [17]. Dla całych przestrzeni roboczych podobieństwo cech wstępnie wytrenowanego modelu między widokami renderowanymi a rzeczywistymi przewidywało zgodność skuteczności w symulacji i w rzeczywistości lepiej niż LPIPS czy PSNR [18]. Otwarte pozostaje pytanie, które lokalne błędy rekonstrukcji szkodzą generalizacji w nawigacji i manipulacji oraz jak zmienność w treningu powinna uwzględniać błąd rekonstrukcji i znaczenie każdego obszaru dla zadania.</w:t>
       </w:r>
     </w:p>
     <w:p>
       <w:r>
-        <w:t>Niejasne jest również, w którym miejscu wewnątrz modelu powstaje luka. Sondowanie stanów ukrytych, czyli odczytywanie z nich informacji za pomocą prostych klasyfikatorów, wykazało, że dostrajanie na akcjach pogarsza reprezentacje wizualne modeli wizja–język–akcja (vision-language-action, VLA) [19]. Niezależnie od tego badania nad dostrajaniem wybranych warstw pokazały, że najlepsze warstwy do adaptacji zależą od rodzaju przesunięcia [20]. Według naszej wiedzy w modelach trenowanych w bliźniakach nie zlokalizowano dotąd etapu, na którym informacja o zadaniu dostępna w symulacji przestaje być możliwa do odtworzenia z danych rzeczywistych.</w:t>
+        <w:t>Niejasne jest również, gdzie wewnątrz modelu powstaje luka. Sondowanie, czyli odczytywanie informacji ze stanów ukrytych za pomocą prostych klasyfikatorów, wykazało, że dostrajanie do generowania akcji pogarsza reprezentacje wizualne modeli wizja-język-akcja [19]. Niezależnie od tego dostrajanie tylko wybranych warstw pokazało, że najlepsze do adaptacji warstwy zależą od rodzaju przesunięcia [20]. Według mojej wiedzy w modelach trenowanych w cyfrowych bliźniakach nie zlokalizowano etapu, na którym informacja o zadaniu dostępna w symulacji przestaje być możliwa do odtworzenia z rzeczywistych danych wejściowych.</w:t>
       </w:r>
     </w:p>
     <w:p>
       <w:r>
-        <w:t>Pozostałą lukę zmniejsza się za pomocą niewielkiej ilości danych rzeczywistych. Wspólny trening z małym zbiorem danych rzeczywistych przynosi duże korzyści [21], a aktywna identyfikacja systemu projektuje w symulacji politykę eksploracji, której rzeczywista trajektoria niesie najwięcej informacji o parametrach fizycznych [22]. Najbliższa praca wykorzystuje bliźniaka do znajdowania konfiguracji podatnych na niepowodzenia na potrzeby rzeczywistych przebiegów [13]. Prace te wykorzystują wybrane dane rzeczywiste do korekty albo modelu, albo symulacji. Według naszej wiedzy nie badano korekty obu na podstawie tych samych wybranych danych.</w:t>
+        <w:t>Pozostałą lukę zmniejsza się zwykle za pomocą niewielkiej ilości danych rzeczywistych. Trening wspólny z małym zbiorem danych rzeczywistych daje duże korzyści [21], a aktywna identyfikacja systemu projektuje w symulacji politykę eksploracji, której rzeczywista trajektoria niesie najwięcej informacji o parametrach fizycznych [22]. Najbliższa moim badaniom praca wykorzystuje cyfrowego bliźniaka do znajdowania konfiguracji podatnych na niepowodzenia, w których wykonuje się rzeczywiste przebiegi [13]. Prace te wykorzystują wybrane dane rzeczywiste do poprawienia albo modelu, albo symulacji. Według mojej wiedzy korygowanie obu na podstawie tych samych wybranych danych nie było dotąd badane.</w:t>
       </w:r>
     </w:p>
     <w:p>
       <w:r>
-        <w:t>Lukę można też rozłożyć na czynniki zmienności, których uporządkowanie według trudności jest w dużej mierze zgodne między symulacją a rzeczywistością [23]. Rzadko sprawdza się, czy pomiary wykonane przed zastosowaniem metody przewidują, lepiej niż proste wskaźniki, takie jak wielkość luki, czy jej korzyść przeniesie się na nową scenę lub na inne zadanie.</w:t>
+        <w:t>Wreszcie lukę można rozłożyć na czynniki zmienności, których uporządkowanie według trudności jest w dużej mierze zgodne między symulacją a rzeczywistością [23]. Rzadko sprawdza się, czy pomiary wykonane przed zastosowaniem metody przewidują, lepiej niż proste wskaźniki, takie jak wielkość luki, czy jej korzyść przeniesie się na nową scenę lub na inne zadanie. Moja rozprawa podejmuje te pytania.</w:t>
+      </w:r>
+    </w:p>
+    <w:p>
+      <w:r>
+        <w:t>(Cytowania użyte w tym dokumencie znajdują się w sekcji 12)</w:t>
+      </w:r>
+    </w:p>
+    <w:p>
+      <w:pPr>
+        <w:pStyle w:val="Heading2"/>
+      </w:pPr>
+      <w:r>
+        <w:t>7. Pytania i hipotezy badawcze</w:t>
+      </w:r>
+    </w:p>
+    <w:p>
+      <w:r>
+        <w:t>Celem mojej rozprawy jest opracowanie metod uczenia reprezentacji, które poprawią generalizację modeli uczenia głębokiego trenowanych w cyfrowych bliźniakach zbudowanych na podstawie danych rzeczywistych, tak aby modele niezawodnie działały w rzeczywistości i w miejscach niewidzianych podczas treningu. Metody nie powinny być związane z konkretnym robotem, sceną ani zadaniem.</w:t>
+      </w:r>
+    </w:p>
+    <w:p>
+      <w:r>
+        <w:t>Na początku nie będę dysponował własnym robotem, a modele będę trenował na akademickich klastrach GPU, więc metody muszą działać w tej skali. Będę korzystał z publicznych zbiorów danych zawierających niezależne nagrania tych samych rzeczywistych scen. Zbadam dwa zadania, nawigację robotów i manipulację robotyczną, a wszystkie wyniki muszą być mierzone na odłożonych scenach, które nie były używane do treningu ani do wyboru modelu.</w:t>
+      </w:r>
+    </w:p>
+    <w:p>
+      <w:r>
+        <w:t>Pytania (RQ) i hipotezy (H) moich badań są następujące:</w:t>
+      </w:r>
+    </w:p>
+    <w:p>
+      <w:r>
+        <w:t>1. RQ1. Które błędy rekonstrukcji cyfrowego bliźniaka, zmieniające się w obrębie sceny, szkodzą generalizacji trenowanych w nim modeli nawigacji i manipulacji?</w:t>
+      </w:r>
+    </w:p>
+    <w:p>
+      <w:r>
+        <w:t>2. H1. Szkodliwość błędu w danym obszarze lepiej przewiduje to, jak bardzo zmienia on cechy ustalonego, wstępnie wytrenowanego kodera wizualnego na widokach renderowanych z tym błędem i bez niego, niż jego wielkość w obrazie lub geometrii, np. PSNR, LPIPS czy błąd głębi. Po drugie, randomizacja każdego obszaru zgodnie z jego szacowanym błędem rekonstrukcji i znaczeniem dla zadania zapewnia lepszą generalizację niż jednorodna randomizacja o tej samej łącznej sile.</w:t>
+      </w:r>
+    </w:p>
+    <w:p>
+      <w:r>
+        <w:t>3. RQ2. Na którym etapie modelu trenowanego lub dostrajanego w cyfrowym bliźniaku rzeczywiste dane wejściowe po raz pierwszy tracą informację o zadaniu, która jest dostępna dla danych symulowanych? Oczekuję, że da się wskazać najwcześniejszy taki etap lub wąski zakres etapów, znaleziony za pomocą sond liniowych weryfikowanych zadaniami kontrolnymi, a za pomocą interwencji przyczynowych sprawdzę, czy model korzysta z tej informacji.</w:t>
+      </w:r>
+    </w:p>
+    <w:p>
+      <w:r>
+        <w:t>4. H2. Wyrównywanie reprezentacji symulowanych i rzeczywistych na tym etapie zmniejsza lukę między symulacją a rzeczywistością bardziej niż takie samo wyrównywanie na wejściu, na cechach końcowych, na wszystkich etapach lub w warstwach wybranych według istniejących kryteriów, przy tej samej ilości danych rzeczywistych i tym samym nakładzie treningu.</w:t>
+      </w:r>
+    </w:p>
+    <w:p>
+      <w:r>
+        <w:t>5. RQ3. Które dane rzeczywiste, wybrane w ramach ustalonego budżetu na podstawie sygnałów opartych na reprezentacjach, wypracowanych w RQ1 i RQ2, najlepiej poprawiają zarówno cyfrowego bliźniaka, jak i model? Oczekuję, że wykorzystanie tych samych wybranych danych do poprawienia obu zmniejsza lukę bardziej niż poprawienie tylko jednego z nich, a mój sposób doboru danych porównam z doborem losowym i doborem opartym na niepowodzeniach.</w:t>
+      </w:r>
+    </w:p>
+    <w:p>
+      <w:r>
+        <w:t>6. RQ4. Czy uzyskane korzyści przenoszą się, przy niezmienionych ustawieniach, na niewidziane sceny oraz z jednego zadania na drugie, i czy właściwości przesunięcia zmierzone wcześniej pozwalają przewidzieć to lepiej niż proste wskaźniki, takie jak wielkość luki lub rozbieżność na poziomie obrazu?</w:t>
+      </w:r>
+    </w:p>
+    <w:p>
+      <w:r>
+        <w:t>7. Plan awaryjny. Jeśli szkodliwość błędu zależy od jego wielkości, a nie od zmiany cech, randomizację i dobór danych mogą zamiast tego ukierunkowywać niepewność rekonstrukcji i wrażliwość akcji, choć niepewność pomija błędy, które rekonstrukcja odtwarza w spójny sposób. Skorzystam z tego rozwiązania tylko wtedy, gdy sygnały oparte na reprezentacjach okażą się mało informatywne.</w:t>
+      </w:r>
+    </w:p>
+    <w:p>
+      <w:pPr>
+        <w:pStyle w:val="Heading2"/>
+      </w:pPr>
+      <w:r>
+        <w:t>8. Wkład spodziewanych wyników dla rozwoju dyscypliny naukowej</w:t>
+      </w:r>
+    </w:p>
+    <w:p>
+      <w:r>
+        <w:t>Głównym oczekiwanym wkładem mojej rozprawy jest zestaw metod uczenia reprezentacji, dzięki którym modele uczenia głębokiego trenowane w cyfrowych bliźniakach lepiej generalizują na rzeczywistość i na niewidziane miejsca. Spodziewam się również dowiedzieć, czy luka między symulacją a rzeczywistością wynika głównie z ograniczonego zbioru różnic istotnych dla zadania, które można znaleźć wśród błędów rekonstrukcji cyfrowego bliźniaka, zlokalizować wewnątrz modelu i zmniejszyć za pomocą niewielkiej ilości dobrze dobranych danych rzeczywistych.</w:t>
+      </w:r>
+    </w:p>
+    <w:p>
+      <w:r>
+        <w:t>Eksperymenty powinny wskazać, które błędy rekonstrukcji szkodzą generalizacji, na którym etapie modelu informacja o zadaniu jest tracona dla rzeczywistych danych wejściowych, kiedy opłaca się poprawiać zarówno cyfrowego bliźniaka, jak i model na podstawie tych samych danych rzeczywistych oraz czy takie korzyści przenoszą się na nowe sceny i między nawigacją a manipulacją. Ponieważ pytania te dotyczą uczenia przy przesunięciu rozkładu, wyniki mogą mieć znaczenie także dla adaptacji domenowej, uczenia reprezentacji i uczenia aktywnego w ogólności. Planuję udostępnić kod, protokół ewaluacji oraz, jeśli pozwolą na to licencje, wytrenowane modele, tak aby inni mogli w ten sam sposób porównywać metody na odłożonych scenach. Mam nadzieję, że rozprawa połączy badania z zakresu uczenia maszynowego dotyczące przesunięcia rozkładu z praktyką robotyki i ułatwi wdrażanie uczących się robotów w nowych magazynach, szpitalach i domach.</w:t>
+      </w:r>
+    </w:p>
+    <w:p>
+      <w:pPr>
+        <w:pStyle w:val="Heading2"/>
+      </w:pPr>
+      <w:r>
+        <w:t>9. Planowane metody badawcze</w:t>
+      </w:r>
+    </w:p>
+    <w:p>
+      <w:r>
+        <w:t>Trzonem pracy będzie budowanie cyfrowych bliźniaków rzeczywistych scen, trenowanie i dostrajanie w nich modeli uczenia głębokiego oraz projektowanie metod, które analizują i wyrównują reprezentacje wyuczone przez te modele. Ponieważ nie istnieje ugruntowana teoria gwarantująca generalizację z symulacji do rzeczywistości, większość pracy będzie miała charakter empiryczny. Teorię adaptacji domenowej wykorzystam jako motywację, a właściwości moich metod będę w miarę możliwości analizował teoretycznie.</w:t>
+      </w:r>
+    </w:p>
+    <w:p>
+      <w:r>
+        <w:t>Głównymi narzędziami będą PyTorch do trenowania modeli, gsplat do 3D Gaussian Splatting [10] i COLMAP do wyznaczania pozycji kamer, symulator Habitat do nawigacji i ManiSkill3 do manipulacji, Git z repozytoriami GitHub do kontroli wersji oraz Hugging Face do pobierania i publikowania modeli i zbiorów danych. Tam, gdzie to możliwe, będę zaczynał od modeli wstępnie wytrenowanych. Kod i skrypty ewaluacyjne zostaną udostępnione, a jeśli pozwolą na to licencje, także wytrenowane modele i dane pochodne.</w:t>
+      </w:r>
+    </w:p>
+    <w:p>
+      <w:r>
+        <w:t>Na początku nie będę dysponował własnym robotem, dlatego ewaluację będę prowadził głównie na danych publicznych. W przypadku nawigacji wykorzystam publiczne zbiory danych rzeczywistych scen wewnątrz budynków z niezależnymi nagraniami tych samych scen, takie jak ScanNet++ i MuSHRoom. Cyfrowego bliźniaka zbuduję z jednego nagrania, a drugie dostarczy rzeczywistych klatek i odniesienia opartego na zbiorze danych. To odniesienie jest miarą zastępczą (proxy) rzeczywistości. Mierzy ono lukę wynikającą z wierności rekonstrukcji i pomija różnice w napędach i czujnikach. W przypadku manipulacji zbuduję cyfrowe bliźniaki rzeczywistych scen stołowych na podstawie obrazów z publicznych zbiorów danych robotycznych, zgodnie z dopasowaniem wizualnym stosowanym w SIMPLER [14], i porównam je z opublikowanymi wynikami tych samych polityk na rzeczywistych robotach. Jeśli pozwoli na to dostęp do laboratorium robotycznego uczelni, wykorzystam rzeczywistego robota, aby sprawdzić kierunek wybranych wyników i trafność miary zastępczej.</w:t>
+      </w:r>
+    </w:p>
+    <w:p>
+      <w:r>
+        <w:t>W przypadku RQ1 będę korygował jeden rodzaj błędu rekonstrukcji naraz w wybranych obszarach, korzystając z dokładniejszego odniesienia, takiego jak skany laserowe ze ScanNet++, lub wprowadzał go w kontrolowany sposób, i mierzył wpływ na wytrenowany model. Porównam zmianę cech ustalonego, wstępnie wytrenowanego kodera z PSNR, LPIPS i błędem głębi jako predyktorami szkodliwości oraz sprawdzę randomizację zależną od obszaru w porównaniu z jednorodną randomizacją o tej samej łącznej sile (H1). W przypadku RQ2 wytrenuję sondy liniowe z zadaniami kontrolnymi na symulowanych stanach ukrytych i przetestuję je na sparowanych stanach rzeczywistych. Interwencje przyczynowe na stanach ukrytych, takie jak podmiana sondowanej podprzestrzeni z symulowanych danych wejściowych do rzeczywistych, pozwolą sprawdzić, czy model korzysta z utraconej informacji. Następnie dołączę funkcję straty wyrównującej na zidentyfikowanym etapie i porównam ją z wyrównywaniem na wejściu, na cechach końcowych, na wszystkich etapach i w warstwach wybranych według istniejących kryteriów (H2). W przypadku RQ3 porównam reguły doboru danych rzeczywistych z doborem losowym i doborem opartym na niepowodzeniach przy równych budżetach, a także porównam poprawianie zarówno cyfrowego bliźniaka, jak i modelu z poprawianiem tylko jednego z nich. W przypadku RQ4 zastosuję metody przy niezmienionych ustawieniach na odłożonych scenach i sprawdzę, czy pomiary wykonane wcześniej przewidują uzyskane korzyści, wykorzystując korelację rang z odpowiednimi testami istotności.</w:t>
+      </w:r>
+    </w:p>
+    <w:p>
+      <w:r>
+        <w:t>Będę mierzył odsetek sukcesów oraz lukę między symulacją a rzeczywistością, czyli różnicę między skutecznością tego samego modelu w cyfrowym bliźniaku a w rzeczywistości lub w jej odniesieniu, na odłożonych scenach. Metody porównam z odpowiednimi metodami bazowymi przy porównywalnym nakładzie treningu i ilości danych rzeczywistych. Aby uzyskać wiarygodne wyniki, będę powtarzał przebiegi dla różnych ziaren losowych i scen, stosował testy statystyczne do porównań oraz przeprowadzał badania ablacyjne. Dane do treningu, wyboru modelu i końcowej ewaluacji będą rozdzielone.</w:t>
+      </w:r>
+    </w:p>
+    <w:p>
+      <w:r>
+        <w:t>Eksperymenty będę prowadził na superkomputerach Wrocławskiego Centrum Sieciowo-Superkomputerowego (WCSS), z zadaniami zarządzanymi przez SLURM, oraz na zasobach PLGrid. Zamierzam korzystać z asystentów programowania opartych na sztucznej inteligencji, takich jak Claude Code, aby przyspieszyć pisanie i testowanie kodu oraz pomagać sobie w rutynowych zadaniach, takich jak monitorowanie długich eksperymentów i korekta tekstu.</w:t>
+      </w:r>
+    </w:p>
+    <w:p>
+      <w:r>
+        <w:t>Planuję publikować wyniki na konferencjach i w czasopismach z listy ministerialnej, takich jak ICRA, IROS, RSS i IEEE RA-L w robotyce oraz NeurIPS, ICML, ICLR i CVPR w uczeniu maszynowym i widzeniu komputerowym. Tam, gdzie to możliwe, artykuły będą również udostępniane jako preprinty w serwisie arXiv.</w:t>
+      </w:r>
+    </w:p>
+    <w:p>
+      <w:pPr>
+        <w:pStyle w:val="Heading2"/>
+      </w:pPr>
+      <w:r>
+        <w:t>10. Streszczenie popularnonaukowe</w:t>
+      </w:r>
+    </w:p>
+    <w:p>
+      <w:r>
+        <w:t>Roboty coraz częściej uczy się w cyfrowych bliźniakach, czyli wirtualnych kopiach rzeczywistych miejsc odtworzonych na podstawie ich nagrań, ponieważ nauka w prawdziwym świecie jest powolna, kosztowna i czasem niebezpieczna. Taka kopia nigdy nie jest idealna. Na przykład szklane drzwi mogą zostać odtworzone błędnie i zmylić robota. W efekcie model, który dobrze działa w symulacji, w rzeczywistości często zawodzi, zwłaszcza w miejscach, których wcześniej nie widział. Chcę ustalić, które różnice między kopią a rzeczywistością naprawdę szkodzą modelowi, w którym miejscu wewnątrz modelu zamieniają się w błędy oraz które nieliczne rzeczywiste przykłady najlepiej poprawiają zarówno model, jak i kopię. Sprawdzę to w nawigacji robotów oraz w chwytaniu i przestawianiu przedmiotów. Oczekiwanym wynikiem są metody, dzięki którym roboty będą mogły szybciej, taniej i bezpieczniej uczyć się pracy w nowych miejscach.</w:t>
+      </w:r>
+    </w:p>
+    <w:p>
+      <w:pPr>
+        <w:pStyle w:val="Heading2"/>
+      </w:pPr>
+      <w:r>
+        <w:t>11. Termin oddania do druku artykułu naukowego lub monografii</w:t>
+      </w:r>
+    </w:p>
+    <w:p>
+      <w:r>
+        <w:t>Wrzesień 2027 (planowane zgłoszenie na konferencję lub do czasopisma z listy ministerialnej poświęcone robotyce, np. ICRA 2028 lub IEEE Robotics and Automation Letters).</w:t>
+      </w:r>
+    </w:p>
+    <w:p>
+      <w:pPr>
+        <w:pStyle w:val="Heading2"/>
+      </w:pPr>
+      <w:r>
+        <w:t>12. Inne</w:t>
+      </w:r>
+    </w:p>
+    <w:p>
+      <w:r>
+        <w:t>Przygotowałem ten plan z pomocą narzędzi sztucznej inteligencji (Claude, używanego za pośrednictwem Claude Code). Używałem ich do wyszukiwania i weryfikacji literatury, przygotowywania wstępnych wersji tekstu, korekty, redakcji i formatowania. Przejrzałem całą treść, a pozycje bibliograficzne zostały zweryfikowane w rejestrach wydawców i serwisów z preprintami.</w:t>
       </w:r>
     </w:p>
     <w:p>
@@ -825,217 +883,12 @@
         <w:pStyle w:val="Heading2"/>
       </w:pPr>
       <w:r>
-        <w:t>7. Pytania i hipotezy badawcze</w:t>
-      </w:r>
-    </w:p>
-    <w:p>
-      <w:r>
-        <w:t>Badania prowadzone w ramach proponowanej rozprawy doktorskiej dotyczą następujących pytań badawczych, każdego w dwóch zadaniach fizycznej sztucznej inteligencji: nawigacji robotów i manipulacji robotycznej.</w:t>
-      </w:r>
-    </w:p>
-    <w:p>
-      <w:r>
-        <w:t xml:space="preserve">1. </w:t>
-      </w:r>
-      <w:r>
-        <w:rPr>
-          <w:b/>
-        </w:rPr>
-        <w:t>Które błędy rekonstrukcji cyfrowego bliźniaka, zmieniające się w obrębie sceny, decydują o tym, jak dobrze generalizują trenowane w nim modele nawigacji i manipulacji?</w:t>
-      </w:r>
-      <w:r>
-        <w:t xml:space="preserve"> Błędy bliźniaka w wyglądzie, geometrii i oświetleniu różnią się w obrębie sceny. </w:t>
-      </w:r>
-      <w:r>
-        <w:rPr>
-          <w:i/>
-        </w:rPr>
-        <w:t>Hipoteza:</w:t>
-      </w:r>
-      <w:r>
-        <w:t xml:space="preserve"> Spadek skuteczności wywołany przez każdy typ błędu rekonstrukcji w danym obszarze lepiej niż wielkość błędu w obrazie lub geometrii, np. PSNR, LPIPS lub błąd głębi, przewiduje odległość cech ustalonego, wstępnie wytrenowanego kodera wizualnego między wydzielonymi widokami renderowanymi z tym błędem i bez niego. Niezależnie od tego randomizacja wyglądu i geometrii każdego obszaru z siłą rosnącą wraz z jego szacowanym błędem rekonstrukcji i znaczeniem dla zadania zapewnia lepszą generalizację niż jednorodna randomizacja o tej samej łącznej sile. Aby to sprawdzić, jeden typ błędu naraz będzie korygowany w wybranych obszarach, np. geometria na podstawie skanu laserowego, lub wprowadzany do referencyjnej rekonstrukcji o wysokiej wierności. Jeśli szkodliwość będzie zależeć od wielkości błędu, zostanie to przedstawione jako wynik, a trzecie pytanie będzie się opierać na niepewności rekonstrukcji i wrażliwości akcji, choć niepewność nie wychwytuje błędów odtwarzanych w sposób powtarzalny.</w:t>
-      </w:r>
-    </w:p>
-    <w:p>
-      <w:r>
-        <w:t xml:space="preserve">2. </w:t>
-      </w:r>
-      <w:r>
-        <w:rPr>
-          <w:b/>
-        </w:rPr>
-        <w:t>Na którym etapie modelu trenowanego lub dostrajanego w bliźniaku rzeczywiste dane wejściowe po raz pierwszy tracą informację o zadaniu dostępną dla symulowanych danych wejściowych i czy wyrównywanie reprezentacji na tym etapie zmniejsza lukę między symulacją a rzeczywistością?</w:t>
-      </w:r>
-      <w:r>
-        <w:t xml:space="preserve"> </w:t>
-      </w:r>
-      <w:r>
-        <w:rPr>
-          <w:i/>
-        </w:rPr>
-        <w:t>Hipoteza:</w:t>
-      </w:r>
-      <w:r>
-        <w:t xml:space="preserve"> W obu zadaniach istnieje możliwy do wskazania najwcześniejszy etap lub wąski zakres etapów, na którym sonda liniowa wytrenowana na symulowanych stanach ukrytych traci na sparowanych stanach rzeczywistych dokładność w stopniu znacznie przekraczającym poziom odniesienia wyznaczony przez zadanie kontrolne, a utracona informacja wpływa na akcje. Dostrajanie warstw do tego etapu z funkcją straty dopasowującą rzeczywiste reprezentacje do sparowanych reprezentacji symulowanych na podstawie kilku widoków zmniejsza lukę bardziej niż ta sama funkcja straty zastosowana na wejściu, na cechach końcowych, na wszystkich etapach lub w warstwach wybranych według istniejących kryteriów, przy tej samej ilości danych i tym samym nakładzie. Sondy z zadaniami kontrolnymi pozwolą zlokalizować ten etap, a podmiana sondowanej podprzestrzeni stanów ukrytych z symulowanych danych wejściowych do rzeczywistych (activation patching) sprawdzi, czy model korzysta z tej informacji.</w:t>
-      </w:r>
-    </w:p>
-    <w:p>
-      <w:r>
-        <w:t xml:space="preserve">3. </w:t>
-      </w:r>
-      <w:r>
-        <w:rPr>
-          <w:b/>
-        </w:rPr>
-        <w:t>Które dane rzeczywiste, wybrane przy ustalonym budżecie, najbardziej zmniejszają lukę między symulacją a rzeczywistością, gdy służą do korekty zarówno cyfrowego bliźniaka, jak i modelu?</w:t>
-      </w:r>
-      <w:r>
-        <w:t xml:space="preserve"> Istniejące metody korygują albo model, albo symulację, albo oba na podstawie różnych, niewybieranych celowo danych rzeczywistych. Wymuszanie niezmienniczości nie jest ukierunkowane na składnik błędu wspólnego w ograniczeniu z teorii adaptacji domenowej i może go zwiększać, gdy dane symulowane i rzeczywiste wymagają różnych akcji, natomiast zbliżanie symulacji do rzeczywistości może go bezpośrednio zmniejszyć. </w:t>
-      </w:r>
-      <w:r>
-        <w:rPr>
-          <w:i/>
-        </w:rPr>
-        <w:t>Hipoteza:</w:t>
-      </w:r>
-      <w:r>
-        <w:t xml:space="preserve"> Przy równym budżecie wykorzystanie tych samych wybranych danych rzeczywistych do korekty zarówno bliźniaka, jak i modelu zmniejsza lukę bardziej niż korekta tylko jednego z nich. Kandydackie widoki są oceniane według niepewności rekonstrukcji w ich pozie kamery, według tego, jak bardzo zmienia się przewidywana akcja, gdy bliźniak jest zaburzany w granicach tej niepewności, oraz, jeśli dostępny jest nieetykietowany obraz rzeczywisty, według odległości między reprezentacjami widoku renderowanego i rzeczywistego. Wybór ten zostanie porównany z wyborem losowym i wyborem kierowanym niepowodzeniami w zakresie budżetów liczonych w obrazach rzeczywistych dla nawigacji oraz w rzeczywistych epizodach lub klatkach dla manipulacji, z uwzględnieniem obrazów nieetykietowanych.</w:t>
-      </w:r>
-    </w:p>
-    <w:p>
-      <w:r>
-        <w:t xml:space="preserve">4. </w:t>
-      </w:r>
-      <w:r>
-        <w:rPr>
-          <w:b/>
-        </w:rPr>
-        <w:t>Czy metody zastosowane z niezmienionymi ustawieniami poprawiają generalizację w niewidzianych wcześniej scenach i w drugim zadaniu oraz czy zmierzone wcześniej właściwości przesunięcia rozkładu pozwalają przewidzieć, kiedy tak się dzieje?</w:t>
-      </w:r>
-      <w:r>
-        <w:t xml:space="preserve"> </w:t>
-      </w:r>
-      <w:r>
-        <w:rPr>
-          <w:i/>
-        </w:rPr>
-        <w:t>Hipoteza:</w:t>
-      </w:r>
-      <w:r>
-        <w:t xml:space="preserve"> Przypisanie luki z pierwszego pytania i jej lokalizacja z drugiego, zmierzone w nowej scenie lub nowym zadaniu na podstawie rekonstrukcji referencyjnej i kilku sparowanych widoków, bez stosowania metody, są w przekroju wydzielonych scen silniej skorelowane rangowo ze zmniejszeniem luki osiąganym przez metodę niż proste wskaźniki, takie jak luka modelu bazowego lub rozbieżność na poziomie obrazu. Zostanie to sprawdzone na wielu wydzielonych scenach nawigacji z użyciem testów dla korelacji zależnych, a eksploracyjnie także na scenach manipulacji i między zadaniami.</w:t>
-      </w:r>
-    </w:p>
-    <w:p>
-      <w:pPr>
-        <w:pStyle w:val="Heading2"/>
-      </w:pPr>
-      <w:r>
-        <w:t>8. Wkład spodziewanych wyników dla rozwoju dyscypliny naukowej</w:t>
-      </w:r>
-    </w:p>
-    <w:p>
-      <w:r>
-        <w:t>Proponowana rozprawa doktorska ma przyczynić się do rozwoju dyscypliny naukowej poprzez podjęcie problemu generalizacji modeli uczenia głębokiego trenowanych w symulacjach zbudowanych na podstawie danych rzeczywistych, który pozostaje jedną z głównych przeszkód w stosowaniu uczenia maszynowego w fizycznej sztucznej inteligencji. Założeniem roboczym rozprawy jest to, że luka między symulacją a rzeczywistością wynika głównie z ograniczonego zbioru rozbieżności istotnych dla zadania. Można je zidentyfikować wśród błędów rekonstrukcji cyfrowego bliźniaka, zlokalizować wewnątrz modelu i zmniejszyć za pomocą niewielkiej ilości dobrze dobranych danych rzeczywistych. Metody mają być ogólne, tj. niezwiązane z konkretnym robotem, sceną ani zadaniem, i zostaną zbadane w nawigacji robotów i manipulacji robotycznej.</w:t>
-      </w:r>
-    </w:p>
-    <w:p>
-      <w:r>
-        <w:t>Po pierwsze, badania mają zapewnić lepsze zrozumienie tego, które błędy rekonstrukcji cyfrowego bliźniaka szkodzą generalizacji, wraz z metodą, która wprowadza zmienność do bliźniaka zgodnie z tą wiedzą, a nie jednorodnie. Po drugie, ich celem jest opracowanie sposobu lokalizowania etapu modelu głębokiego, na którym informacja o zadaniu dostępna dla symulowanych danych wejściowych zostaje utracona dla rzeczywistych, z wykorzystaniem sond z zadaniami kontrolnymi i interwencji przyczynowych, oraz zmniejszania luki przez wyrównywanie reprezentacji symulowanych i rzeczywistych na tym etapie. Po trzecie, mają one zaproponować regułę wyboru niewielkiej ilości danych rzeczywistych, która koryguje zarówno cyfrowego bliźniaka, jak i model. Wreszcie zbadane zostanie, kiedy takie ulepszenia przenoszą się na niewidziane wcześniej środowiska i między zadaniami. Wiedza ta mogłaby uzupełnić obecnie dominujące heurystyki randomizacji podejściami lepiej uzasadnionymi i bardziej interpretowalnymi.</w:t>
-      </w:r>
-    </w:p>
-    <w:p>
-      <w:r>
-        <w:t>Ponieważ transfer z symulacji do rzeczywistości jest przypadkiem uczenia przy przesunięciu rozkładu, wyniki mogą mieć znaczenie także dla uczenia maszynowego w ogóle, w szczególności dla adaptacji domenowej, uczenia reprezentacji i uczenia aktywnego. Oprócz wyników czysto naukowych metody mogłyby obniżyć koszt wdrażania robotów opartych na uczeniu maszynowym w nowych środowiskach, np. w robotyce usługowej, logistycznej i inspekcyjnej. Planowane jest udostępnienie kodu źródłowego, co mogłoby ułatwić dalsze badania w tej dziedzinie.</w:t>
-      </w:r>
-    </w:p>
-    <w:p>
-      <w:pPr>
-        <w:pStyle w:val="Heading2"/>
-      </w:pPr>
-      <w:r>
-        <w:t>9. Planowane metody badawcze</w:t>
-      </w:r>
-    </w:p>
-    <w:p>
-      <w:r>
-        <w:t>Badania będą prowadzone zgodnie z metodami powszechnie przyjętymi w projektach z zakresu uczenia maszynowego i uczenia robotów. Ponieważ nie istnieje ugruntowana teoria gwarantująca generalizację z symulacji do rzeczywistości, dominująca część pracy będzie miała charakter empiryczny. Teoria adaptacji domenowej wiąże błąd modelu w rzeczywistości z jego błędem w symulacji, rozbieżnością między oboma rozkładami oraz błędem najlepszego modelu w obu domenach. Jest ona wykorzystywana jako motywacja, a właściwości proponowanych metod będą w miarę możliwości analizowane teoretycznie.</w:t>
-      </w:r>
-    </w:p>
-    <w:p>
-      <w:r>
-        <w:t>Metody zostaną zbadane w dwóch zadaniach fizycznej sztucznej inteligencji, nawigacji robotów i manipulacji robotycznej, które korzystają ze wspólnych narzędzi do rekonstrukcji. Cyfrowe bliźniaki będą budowane z rzeczywistych obrazów za pomocą neuronowej rekonstrukcji scen, np. 3D Gaussian Splatting [10], i łączone z symulatorami do nawigacji (np. Habitat) i manipulacji (np. ManiSkill3). Modele odwzorowujące obrazy z kamery na akcje będą trenowane lub dostrajane w tych symulatorach, w miarę możliwości począwszy od modeli wstępnie wytrenowanych.</w:t>
-      </w:r>
-    </w:p>
-    <w:p>
-      <w:r>
-        <w:t>Badania nie opierają się na własnym robocie, dlatego ewaluacja będzie wykorzystywać dane publiczne. W przypadku nawigacji zostaną wykorzystane publiczne zbiory danych rzeczywistych scen wewnątrz budynków z niezależnymi nagraniami tych samych scen (np. ScanNet++). Bliźniak zostanie zbudowany z jednego nagrania, a drugie dostarczy rzeczywistych klatek i referencyjnej symulacji opartej na zbiorze danych. Ta referencja izoluje lukę wynikającą z wierności rekonstrukcji i pomija różnice w aktuacji i czujnikach. W przypadku manipulacji bliźniaki rzeczywistych scen stołowych zostaną zbudowane z obrazów z publicznych zbiorów danych robotycznych, zgodnie z podejściem wizualnego dopasowania z SIMPLER [14], i porównane z opublikowanymi wynikami tych samych polityk na rzeczywistych robotach. Nowe modele będą również ewaluowane w symulacjach, których parametry są ukryte przed uczącym się modelem.</w:t>
-      </w:r>
-    </w:p>
-    <w:p>
-      <w:r>
-        <w:t>W ramach pierwszego pytania badawczego zbadane zostaną warianty bliźniaka, w których jeden typ błędu rekonstrukcji jest korygowany w wybranych obszarach na podstawie dokładniejszego odniesienia, np. skanów laserowych ze ScanNet++, lub wprowadzany w kontrolowany sposób, co pozwoli przypisać lukę poszczególnym typom błędów. Zbadana zostanie też randomizacja wyglądu i geometrii, której siła w każdym obszarze odpowiada szacowanemu błędowi rekonstrukcji i znaczeniu dla zadania, w porównaniu z jednorodną randomizacją o tej samej łącznej sile. W ramach drugiego pytania sondy liniowe z zadaniami kontrolnymi, trenowane na symulowanych stanach ukrytych i testowane na sparowanych stanach rzeczywistych, pokażą, na którym etapie informacja o zadaniu zostaje utracona dla rzeczywistych danych wejściowych. Interwencje przyczynowe na stanach ukrytych sprawdzą, czy model wykorzystuje tę informację, a sparowana funkcja straty wyrównująca reprezentacje, dołączona na tym etapie, zostanie porównana z tą samą funkcją straty na wejściu, na cechach końcowych, na wszystkich etapach oraz w warstwach wybranych według istniejących kryteriów. W ramach trzeciego pytania reguły wyboru niewielkiej ilości danych rzeczywistych zostaną porównane przy równych budżetach z wyborem losowym i wyborem kierowanym niepowodzeniami. Wybrane dane posłużą do udoskonalenia rekonstrukcji bliźniaka i zostaną włączone do treningu modelu, a korekta obu zostanie porównana z korektą tylko jednego z nich. W ramach czwartego pytania metody zostaną zastosowane do wydzielonych scen obu zadań w celu sprawdzenia, czy przypisanie i lokalizacja zmierzone przed zastosowaniem metody przewidują jej zysk w każdej scenie lepiej niż proste predyktory; posłużą do tego korelacje rangowe porównywane za pomocą testów dla korelacji zależnych.</w:t>
-      </w:r>
-    </w:p>
-    <w:p>
-      <w:r>
-        <w:t>Ewaluacja będzie się opierać na standardowych metrykach, takich jak odsetek sukcesów, oraz na luce między symulacją a rzeczywistością, tj. różnicy między skutecznością tego samego modelu w bliźniaku i w rzeczywistości lub w jej referencyjnym odpowiedniku, mierzonej osobno dla każdej wydzielonej sceny w obu zadaniach i uzupełnianej, tam gdzie to możliwe, miarami w otwartej pętli (open-loop) na rzeczywistych klatkach. Metody będą porównywane z odpowiednimi metodami bazowymi przy porównywalnym nakładzie treningowym i porównywalnej ilości danych rzeczywistych. W celu uzyskania wiarygodnych wyników zostaną zastosowane metody statystyczne, w tym powtarzanie przebiegów dla różnych ziaren losowości i scen oraz testy statystyczne przy porównaniach, a badania ablacyjne pozwolą określić wkład poszczególnych komponentów. Dane do treningu, wyboru modelu i końcowej ewaluacji będą rozdzielone. Jeśli dostęp na to pozwoli, rzeczywisty robot w laboratorium robotyki uczelni zostanie wykorzystany do sprawdzenia kierunku wybranych wyników i trafności miary zastępczej opartej na zbiorze danych.</w:t>
-      </w:r>
-    </w:p>
-    <w:p>
-      <w:r>
-        <w:t>Eksperymenty będą implementowane głównie w języku Python z użyciem biblioteki PyTorch, przy zarządzaniu kodem źródłowym w systemie Git, i uruchamiane na klastrach GPU Katedry, WCSS i PLGrid. Kod i dane będą udostępniane, o ile pozwolą na to licencje, zgodnie ze standardami otwartej nauki. Wyniki zostaną opublikowane na czołowych konferencjach z listy ministerialnej, takich jak ICRA, IROS, RSS i IEEE RA-L, a także NeurIPS, ICML, ICLR i CVPR, oraz zaprezentowane na mniejszych wydarzeniach, takich jak MLinPL.</w:t>
-      </w:r>
-    </w:p>
-    <w:p>
-      <w:pPr>
-        <w:pStyle w:val="Heading2"/>
-      </w:pPr>
-      <w:r>
-        <w:t>10. Streszczenie popularnonaukowe</w:t>
-      </w:r>
-    </w:p>
-    <w:p>
-      <w:r>
-        <w:t>Sztuczna inteligencja coraz częściej trafia do systemów fizycznych, takich jak roboty poruszające się po budynkach lub przenoszące przedmioty. Sterujące nimi modele uczenia głębokiego potrzebują ogromnej liczby przykładów, a zbieranie ich w prawdziwym świecie jest powolne, kosztowne i czasem niebezpieczne. Dlatego modele te uczy się zwykle w symulacji, a coraz częściej w cyfrowych bliźniakach, czyli wirtualnych kopiach rzeczywistych miejsc odtworzonych na podstawie ich nagrań. Taka kopia nigdy nie jest jednak idealna. Na przykład szklane drzwi lub odbicie w lustrze mogą zostać odtworzone błędnie i zmylić robota. W efekcie model, który dobrze działa w symulacji, w rzeczywistości często zawodzi, zwłaszcza w miejscach, których wcześniej nie widział. To jedna z głównych przeszkód w szerszym stosowaniu fizycznej sztucznej inteligencji. Celem rozprawy jest poprawa zdolności generalizacji modeli uczenia głębokiego trenowanych w cyfrowych bliźniakach. Generalizacja oznacza tu umiejętność poprawnego działania w warunkach innych niż te, w których model trenowano, a zwłaszcza w rzeczywistości. Badania w pierwszej kolejności ustalą, które różnice między symulacją a rzeczywistością faktycznie szkodzą modelowi i na którym etapie przetwarzania w modelu zamieniają się w błędy. Na tej podstawie powstaną metody, które nauczą model pomijać nieistotne różnice i więcej ćwiczyć tam, gdzie cyfrowy bliźniak jest najmniej dokładny. Powstaną też metody wyboru nielicznych rzeczywistych przykładów, które najlepiej poprawiają zarówno model, jak i cyfrowego bliźniaka. Metody zostaną sprawdzone w dwóch równorzędnych zadaniach, nawigacji robotów oraz manipulacji robotycznej (chwytaniu i przestawianiu przedmiotów na stole), w środowiskach, których nie używano podczas uczenia. Wyniki uzyskane w symulacji zostaną porównane z opublikowanymi wynikami prawdziwych robotów, a jeśli to będzie możliwe, sprawdzone także na prawdziwym robocie. Zbadane zostanie też, czy poprawa uzyskana w jednym zadaniu przenosi się na drugie. Oczekiwanym wynikiem rozprawy jest lepsze zrozumienie, dlaczego modele uczone w symulacji zawodzą w rzeczywistości, oraz metody, dzięki którym roboty będą mogły szybciej, taniej i bezpieczniej uczyć się pracy w nowych miejscach i przy więcej niż jednym zadaniu.</w:t>
-      </w:r>
-    </w:p>
-    <w:p>
-      <w:pPr>
-        <w:pStyle w:val="Heading2"/>
-      </w:pPr>
-      <w:r>
-        <w:t>11. Termin oddania do druku artykułu naukowego lub monografii</w:t>
-      </w:r>
-    </w:p>
-    <w:p>
-      <w:r>
-        <w:t>Wrzesień 2027 (planowane zgłoszenie na konferencję lub do czasopisma z listy ministerialnej poświęcone robotyce, np. ICRA 2028 lub IEEE Robotics and Automation Letters).</w:t>
-      </w:r>
-    </w:p>
-    <w:p>
-      <w:pPr>
-        <w:pStyle w:val="Heading2"/>
-      </w:pPr>
-      <w:r>
-        <w:t>12. Inne</w:t>
-      </w:r>
-    </w:p>
-    <w:p>
-      <w:r>
-        <w:t>—</w:t>
-      </w:r>
-    </w:p>
-    <w:p>
-      <w:pPr>
-        <w:pStyle w:val="Heading2"/>
-      </w:pPr>
-      <w:r>
         <w:t>13. Określenie planowanej formy współpracy z promotorem</w:t>
       </w:r>
     </w:p>
     <w:p>
       <w:r>
-        <w:t>Planowane są cotygodniowe spotkania z promotorem. Spotkania mają obejmować prezentacje wyników, dyskusje, przeglądy oraz wspólną pracę nad artykułami. Zakres spotkań ma również obejmować ocenę postępów i planowanie dalszych działań. Ponadto planowane jest cotygodniowe omawianie wyników, problemów i najnowszych osiągnięć w dziedzinie z innymi doktorantami, z udziałem promotora. Bieżąca komunikacja będzie się odbywać za pośrednictwem poczty elektronicznej i komunikatorów internetowych.</w:t>
+        <w:t>Wraz z promotorem planujemy cotygodniowe spotkania, na których będę przedstawiał postępy i najnowsze wyniki eksperymentów, będziemy uzgadniać kolejne kroki i pracować nad wspólnymi publikacjami. Ponadto będę uczestniczył w cotygodniowych spotkaniach grupy doktorantów promotora, na których omawiane są bieżące wyniki, problemy i nowe prace w dziedzinie. Bieżący kontakt będzie odbywał się drogą mailową i za pomocą komunikatorów, a kod, wytrenowane modele i źródła LaTeX publikacji będą przechowywane we wspólnych repozytoriach Git.</w:t>
       </w:r>
     </w:p>
     <w:p>

</xml_diff>

<commit_message>
PL copy rebuilt for the world-model plan
Co-Authored-By: Claude Opus 5.5 <noreply@anthropic.com>
</commit_message>
<xml_diff>
--- a/output/IPB_Grzegorz_Piotrowski_PL.docx
+++ b/output/IPB_Grzegorz_Piotrowski_PL.docx
@@ -265,7 +265,7 @@
     </w:p>
     <w:p>
       <w:r>
-        <w:t>Metody uczenia reprezentacji dla generalizacji modeli uczenia głębokiego między symulacją a rzeczywistością w fizycznej sztucznej inteligencji / Representation learning methods for simulation-to-reality generalization of deep learning models in physical AI</w:t>
+        <w:t>Metody uczenia reprezentacji dla generalizacji polityk uczonych w modelach świata do rzeczywistości w fizycznej sztucznej inteligencji / Representation learning methods for the simulation-to-reality generalization of policies trained in world models for physical AI</w:t>
       </w:r>
     </w:p>
     <w:p>
@@ -329,7 +329,7 @@
           <w:p>
             <w:r/>
             <w:r>
-              <w:t>Udział w zajęciach Szkoły Doktorskiej, zapoznanie się z literaturą i rozważenie możliwych kierunków badań</w:t>
+              <w:t>Udział w zajęciach Szkoły Doktorskiej. Zapoznanie się z literaturą i rozważenie możliwych kierunków badań</w:t>
             </w:r>
           </w:p>
         </w:tc>
@@ -353,7 +353,7 @@
           <w:p>
             <w:r/>
             <w:r>
-              <w:t>Udział w zajęciach Szkoły Doktorskiej, przegląd literatury, wybór tematu rozprawy doktorskiej wspólnie z promotorem i przygotowanie Indywidualnego Planu Badawczego</w:t>
+              <w:t>Udział w zajęciach Szkoły Doktorskiej i przegląd literatury. Wybór tematu rozprawy doktorskiej wspólnie z promotorem i przygotowanie Indywidualnego Planu Badawczego</w:t>
             </w:r>
           </w:p>
         </w:tc>
@@ -377,7 +377,7 @@
           <w:p>
             <w:r/>
             <w:r>
-              <w:t>Przygotowanie środowiska badawczego z cyfrowymi bliźniakami, symulatorami i publicznymi zbiorami danych oraz wstępne eksperymenty z RQ1 dotyczące szkodliwych błędów rekonstrukcji</w:t>
+              <w:t>Przygotowanie środowiska badawczego z modelami świata, symulatorem fizyki i publicznymi zbiorami danych z robotów. Wstępne eksperymenty dotyczące szkodliwych błędów symulacji tworzonej przez model świata (RQ1)</w:t>
             </w:r>
           </w:p>
         </w:tc>
@@ -401,7 +401,7 @@
           <w:p>
             <w:r/>
             <w:r>
-              <w:t>Dalsze eksperymenty z RQ1, przygotowanie pierwszej publikacji i zgłoszenie jej na konferencję lub do czasopisma za 200 punktów z zakresu uczenia maszynowego lub uczenia robotów, na przykład na ICLR, RSS lub do IEEE RA-L, a także pierwsze eksperymenty z RQ2</w:t>
+              <w:t>Dalsze eksperymenty z RQ1. Przygotowanie pierwszej publikacji i zgłoszenie jej na konferencję lub do czasopisma za 200 punktów z zakresu uczenia maszynowego lub uczenia robotów, takich jak ICLR, RSS lub IEEE RA-L. Pierwsze eksperymenty z RQ2</w:t>
             </w:r>
           </w:p>
         </w:tc>
@@ -425,7 +425,7 @@
           <w:p>
             <w:r/>
             <w:r>
-              <w:t>Eksperymenty z RQ2 dotyczące lokalizacji luki wewnątrz modeli i wyrównywania reprezentacji oraz przygotowanie publikacji naukowej</w:t>
+              <w:t>Eksperymenty dotyczące lokalizacji luki wewnątrz polityk (czyli sieci neuronowych wybierających akcje robota na podstawie jego obserwacji) i wyrównywania reprezentacji (RQ2). Przygotowanie publikacji naukowej</w:t>
             </w:r>
           </w:p>
         </w:tc>
@@ -449,7 +449,7 @@
           <w:p>
             <w:r/>
             <w:r>
-              <w:t>Eksperymenty z RQ3 dotyczące doboru danych rzeczywistych i z RQ4 dotyczące transferu do niewidzianych scen i między zadaniami, przygotowanie publikacji oraz testy na rzeczywistym robocie, jeśli pozwoli na to dostęp</w:t>
+              <w:t>Eksperymenty dotyczące wyboru rzeczywistych przebiegów (RQ3) oraz przenoszenia wyników na niewidziane sceny i między zadaniami (RQ4). Przygotowanie publikacji oraz, jeśli pozwoli na to dostęp, testy na rzeczywistym robocie</w:t>
             </w:r>
           </w:p>
         </w:tc>
@@ -473,7 +473,7 @@
           <w:p>
             <w:r/>
             <w:r>
-              <w:t>Końcowe eksperymenty, zgłoszenie artykułu na konferencję lub do czasopisma i pierwsza wersja rozprawy doktorskiej</w:t>
+              <w:t>Końcowe eksperymenty i zgłoszenie artykułu na konferencję lub do czasopisma. Pierwsza wersja rozprawy doktorskiej</w:t>
             </w:r>
           </w:p>
         </w:tc>
@@ -497,7 +497,7 @@
           <w:p>
             <w:r/>
             <w:r>
-              <w:t>Ukończenie, poprawienie i złożenie rozprawy doktorskiej</w:t>
+              <w:t>Ukończenie i poprawienie rozprawy doktorskiej, a następnie jej złożenie</w:t>
             </w:r>
           </w:p>
         </w:tc>
@@ -526,27 +526,22 @@
     </w:p>
     <w:p>
       <w:r>
-        <w:t>Roboty, które uczą się metodą prób i błędów, potrzebują bardzo dużej liczby prób, większej, niż da się praktycznie i bezpiecznie zebrać na prawdziwym robocie [1]. Dlatego takie modele trenuje się zwykle w symulacji [2]. Nowszym rodzajem symulacji jest cyfrowy bliźniak. Krótkie nagranie prawdziwego pokoju lub stołu zamienia się w fotorealistyczną kopię 3D metodami takimi jak 3D Gaussian Splatting. Model robota uczy się w tej kopii, a potem działa w prawdziwym miejscu.</w:t>
+        <w:t>Roboty uczące się metodą prób i błędów potrzebują znacznie więcej prób, niż rzeczywisty robot może wykonać bezpiecznie i tanio, dlatego zwykle trenuje się je w symulacji. Ręcznie budowane symulatory fizyki są szybkie, ale stworzenie realistycznej kopii każdego nowego miejsca wymaga dużo pracy, a generowane przez nie obrazy nadal różnią się od obrazów z prawdziwych kamer. Nowszą możliwością jest wyuczony model świata [1]. Jest to sieć neuronowa, która przewiduje, co robot zobaczy po wykonaniu danej akcji. Najnowsze modele świata uczy się na dużych ilościach rzeczywistych nagrań wideo i mogą one pełnić rolę symulatorów. W pracy UniSim [2] polityki sterowania robotem wytrenowano wyłącznie wewnątrz takiego modelu, a następnie zastosowano je na rzeczywistych robotach. Navigation World Models [3] na podstawie jednego zdjęcia nieznanego miejsca wyobrażają sobie, jak wyglądałoby przejście przez nie, a modele Cosmos firmy NVIDIA [4] są udostępniane jako podstawa do budowy takich symulatorów.</w:t>
       </w:r>
     </w:p>
     <w:p>
       <w:r>
-        <w:t>Słabym punktem tego podejścia jest to, że kopia nigdy nie jest dokładna. W kopii może brakować szklanych drzwi, lustro może wyglądać jak otwarte pomieszczenie za nim, a tekstury i oświetlenie zawsze trochę się różnią. Model, który dobrze działa w kopii, może więc zawieść w rzeczywistości [3], a jeszcze gorzej radzi sobie w rzeczywistych miejscach, dla których nie zbudowano kopii [2]. Ten spadek skuteczności nazywa się luką między symulacją a rzeczywistością i jest jednym z głównych powodów, dla których wyuczone modele robotów wciąż trudno wdrożyć.</w:t>
+        <w:t>Słabym punktem tego podejścia jest to, że wyobrażony przebieg nigdy nie jest dokładny. Model może zignorować akcję i pokazać robota stojącego w miejscu. Może pozwolić, by chwytak przeszedł przez przedmiot, albo pokazać podniesienie przedmiotu bez właściwego kontaktu. Drobne błędy sumują się też w długich przebiegach, aż scena oddala się od wszystkiego, co jest fizycznie możliwe [5],[6]. Polityka, która odnosi sukces w modelu świata, może więc zawieść na rzeczywistym robocie. W pierwszym badaniu, w którym politykę tego rodzaju przeniesiono z treningu wyłącznie na danych syntetycznych na rzeczywiste ramię robota, odniosła ona sukces w około jednej trzeciej prób [7]. Wciąż nie wiadomo, które z tych błędów rzeczywiście szkodzą polityce i dlaczego. Lepiej wyglądające wideo nie daje odpowiedzi na to pytanie, ponieważ jakość wizualna modelu świata nie pozwala wiarygodnie przewidzieć, czy polityki odnoszą w nim sukces [6].</w:t>
       </w:r>
     </w:p>
     <w:p>
       <w:r>
-        <w:t>Typowe sposoby radzenia sobie z tym problemem nie korzystają z wiedzy o tym, gdzie kopia jest błędna. Randomizacja domeny wprowadza losowe zmiany kolorów, tekstur albo fizyki [4]. Nowsze warianty uczą się, jak szerokie powinny być te zmiany [5],[6], ale dostrajają parametry fizyczne i nie pytają, które błędy wizualne kopii naprawdę mają znaczenie. Inne metody zmuszają model, by tak samo widział obrazy z symulacji i z rzeczywistości, ale przy okazji mogą usunąć informacje potrzebne robotowi. Gdy zbiera się kilka prawdziwych przykładów, zwykle poprawia się nimi albo kopię [5],[7], albo model [8],[9], i nie znalazłem metody, która wybiera je tak, by poprawić jedno i drugie jednocześnie. Wcześniejsze badania mierzyły, jak czynniki takie jak oświetlenie, tekstura czy realizm fizyki wpływają na transfer [10],[11], ale wciąż nie wiadomo, które lokalne błędy rekonstrukcji cyfrowego bliźniaka szkodzą modelowi i na którym etapie wewnątrz modelu pojawia się ta szkoda.</w:t>
+        <w:t>Chcę odpowiedzieć na to pytanie, zaglądając do wnętrza modeli. Sieć neuronowa nie działa bezpośrednio na obrazie. Najpierw przekształca go w wewnętrzne cechy, nazywane reprezentacjami, i na ich podstawie podejmuje decyzję. LeCun argumentował, że model świata również powinien przewidywać w takiej przestrzeni reprezentacji, a nie w pikselach, aby mógł pomijać szczegóły, których nie da się przewidzieć i które nie mają znaczenia dla sterowania [8]. Model V-JEPA 2 [9] pokazał, że model świata tego rodzaju potrafi planować ruchy rzeczywistego ramienia robota. Moje robocze założenie wynika z tej samej idei. Błąd modelu świata, który nie zmienia reprezentacji, powinien wyrządzać niewielką szkodę, a błąd zmieniający cechy, od których zależy decyzja, powinien prowadzić do porażek [10]. Daje to mierzalny sposób badania luki między symulacją a rzeczywistością. Najpierw sprawdzę, które błędy symulacji tworzonej przez model świata zmieniają reprezentacje w szkodliwy sposób. Następnie znajdę etap wewnątrz polityki, na którym rzeczywiste dane wejściowe tracą informacje potrzebne do wykonania zadania, i tam skoryguję reprezentacje. Zbadam też, jak wybrać nieliczne rzeczywiste przebiegi, które najlepiej poprawiają zarówno model świata, jak i politykę, oraz czy korzyści utrzymują się w nowych scenach i w drugim zadaniu. Będę pracował nad dwoma równie ważnymi zadaniami, nawigacją robotów i manipulacją robotyczną.</w:t>
       </w:r>
     </w:p>
     <w:p>
       <w:r>
-        <w:t>Chcę odpowiedzieć na to pytanie, zaglądając do wnętrza modeli. Sieć neuronowa nie korzysta z obrazu bezpośrednio. Zamienia go na wewnętrzne cechy, nazywane reprezentacjami, i na ich podstawie podejmuje decyzję. Zakładam roboczo, że błąd w kopii, który nie zmienia tych cech, niewiele szkodzi, a błąd, który zmienia cechy, od których zależy decyzja, prawdopodobnie powoduje niepowodzenia [12],[13]. Daje to mierzalny sposób badania luki. Najpierw sprawdzę, które błędy rekonstrukcji zmieniają reprezentacje w szkodliwy sposób. Potem znajdę etap wewnątrz modelu, na którym prawdziwe obrazy tracą informację potrzebną do zadania, i poprawię reprezentacje właśnie tam. Zbadam też, jak wybrać kilka prawdziwych przykładów, które najlepiej poprawiają jednocześnie kopię i model, oraz czy poprawa utrzymuje się w nowych miejscach i w drugim zadaniu. Będę pracował nad dwoma równorzędnymi zadaniami, nawigacją robotów i manipulacją robotyczną, i zawsze będę testował na scenach nieużywanych do treningu.</w:t>
-      </w:r>
-    </w:p>
-    <w:p>
-      <w:r>
-        <w:t>Odpowiedź pomogłaby zdecydować, które części cyfrowego bliźniaka muszą być dokładne i gdzie warto zbierać dodatkowe prawdziwe dane. W praktyce robota można by wytrenować w cyfrowej kopii nowego magazynu, szpitala lub domu, a po niewielkiej adaptacji w rzeczywistym świecie niezawodnie tam wykorzystywać. Te same pytania pojawiają się przy autonomicznej jeździe, gdzie do trenowania i testowania modeli powszechnie używa się symulatorów i rekonstrukcji nagranych przejazdów.</w:t>
+        <w:t>Odpowiedź pokazałaby, które własności modelu świata muszą być dokładne dla danego zadania i gdzie warto zbierać dodatkowe rzeczywiste dane. W praktyce robot mógłby nauczyć się nowej pracy w magazynie, szpitalu lub domu głównie na podstawie przewidywanych doświadczeń, a następnie niezawodnie tam pracować po niewielkiej adaptacji w rzeczywistym świecie. Te same pytania pojawiają się w autonomicznej jeździe, gdzie generatywne modele świata już teraz tworzą scenariusze do treningu i testów, oraz w modelach, które w jednej sieci przewidują przyszłość i wybierają akcje.</w:t>
       </w:r>
     </w:p>
     <w:p>
@@ -559,37 +554,47 @@
     </w:p>
     <w:p>
       <w:r>
-        <w:t>Modele uczenia głębokiego do nawigacji robotów i manipulacji robotycznej potrzebują więcej doświadczenia, niż mogą łatwo dostarczyć rzeczywiste roboty, dlatego często trenuje się je w całości lub częściowo w symulacji [9]. Badanie dotyczące nawigacji wykazało, że bez starannego dostrojenia symulatora skuteczność w symulacji może słabo przewidywać skuteczność w rzeczywistości [14]. Luka między symulacją a rzeczywistością jest szczególnym przypadkiem przesunięcia rozkładu. Teoria adaptacji domenowej ogranicza błąd modelu w domenie docelowej przez jego błąd w domenie źródłowej, rozbieżność między rozkładami obu domen oraz łączny błąd najlepszego pojedynczego modelu w obu domenach [12]. Ograniczenie to traktuję tylko jako motywację. Sugeruje ono, by rozkład treningowy obejmował rzeczywistość i by model był niewrażliwy na pozostałą rozbieżność. Cechy niezmiennicze nie są jednak ukierunkowane na błąd łączny, a mogą go nawet zwiększyć [15]. Korygowanie symulacji w stronę rzeczywistości zmienia same dane treningowe i dlatego może zmniejszyć ten błąd, ponieważ usuwa widoki, dla których poprawna akcja w cyfrowym bliźniaku jest inna niż w rzeczywistości.</w:t>
+        <w:t>Idea uczenia modelu środowiska i trenowania sterownika wewnątrz jego przewidywań sięga co najmniej pracy Ha i Schmidhubera [1], w której agent nauczył się grać w grę wewnątrz własnego „snu”, a następnie grał w prawdziwą grę. DreamerV3 [11] przekształcił trening w wyobraźni w ogólną metodę, która działa z jedną stałą konfiguracją w ponad 150 zadaniach. Takie modele są małe i uczone dla jednego środowiska. Od 2023 roku duże modele generatywne trenowane na nagraniach wideo z internetu i z robotów są używane jako interaktywne symulatory rzeczywistego świata. UniSim [2] nauczył się symulatora z połączonych danych internetowych, robotycznych i nawigacyjnych, a polityki wytrenowane wyłącznie w nim działały w rzeczywistym świecie bez dalszego treningu. Navigation World Models (NWM) [3] przewidują wideo z perspektywy poruszającego się robota i planują, symulując kandydackie trajektorie. Platforma Cosmos firmy NVIDIA [4] udostępnia otwarte bazowe modele świata, które mają być dotrenowywane do postaci modeli świata dla konkretnych robotów i pojazdów.</w:t>
       </w:r>
     </w:p>
     <w:p>
       <w:r>
-        <w:t>Szeroko stosuje się randomizację domeny. Zmienia ona parametry symulatora, na przykład tekstury, tak aby rzeczywistość była dla modelu jeszcze jednym wariantem [4]. Zbyt szeroka randomizacja prowadzi do zachowawczego działania, dlatego późniejsze prace kształtują jej rozkład, dopasowując go do kilku rzeczywistych przebiegów [5] lub maksymalizując jego entropię przy zachowaniu skuteczności w zadaniu [6]. Metody te losują lub dostosowują globalne parametry ręcznie zbudowanego symulatora, takie jak tekstury, oświetlenie, tarcie czy masy [4],[5],[6]. Nie korzystają z wiedzy o tym, gdzie scena została odtworzona błędnie. Cyfrowe bliźniaki zbudowane z danych rzeczywistych mają błędy, które silnie różnią się między obszarami, na przykład tam, gdzie scenę obejmuje niewiele widoków kamery, a parametry globalne nie potrafią opisać takich błędów.</w:t>
+        <w:t>NVIDIA łączy też te modele ze swoimi symulatorami fizyki, Isaac Sim i Isaac Lab [12]. Cosmos Transfer, należący do rodziny Cosmos, zamienia rendery z symulatora, takie jak mapy głębi czy segmentacji, w fotorealistyczne wideo o tej samej geometrii i ruchu, dzięki czemu symulowane akcje pozostają poprawne. DreamGen [13] dotrenowuje model świata generujący wideo na docelowym robocie, generuje nagrania nowych zachowań, oznacza je pseudoakcjami i trenuje na nich politykę. Dzięki tym danym polityka GR00T N1 firmy NVIDIA nauczyła się 22 nowych zachowań na podstawie danych z teleoperacji jednego zadania, a jej skuteczność wzrosła na trzech rzeczywistych robotach.</w:t>
       </w:r>
     </w:p>
     <w:p>
       <w:r>
-        <w:t>Inne podejście polega na tym, by model był niezmienniczy względem domeny, tak aby symulowane i rzeczywiste dane wejściowe dawały podobne cechy. Trening domenowo-adwersarialny sprawia, że klasyfikator domeny nie potrafi odróżnić cech obu domen [16]. W robotyce wyrównanie łącznych rozkładów obserwacji i akcji w danych symulowanych i rzeczywistych poprawiło działanie w rzeczywistości polityk trenowanych wspólnie na obu rodzajach danych, czyli modeli odwzorowujących obserwacje na akcje [8]. Niezmienniczość przy niskim błędzie w domenie źródłowej nie gwarantuje jednak transferu. Gdy rozkłady etykiet, czyli tutaj akcji, różnią się między domenami, może ona zwiększać składnik błędu łącznego [15], a pełna niezmienniczość może odrzucać informacje o zadaniu. Niedawna analiza wykazała, że skuteczny wspólny trening na danych symulowanych i rzeczywistych wyrównuje obie domeny, a zarazem zachowuje ich rozróżnialność [17]. To, czy domeny da się odróżnić, nie jest więc miarą szkodliwości, a użyteczna miara musi odnosić się do informacji potrzebnej w zadaniu. W pracach nad przenoszeniem modeli z symulacji do rzeczywistości niezmienniczość wymusza się zwykle w miejscu wybranym z góry, takim jak obrazy wejściowe, cechy końcowe [16] lub wspólna przestrzeń ukryta [8], bez wcześniejszego pomiaru, gdzie powstaje luka.</w:t>
+        <w:t>Nowszy nurt łączy model świata z polityką. Model świata i działania (WAM, World Action Model) to jedna sieć, która przewiduje zarówno przyszłe stany świata, jak i akcje robota. Termin wprowadzono w pracy DreamZero [14], której autorzy podali, że taki model uogólniał się na nowe zadania i środowiska ponad dwukrotnie lepiej niż modele wizja-język-akcja (VLA). Modele VLA odwzorowują obrazy i polecenia bezpośrednio na akcje. Przenoszenie modeli świata i działania (WAM) z symulacji do rzeczywistości prawie nie zostało zbadane. W pierwszej pracy, która je opisała [7], model wideo Cosmos dotrenowano do roli takiej polityki, wytrenowano go wyłącznie na syntetycznych demonstracjach i uzyskano średnio 35% sukcesów na rzeczywistym ramieniu Franka bez żadnych rzeczywistych danych treningowych.</w:t>
       </w:r>
     </w:p>
     <w:p>
       <w:r>
-        <w:t>Nowszym kierunkiem są cyfrowe bliźniaki budowane na podstawie danych rzeczywistych. 3D Gaussian Splatting [18] rekonstruuje fotorealistyczne sceny z wielowidokowych zdjęć i renderuje je w czasie rzeczywistym. W manipulacji cyfrowe bliźniaki posłużyły do zwiększenia odporności polityk wyuczonych z kilku rzeczywistych demonstracji za pomocą uczenia ze wzmocnieniem w szybkim skanie docelowej sceny [1], do przenoszenia polityk opartych na obrazach do rzeczywistości bez rzeczywistych demonstracji [19] oraz do ukierunkowania uczenia ze wzmocnieniem w rzeczywistym świecie na podstawie nagrania telefonem [20]. Badanie SIMPLER [21] oceniło te same polityki w symulacji i na dwóch rzeczywistych konfiguracjach robotów. W scenach wizualnie dopasowanych do rzeczywistych obrazów i przy dopasowanych sterownikach skuteczność w symulacji silnie korelowała z rzeczywistą i porządkowała polityki niemal w tej samej kolejności. PolaRiS [3] zamienia krótkie nagrania wideo rzeczywistych scen w interaktywne środowiska symulacyjne do oceny polityk, ale nadal wymaga wspólnego trenowania polityk na danych symulowanych, aby zniwelować różnice pozostałe po rekonstrukcji. Nawet starannie zbudowane cyfrowe bliźniaki zachowują więc błędy ważne dla polityk. W nawigacji polityki dostrajano w cyfrowych bliźniakach zbudowanych z nagrania pomieszczenia telefonem [2] i trenowano w bliźniakach zbudowanych z monokularnych nagrań miejskich [22]. Czynniki symulacji, takie jak randomizacja, fotorealizm i realizm fizyki, zmieniano dotąd głównie jako jedno ustawienie dla całej sceny, tak jak w niedawnym badaniu rzeczywistej manipulacji [10]. Dla całych przestrzeni roboczych podobieństwo cech wstępnie wytrenowanego modelu między widokami renderowanymi a rzeczywistymi było silniej związane ze zgodnością skuteczności polityk w symulacji i w rzeczywistości niż miary jakości obrazu, takie jak LPIPS czy PSNR [23]. Otwarte pozostaje pytanie, które lokalne błędy rekonstrukcji szkodzą generalizacji w nawigacji i manipulacji oraz jak silnie należy randomizować każdy obszar, biorąc pod uwagę jego błąd rekonstrukcji i znaczenie dla zadania.</w:t>
+        <w:t>W artykule programowym LeCuna [8] autor argumentuje, że model świata nie powinien przewidywać pikseli. W jego architekturze JEPA (Joint Embedding Predictive Architecture) model koduje bieżącą i przyszłą obserwację i przewiduje przyszłą reprezentację, dzięki czemu może pomijać nieprzewidywalne szczegóły, takie jak tekstura czy szum czujników. DINO-WM [15] przewiduje zamrożone cechy wstępnie wytrenowanego modelu DINOv2 i planuje bez rekonstrukcji pikseli. Model V-JEPA 2 [9] wstępnie wytrenowano na ponad milionie godzin wideo. Jego wersję warunkowaną akcjami, V-JEPA 2-AC, dotrenowano na mniej niż 62 godzinach nagrań robotów ze zbioru DROID. Model ten planował chwytanie i odkładanie przedmiotów na rzeczywistych ramionach Franka w nieznanych mu laboratoriach, bez nagród. W pracy SkyJEPA [16] wytrenowano model świata JEPA na danych symulowanych i sterowano nim rzeczywistym kwadrokopterem bez treningu w rzeczywistym świecie. Prace te pokazują, że modele świata działające w przestrzeni reprezentacji mogą przenosić się do rzeczywistości. Nie mierzą one jednak luki między symulowanymi a rzeczywistymi danymi wejściowymi w tej przestrzeni ani nie wiążą jej z sukcesem polityki.</w:t>
       </w:r>
     </w:p>
     <w:p>
       <w:r>
-        <w:t>Niejasne jest również, gdzie wewnątrz modelu powstaje luka. Sondowanie, czyli odczytywanie informacji ze stanów ukrytych za pomocą prostych klasyfikatorów, wykazało, że dostrajanie do generowania akcji pogarsza reprezentacje wizualne modeli wizja-język-akcja [13]. W innej pracy dostrajano tylko wybrane warstwy i stwierdzono, że to, które warstwy najlepiej adaptować, zależy od rodzaju przesunięcia [24]. Badanie wspólnego treningu porównało cechy symulowane i rzeczywiste w kolejnych warstwach, ale mierzyło, jak dobrze obie domeny są wyrównane, a nie to, czy informacja o zadaniu się zachowuje [17]. Nie znalazłem pracy, która w modelach trenowanych w cyfrowych bliźniakach lokalizuje etap, na którym informacja o zadaniu dostępna w symulacji przestaje być możliwa do odtworzenia z rzeczywistych danych wejściowych.</w:t>
+        <w:t>Modele świata służą też do oceny polityk zamiast uruchamiania ich na robocie. Ctrl-World [17], wytrenowany na zbiorze DROID, uszeregował polityki bez rzeczywistych przebiegów i poprawił politykę przez dotrenowanie jej na wyobrażonych udanych trajektoriach. Symulator świata oparty na modelu Veo [18] przewidział względną skuteczność polityk Gemini Robotics, co sprawdzono w ponad 1600 rzeczywistych próbach. W pracy World-in-World [6] przetestowano modele świata w zamkniętej pętli w zadaniach nawigacji i manipulacji. Okazało się, że jakość wizualna nie gwarantuje sukcesu w zadaniu, a większe znaczenie ma to, jak wiernie model podąża za akcjami. Autorzy VLAW [5] stwierdzili, że obecnym modelom świata brakuje dokładności fizycznej potrzebnej do ulepszania polityk, ponieważ trenuje się je na demonstracjach bez porażek i pomijają one drobne szczegóły kontaktu. W przypadku symulatorów fizyki badanie SIMPLER [19] pokazało, że sceny wizualnie dopasowane do rzeczywistych obrazów pozwalają uszeregować polityki niemal w tej samej kolejności co rzeczywiste uruchomienia. Badania te mierzą błędy modelu świata na jego wyjściu lub przez końcową korelację z rzeczywistym sukcesem. Nie pokazują, który typ błędu zmienia politykę ani w jaki sposób.</w:t>
       </w:r>
     </w:p>
     <w:p>
       <w:r>
-        <w:t>Pozostałą lukę zmniejsza się zwykle niewielką ilością danych rzeczywistych. W manipulacji wspólny trening na danych symulowanych i małym zbiorze danych rzeczywistych poprawił skuteczność w rzeczywistości średnio o 38% w porównaniu z polityką trenowaną tylko na tym zbiorze rzeczywistym [9]. Aktywna identyfikacja systemu trenuje w symulacji politykę eksploracji, która maksymalizuje informację Fishera zawartą w jej rzeczywistej trajektorii o parametrach fizycznych [7]. Funkcje wpływu pozwalają uszeregować rzeczywiste demonstracje według ich wpływu na skuteczność polityki w pętli zamkniętej i wybrać nowo zebrane trajektorie, które najbardziej jej pomagają [25]. Najbliższa moim badaniom praca używa cyfrowego bliźniaka do znajdowania konfiguracji podatnych na niepowodzenia i w nich wykonuje rzeczywiste przebiegi [20]. W tych pracach dane rzeczywiste poprawiają albo model [9],[25],[20], albo symulację [7], a wszystkie poza [9] wybierają, które dane rzeczywiste zebrać. Według mojej wiedzy nikt dotąd nie użył tych samych wybranych danych rzeczywistych do poprawienia zarówno rekonstrukcji wizualnego cyfrowego bliźniaka, jak i trenowanego w nim modelu.</w:t>
+        <w:t>Luka między modelem świata a rzeczywistością jest przypadkiem przesunięcia rozkładu. Teoria adaptacji domenowej ogranicza błąd w domenie docelowej przez błąd w domenie źródłowej, rozbieżność między oboma rozkładami i łączny błąd najlepszego pojedynczego modelu w obu domenach [20]. Traktuję to ograniczenie wyłącznie jako motywację. Uczynienie cech niezmienniczymi względem domeny nie jest ukierunkowane na łączny błąd, a nawet może go zwiększyć [21]. Randomizacja domeny zmienia parametry symulatora, takie jak tekstury, tak aby rzeczywistość wyglądała jak kolejny wariant [22]. Zmienia ona globalne ustawienia ręcznie zbudowanego symulatora, podczas gdy błędy modelu świata zależą od akcji, kontaktu i długości przebiegu. Wspólny trening na danych symulowanych i małym zbiorze rzeczywistym poprawił manipulację w rzeczywistym świecie [23]. Mechanistyczna analiza takiego wspólnego treningu wykazała, że wyrównuje on obie domeny, ale pozostawia je rozróżnialnymi [24], więc pełne wyrównanie wszędzie nie jest celem.</w:t>
       </w:r>
     </w:p>
     <w:p>
       <w:r>
-        <w:t>Wreszcie lukę w generalizacji wizualnych polityk manipulacji uczonych przez naśladowanie można rozłożyć na czynniki zmienności, takie jak oświetlenie czy położenie kamery, a uporządkowanie tych czynników według trudności było w dużej mierze takie samo w symulacji i na rzeczywistym robocie [11]. Aktywna ewaluacja dopasowuje model probabilistyczny do czynników zadania, takich jak położenie obiektu i punkt widzenia kamery, aby wybierać informatywne próby rzeczywiste [26]. Przewiduje ona jednak skuteczność na podstawie rzeczywistych wyników tej samej polityki w tym samym zadaniu, a nie na podstawie pomiarów wykonanych przed zastosowaniem metody. Niewiele badań sprawdza, czy właściwości przesunięcia zmierzone przed zastosowaniem metody, takie jak zmiana wewnętrznych cech między widokami z cyfrowego bliźniaka i rzeczywistymi, przewidują, czy korzyść z tej metody przeniesie się na nową scenę lub inne zadanie. Niejasne jest też, czy takie pomiary radzą sobie lepiej niż proste wskaźniki, takie jak wielkość luki. Tymi otwartymi kwestiami zajmują się moje pytania badawcze w sekcji 7.</w:t>
+        <w:t>Nie wiadomo też, gdzie wewnątrz polityki powstaje luka. Sondowanie, czyli odczytywanie informacji ze stanów ukrytych za pomocą prostych klasyfikatorów, pokazało, że dotrenowanie do przewidywania akcji pogarsza reprezentacje wizualne modeli VLA [10]. Badania nad chirurgicznym dotrenowaniem (surgical fine-tuning) pokazały, że najlepsze warstwy do adaptacji zależą od typu przesunięcia [25]. Nie znalazłem pracy, która w politykach trenowanych w modelach świata lokalizowałaby etap, na którym informacja o zadaniu dostępna dla wyobrażonych danych wejściowych zostaje utracona dla rzeczywistych.</w:t>
+      </w:r>
+    </w:p>
+    <w:p>
+      <w:r>
+        <w:t>Gdy zbiera się niewielką ilość rzeczywistych danych, wykorzystuje się je na różne sposoby. VLAW [5] dotrenowuje model świata na rzeczywistych przebiegach, a następnie ulepsza politykę danymi syntetycznymi z tego modelu, nie wybierając, które przebiegi zebrać. TwinRL [26] używa cyfrowego bliźniaka do wyszukiwania konfiguracji podatnych na porażki, w których zbiera rzeczywiste przebiegi poprawiające politykę. Otwarte pozostaje pytanie, jak przy stałym budżecie wybierać rzeczywiste przebiegi, aby były jak najbardziej przydatne zarówno dla modelu świata, jak i dla polityki.</w:t>
+      </w:r>
+    </w:p>
+    <w:p>
+      <w:r>
+        <w:t>Wreszcie lukę w generalizacji wizualnych polityk manipulacji można rozłożyć na czynniki, takie jak oświetlenie czy położenie kamery, a uporządkowanie tych czynników według trudności było w dużej mierze takie samo w symulacji i na rzeczywistym robocie [27]. Nie wiadomo, czy luka zmierzona w przestrzeni reprezentacji przed zastosowaniem metody pozwala przewidzieć, czy jej korzyść przeniesie się na nową scenę lub zadanie, ani czy robi to lepiej niż proste wskaźniki, takie jak jakość wideo modelu świata. Moje pytania badawcze w sekcji 7 dotyczą tych otwartych kwestii. RQ1 pyta, które błędy szkodzą polityce, RQ2, gdzie wewnątrz polityki pojawia się szkoda, RQ3, które rzeczywiste przebiegi zebrać, a RQ4, czy korzyści i miary w przestrzeni reprezentacji się przenoszą.</w:t>
       </w:r>
     </w:p>
     <w:p>
@@ -607,52 +612,52 @@
     </w:p>
     <w:p>
       <w:r>
-        <w:t>Celem mojej rozprawy jest opracowanie metod uczenia reprezentacji, które poprawią generalizację modeli uczenia głębokiego trenowanych w cyfrowych bliźniakach zbudowanych z danych rzeczywistych. Modele mają niezawodnie działać w rzeczywistości i w miejscach niewidzianych podczas treningu, a metody mają działać przy niezmienionych ustawieniach zarówno w nawigacji, jak i w manipulacji.</w:t>
+        <w:t>Celem mojej rozprawy jest opracowanie metod uczenia reprezentacji, które poprawiają generalizację do rzeczywistości polityk sterowania robotami trenowanych w symulacjach tworzonych przez wyuczone modele świata. Polityki powinny działać niezawodnie na rzeczywistych danych wejściowych i w scenach niewidzianych podczas treningu, a metody powinny działać z niezmienionymi ustawieniami zarówno w nawigacji, jak i w manipulacji.</w:t>
       </w:r>
     </w:p>
     <w:p>
       <w:r>
-        <w:t>Na początku nie będę miał własnego robota, a modele będę trenował na akademickich klastrach GPU, dlatego zamiast trenować od zera duże polityki będę dostrajał istniejące modele wstępnie wytrenowane. Skorzystam z publicznych zbiorów danych, które zawierają niezależne nagrania tych samych rzeczywistych scen. Zbadam dwa zadania, nawigację robotów i manipulację robotyczną, a wszystkie wyniki zmierzę na odłożonych scenach, nieużywanych do treningu ani do wyboru modelu.</w:t>
+        <w:t>Na początku nie będę miał własnego robota i będę pracował na akademickich klastrach GPU, dlatego wykorzystam istniejące, wstępnie wytrenowane modele świata i polityki i będę je dotrenowywał zamiast trenować duże modele od zera. Jako odniesienie do rzeczywistości wykorzystam nagrane dane z rzeczywistych robotów i opublikowane wyniki uzyskane na rzeczywistych robotach, a jeśli pozwoli na to dostęp, także rzeczywistego robota. To odniesienie jest przybliżeniem i będę podawał, którą część luki mierzy. Zbadam nawigację robotów i manipulację robotyczną, a wszystkie wyniki będę mierzył na odłożonych scenach, których nie użyto do treningu ani wyboru modelu.</w:t>
       </w:r>
     </w:p>
     <w:p>
       <w:r>
-        <w:t>Stawiam następujące pytania badawcze, oznaczone RQ, i hipotezy, oznaczone H:</w:t>
+        <w:t>Moje pytania badawcze (RQ) i hipotezy (H) są następujące.</w:t>
       </w:r>
     </w:p>
     <w:p>
       <w:r>
-        <w:t>1. RQ1. Które błędy rekonstrukcji cyfrowego bliźniaka, zmieniające się w obrębie sceny, szkodzą generalizacji trenowanych w nim modeli nawigacji i manipulacji?</w:t>
+        <w:t>1. RQ1. Które błędy symulacji tworzonej przez model świata, takie jak słabe podążanie za akcjami, błędna fizyka kontaktu, błędy wyglądu i dryf w długim horyzoncie, zmienne w zależności od sytuacji, szkodzą generalizacji trenowanych w niej polityk?</w:t>
       </w:r>
     </w:p>
     <w:p>
       <w:r>
-        <w:t>2. H1. Szkodliwość błędu w danym obszarze to spadek skuteczności na odłożonych scenach modelu trenowanego w cyfrowym bliźniaku, który zawiera ten błąd, w porównaniu z tym samym modelem trenowanym w cyfrowym bliźniaku, w którym ten błąd poprawiono. Szkodliwość tę lepiej przewiduje to, jak bardzo błąd zmienia cechy ustalonego, wstępnie wytrenowanego kodera wizualnego na widokach renderowanych z tym błędem i bez niego, niż wielkość błędu w obrazie lub geometrii, mierzona przez PSNR, LPIPS czy błąd głębi. Ponadto randomizacja każdego obszaru zgodnie z jego szacowanym błędem rekonstrukcji i znaczeniem dla zadania daje lepszą generalizację niż jednorodna randomizacja o tej samej średniej sile w całej scenie.</w:t>
+        <w:t>2. H1. Szkodliwość błędu to spadek skuteczności na odłożonych danych rzeczywistych polityki wytrenowanej w modelu świata z tym błędem w porównaniu z tą samą polityką wytrenowaną bez niego. Tę szkodliwość lepiej przewiduje to, jak bardzo błąd zmienia reprezentację stałego, wstępnie wytrenowanego enkodera lub modelu świata typu JEPA, niż jakość wideo mierzona na poziomie pikseli. Ponadto ukierunkowana augmentacja szkodliwych typów błędów lepiej generalizuje niż jednolita augmentacja o tej samej sile.</w:t>
       </w:r>
     </w:p>
     <w:p>
       <w:r>
-        <w:t>3. RQ2. Na którym etapie modelu trenowanego lub dostrajanego w cyfrowym bliźniaku rzeczywiste dane wejściowe po raz pierwszy tracą informację o zadaniu, dostępną dla danych symulowanych? Oczekuję, że najwcześniejszy taki etap lub wąski zakres etapów da się wskazać sondami liniowymi weryfikowanymi zadaniami kontrolnymi. Interwencjami przyczynowymi sprawdzę, czy model korzysta z tej informacji.</w:t>
+        <w:t>3. RQ2. Na którym etapie polityki trenowanej w modelu świata rzeczywiste dane wejściowe po raz pierwszy tracą informację o zadaniu, która jest dostępna dla wyobrażonych danych wejściowych? Będę go szukał za pomocą sond liniowych z zadaniami kontrolnymi, a za pomocą interwencji przyczynowych sprawdzę, czy polityka korzysta z tej informacji.</w:t>
       </w:r>
     </w:p>
     <w:p>
       <w:r>
-        <w:t>4. H2. Wyrównywanie reprezentacji symulowanych i rzeczywistych na tym etapie zmniejsza lukę między symulacją a rzeczywistością bardziej niż takie samo wyrównywanie na wejściu, na cechach końcowych, na wszystkich etapach lub w warstwach wybranych według istniejących kryteriów, przy tych samych danych rzeczywistych i tym samym nakładzie treningu.</w:t>
+        <w:t>4. H2. Wyrównywanie reprezentacji wyobrażonych i rzeczywistych na tym etapie zmniejsza lukę bardziej niż to samo wyrównywanie na wejściu, na końcowych cechach lub na wszystkich etapach, przy tych samych danych rzeczywistych i tym samym nakładzie treningu.</w:t>
       </w:r>
     </w:p>
     <w:p>
       <w:r>
-        <w:t>5. RQ3. Które rzeczywiste obserwacje, wybrane w ramach ustalonego budżetu za pomocą sygnałów opartych na reprezentacjach z RQ1 i RQ2, najbardziej zmniejszają lukę, gdy użyje się ich zarówno do poprawienia rekonstrukcji cyfrowego bliźniaka, jak i do dostrojenia modelu? Oczekuję, że poprawienie obu na tych samych wybranych danych zmniejszy lukę bardziej niż poprawienie tylko jednego z nich. Mój sposób doboru danych porównam z doborem losowym i doborem opartym na niepowodzeniach.</w:t>
+        <w:t>5. RQ3. Które nieliczne rzeczywiste przebiegi, wybrane przy stałym budżecie z użyciem sygnałów z RQ1 i RQ2, najlepiej poprawiają zarówno model świata, jak i politykę? Porównam mój sposób wyboru z wyborem losowym, z wyborem kierowanym porażkami oraz z tą samą ilością niewybieranych danych rzeczywistych wykorzystanych tak jak w VLAW [5].</w:t>
       </w:r>
     </w:p>
     <w:p>
       <w:r>
-        <w:t>6. RQ4. Czy uzyskane korzyści przenoszą się przy niezmienionych ustawieniach na niewidziane sceny i z jednego zadania na drugie? Czy sygnały oparte na reprezentacjach z RQ1 i RQ2, zmierzone przed zastosowaniem metody, przewidują ten transfer lepiej niż luka przed adaptacją lub rozbieżność na poziomie obrazu między widokami z cyfrowego bliźniaka a rzeczywistymi, na przykład LPIPS?</w:t>
+        <w:t>6. RQ4. Czy korzyści przenoszą się przy niezmienionych ustawieniach na niewidziane sceny oraz między nawigacją a manipulacją? Czy luka zmierzona w przestrzeni reprezentacji, rozłożona zgodnie z podejściem JEPA na lukę obserwacji w enkoderze i lukę dynamiki w predyktorze, pozwala przewidzieć to przeniesienie lepiej niż proste wskaźniki, takie jak korelacja rang między sukcesem w modelu świata a sukcesem rzeczywistym lub jakość wideo?</w:t>
       </w:r>
     </w:p>
     <w:p>
       <w:r>
-        <w:t>7. Plan awaryjny. Jeśli wielkość błędu okaże się lepszym predyktorem szkodliwości niż zmiana cech, randomizacją i doborem danych pokieruję zamiast tego za pomocą niepewności rekonstrukcji i wrażliwości akcji. To rozwiązanie jest słabsze, ponieważ niepewność pokazuje głównie, gdzie widoki wejściowe słabo określają scenę, i może pozostać niska dla błędu, co do którego wszystkie widoki są zgodne.</w:t>
+        <w:t>7. Plan awaryjny. Jeśli jakość na poziomie pikseli będzie lepiej przewidywać szkodliwość niż zmiana reprezentacji, do kierowania augmentacją i wyborem danych użyję zamiast zmiany reprezentacji niepewności modelu świata i wrażliwości akcji polityki. Ten plan awaryjny jest słabszy, ponieważ model świata może się mylić z dużą pewnością, na przykład co do kontaktu po akcjach dalekich od jego danych treningowych.</w:t>
       </w:r>
     </w:p>
     <w:p>
@@ -665,12 +670,12 @@
     </w:p>
     <w:p>
       <w:r>
-        <w:t>Głównym oczekiwanym wkładem rozprawy jest zestaw metod uczenia reprezentacji, dzięki którym modele uczenia głębokiego trenowane w cyfrowych bliźniakach lepiej generalizują na rzeczywistość i na niewidziane miejsca. Chcę też sprawdzić, czy większość luki między symulacją a rzeczywistością wynika z niewielkiej liczby błędów rekonstrukcji ważnych dla zadania, czy ich wpływ da się przypisać konkretnemu etapowi modelu i czy do zmniejszenia tej luki wystarczy niewielka ilość dobrze dobranych danych rzeczywistych.</w:t>
+        <w:t>Głównym spodziewanym wkładem mojej rozprawy jest zestaw metod uczenia reprezentacji, które pomagają politykom sterowania robotami trenowanym w symulacjach tworzonych przez modele świata generalizować się do rzeczywistości i na niewidziane sceny. Razem z metodami chcę wyjaśnić, w jaki sposób błędy modelu świata docierają do polityki. Chcę ustalić, które typy błędów mają znaczenie, na którym etapie polityki zamieniają się w utraconą informację o zadaniu i ile dobrze wybranych danych rzeczywistych potrzeba, aby je skorygować.</w:t>
       </w:r>
     </w:p>
     <w:p>
       <w:r>
-        <w:t>Eksperymenty powinny pokazać, które błędy rekonstrukcji szkodzą generalizacji, na którym etapie modelu informacja o zadaniu ginie dla rzeczywistych danych wejściowych i kiedy opłaca się poprawiać cyfrowego bliźniaka i model na tych samych danych rzeczywistych. Powinny też pokazać, czy korzyści przenoszą się na nowe sceny oraz między nawigacją a manipulacją. Ponieważ pytania te dotyczą uczenia przy przesunięciu rozkładu, wyniki dotyczące tego, gdzie wyrównywać reprezentacje i jakie dane wybierać, mogą się przydać także w adaptacji domenowej i uczeniu aktywnym. Planuję udostępnić kod i protokół ewaluacji, a jeśli pozwolą licencje, także wytrenowane modele, aby inni mogli w ten sam sposób porównywać metody na odłożonych scenach. Mam nadzieję, że wyniki pokażą praktykom, jak dokładny musi być cyfrowy bliźniak dla danego zadania i które dane rzeczywiste warto zebrać, tak aby uczące się roboty można było mniejszym nakładem pracy wdrażać w nowych miejscach.</w:t>
+        <w:t>Jest to aktualne, ponieważ modele świata stają się powszechnym sposobem tworzenia danych treningowych i oceny polityk, a modele świata i działania (WAM) łączą dziś model świata i politykę w jednej sieci. Moje wyniki powinny pokazać, które własności modelu świata muszą być dokładne dla danego zadania. Jest to przydatne zarówno dla tych, którzy budują modele świata, jak i dla tych, którzy trenują w nich polityki. Ponieważ pytania dotyczą uczenia przy przesunięciu rozkładu, wyniki dotyczące tego, gdzie wyrównywać reprezentacje i jakie dane wybierać, mogą być przydatne także w adaptacji domenowej i uczeniu aktywnym. Planuję udostępnić kod, protokół ewaluacji oraz, tam gdzie pozwalają na to licencje, wytrenowane modele, aby inni mogli porównywać metody w ten sam sposób.</w:t>
       </w:r>
     </w:p>
     <w:p>
@@ -683,32 +688,32 @@
     </w:p>
     <w:p>
       <w:r>
-        <w:t>W pracy będę budował cyfrowe bliźniaki rzeczywistych scen, trenował i dostrajał w nich modele uczenia głębokiego oraz projektował metody, które analizują i wyrównują reprezentacje wyuczone przez te modele. Nie ma ugruntowanej teorii opisującej generalizację głębokich modeli trenowanych w cyfrowych bliźniakach zrekonstruowanych z danych rzeczywistych, więc praca będzie głównie empiryczna. Teoria adaptacji domenowej posłuży mi jako motywacja, a tam, gdzie to możliwe, odniosę moje metody do składników ograniczenia z [12], na przykład sprawdzając, czy wyrównanie na danym etapie zmniejsza składnik rozbieżności, nie zwiększając składnika błędu łącznego.</w:t>
+        <w:t>Większość mojej pracy będzie polegać na trenowaniu i dotrenowywaniu polityk wewnątrz wyuczonych modeli świata, mierzeniu ich działania na danych rzeczywistych oraz projektowaniu metod, które analizują i wyrównują uczone przez nie reprezentacje. Nie istnieje ugruntowana teoria generalizacji polityk trenowanych w modelach świata, dlatego praca będzie głównie empiryczna. Teoria adaptacji domenowej [20] będzie dla mnie motywacją, a tam, gdzie to możliwe, sprawdzę, czy wyrównanie zmniejsza rozbieżność między cechami wyobrażonymi a rzeczywistymi bez zwiększania łącznego błędu.</w:t>
       </w:r>
     </w:p>
     <w:p>
       <w:r>
-        <w:t>Do trenowania modeli użyję PyTorcha, do 3D Gaussian Splatting [18] biblioteki gsplat, a do wyznaczania pozycji kamer programu COLMAP. Nawigację będę symulował w Habitat, a manipulację w ManiSkill3. Wersje kodu będę kontrolował w Gicie i repozytoriach GitHub, a modele i zbiory danych będę pobierał i publikował przez Hugging Face. Tam, gdzie to możliwe, zacznę od modeli wstępnie wytrenowanych. Udostępnię kod i skrypty ewaluacyjne, a jeśli pozwolą licencje, także wytrenowane modele i dane pochodne.</w:t>
+        <w:t>Do treningu użyję biblioteki PyTorch, do kontroli wersji systemu Git z repozytoriami w serwisie GitHub, a do pobierania i publikowania modeli i danych serwisu Hugging Face. W nawigacji zacznę od NWM [3]. W manipulacji jako modeli świata działających w przestrzeni reprezentacji użyję DINO-WM [15], V-JEPA 2-AC [9] lub małego modelu LeWorldModel, a jako modeli świata generujących wideo Ctrl-World [17] lub Cosmos-Predict [4]. Tam, gdzie to możliwe, skorzystam z otwartych wag i będę przestrzegał ich licencji, z których niektóre dopuszczają wyłącznie użytek niekomercyjny. Jako symulatora fizyki do porównań użyję NVIDIA Isaac Lab 3.0 w trybie bez środowiska Kit (kit-less) z silnikiem fizyki Newton, który działa na GPU H100. Cosmos Transfer wykorzystam do nadania renderom z symulatora fotorealistycznego wyglądu. Isaac Sim nie obsługuje GPU A100 ani H100, więc użyję go tylko na stacji roboczej z kartą RTX, jeśli będzie dostępna.</w:t>
       </w:r>
     </w:p>
     <w:p>
       <w:r>
-        <w:t>Na początku nie będę miał własnego robota, dlatego ewaluację oprę głównie na danych publicznych. W nawigacji wykorzystam publiczne zbiory rzeczywistych scen wewnątrz budynków, które zawierają niezależne nagrania tych samych scen, takie jak ScanNet++ i MuSHRoom. Cyfrowego bliźniaka zbuduję z jednego nagrania. Drugie nagranie dostarczy rzeczywistych klatek, sparowanych z renderingami z cyfrowego bliźniaka z tych samych pozycji kamery, do sondowania i wyrównywania. Razem ze skanami laserowymi da też dokładniejsze środowisko odniesienia, w którym uruchomię modele w pętli zamkniętej jako miarę zastępczą (proxy) rzeczywistości. Ta miara zastępcza mierzy głównie część luki wynikającą z błędów rekonstrukcji i pomija różnice w tym, jak prawdziwy robot porusza się i odbiera otoczenie, na przykład w jego napędach i własnej kamerze. W manipulacji zbuduję cyfrowe bliźniaki rzeczywistych scen stołowych z obrazów publicznych zbiorów danych robotycznych, stosując dopasowanie wizualne jak w SIMPLER [21]. Następnie sprawdzę, czy skuteczność tych samych polityk w tych bliźniakach zgadza się z ich opublikowaną skutecznością na rzeczywistych robotach, zarówno co do wartości, jak i kolejności polityk. Jeśli pozwoli na to dostęp, użyję rzeczywistego robota w laboratorium uczelni, aby sprawdzić, czy wybrane poprawy pojawiają się też w rzeczywistości i czy środowisko odniesienia porządkuje modele w tej samej kolejności co rzeczywiste przebiegi.</w:t>
+        <w:t>Ponieważ na początku nie będę miał własnego robota, ewaluację przeprowadzę głównie na danych publicznych. W manipulacji użyję zbioru DROID, na którym trenowano Ctrl-World i V-JEPA 2-AC, oraz zbioru BridgeData V2, którego konfiguracja z robotem WidowX jest jedną z konfiguracji odwzorowanych w SIMPLER [19]. W nawigacji użyję zbiorów RECON i SCAND, dwóch zbiorów danych z rzeczywistych robotów, na których trenowano NWM. Odłożone trajektorie i sceny z tych zbiorów dają rzeczywiste obserwacje sparowane z wyobrażonymi, które zaczynają się od tego samego stanu i przebiegają według tych samych akcji. Takich par potrzebuję do sondowania i wyrównywania. Sprawdzę też, czy kolejność polityk w modelu świata zgadza się z opublikowanymi wynikami uzyskanymi na rzeczywistych robotach, pochodzącymi z SIMPLER i z rzeczywistych ewaluacji opisanych dla modeli świata. Ewaluacja wewnątrz modelu świata lub na nagranych danych jest jedynie przybliżeniem rzeczywistości. Pomija ona część luki, na przykład napędy i kamerę samego robota, i będę to zaznaczał przy każdym wyniku. Jeśli pozwoli na to dostęp, wybrane wyniki sprawdzę na rzeczywistym robocie w laboratorium uczelnianym.</w:t>
       </w:r>
     </w:p>
     <w:p>
       <w:r>
-        <w:t>W RQ1 będę zmieniał jeden rodzaj błędu rekonstrukcji naraz w wybranych obszarach. Błąd ten będę albo korygował za pomocą dokładniejszego odniesienia, takiego jak skany laserowe ze ScanNet++, albo wprowadzał w kontrolowany sposób, a następnie zmierzę wynikającą z tego zmianę odsetka sukcesów wytrenowanego modelu. Zmianę cech ustalonego, wstępnie wytrenowanego kodera porównam z PSNR, LPIPS i błędem głębi na podstawie ich korelacji rang ze szkodliwością w różnych obszarach i scenach. Sprawdzę też randomizację zależną od obszaru na tle jednorodnej randomizacji o tej samej średniej sile w całej scenie (H1). Błąd obszaru oszacuję na podstawie zmiany jego cech, a znaczenie dla zadania na podstawie tego, jak bardzo zmieniają się akcje modelu po zaburzeniu tego obszaru. W RQ2 wytrenuję sondy liniowe, czyli modele liniowe odczytujące informację o zadaniu, na przykład kierunek do celu, na stanach ukrytych każdego etapu dla danych symulowanych, i przetestuję je na sparowanych danych rzeczywistych. Zadania kontrolne z losowymi etykietami pokażą, że sondy nie uczą się po prostu na pamięć. Aby sprawdzić, czy model korzysta z utraconej informacji, zastąpię składową rzeczywistego stanu ukrytego wzdłuż kierunków sond składową ze sparowanych danych symulowanych i sprawdzę, czy akcja się poprawi. Wynik porównam z zastąpieniem tej samej liczby losowych kierunków. Następnie dodam na zidentyfikowanym etapie funkcję straty wyrównującej, na przykład maksymalną rozbieżność średnich (MMD) lub stratę kontrastową między sparowanymi cechami symulowanymi i rzeczywistymi. Porównam ją z tą samą stratą na wejściu, na cechach końcowych, na wszystkich etapach i w warstwach wybranych jak w chirurgicznym dostrajaniu [24] (H2). W RQ3 porównam przy równych budżetach reguły doboru danych rzeczywistych z doborem losowym i doborem opartym na niepowodzeniach. Porównam też poprawianie cyfrowego bliźniaka razem z modelem z poprawianiem tylko jednego z nich. W RQ4 zastosuję metody przy niezmienionych ustawieniach na odłożonych scenach i w drugim zadaniu. Następnie sprawdzę, czy sygnały z RQ1 i RQ2, zmierzone przed adaptacją, przewidują uzyskane korzyści, korzystając z korelacji rang Spearmana między scenami i testów permutacyjnych.</w:t>
+        <w:t>W RQ1 będę wprowadzał do modelu świata po jednym typie błędu naraz albo usuwał go, zastępując wyobrażone klatki rzeczywistymi lub wygenerowanymi przez symulator fizyki. Typy błędów to ignorowane lub opóźnione akcje, błędne skutki kontaktu, zmiany wyglądu i dryf w długich przebiegach. W każdej wersji wytrenuję lub dotrenuję politykę i zmierzę zmianę jej skuteczności. Zmianę reprezentacji stałego, wstępnie wytrenowanego enkodera, takiego jak DINOv2 lub V-JEPA 2, porównam z pikselowymi miarami jakości wideo, takimi jak PSNR, LPIPS i FVD, na podstawie ich korelacji rang ze szkodliwością. Porównam też ukierunkowaną augmentację z jednolitą augmentacją o tej samej sile (H1). W RQ2 wytrenuję sondy liniowe, czyli modele liniowe odczytujące informacje o zadaniu, takie jak kierunek do celu lub położenie przedmiotu, ze stanów ukrytych każdego etapu polityki dla wyobrażonych danych wejściowych, i przetestuję je na sparowanych rzeczywistych danych wejściowych. Zadania kontrolne z losowymi etykietami pokażą, że sondy nie zapamiętują po prostu danych. Aby sprawdzić, czy polityka korzysta z utraconej informacji, przeprowadzę interwencje przyczynowe. Zastąpię składową rzeczywistego stanu ukrytego wzdłuż kierunków sond składową pochodzącą ze sparowanego wyobrażonego wejścia i sprawdzę, czy akcja się poprawi. Porównam to z zastąpieniem tej samej liczby losowych kierunków. Następnie na wskazanym etapie dodam funkcję straty wyrównującej, taką jak maksymalna rozbieżność średnich (MMD) lub strata kontrastowa między sparowanymi cechami. Porównam ją z tą samą stratą zastosowaną na wejściu, na końcowych cechach, na wszystkich etapach oraz w warstwach wybranych tak jak w chirurgicznym dotrenowaniu [25] (H2). W RQ3 porównam reguły wyboru rzeczywistych przebiegów z wyborem losowym, wyborem kierowanym porażkami jak w TwinRL [26] i niewybieranymi danymi jak w VLAW [5], przy równych budżetach. Porównam też korygowanie zarówno modelu świata, jak i polityki z korygowaniem tylko jednego z nich. W RQ4 zastosuję metody z niezmienionymi ustawieniami na odłożonych scenach i w drugim zadaniu. Lukę w przestrzeni reprezentacji zmierzę jako składnik obserwacji, czyli odległość między reprezentacjami dopasowanych stanów wyobrażonych i rzeczywistych, oraz składnik dynamiki, czyli błąd przewidywania modelu świata w przestrzeni reprezentacji na rzeczywistych przejściach. Sprawdzę, czy te składniki przewidują korzyści lepiej niż korelacja rang między sukcesem w modelu świata a sukcesem rzeczywistym lub jakość wideo. Użyję do tego korelacji rang Spearmana obliczanej między scenami oraz testów permutacyjnych.</w:t>
       </w:r>
     </w:p>
     <w:p>
       <w:r>
-        <w:t>Na odłożonych scenach będę mierzył odsetek sukcesów każdego modelu w cyfrowym bliźniaku i w środowisku ewaluacyjnym danego zadania. W nawigacji jest nim środowisko odniesienia, a w manipulacji opublikowane wyniki rzeczywistych robotów oraz, jeśli pozwoli na to dostęp, rzeczywisty robot. Luka między symulacją a rzeczywistością to różnica między odsetkami sukcesów w cyfrowym bliźniaku i w tym środowisku. Podobnie jak w [14] i [21] zmierzę też, jak dobrze wyniki w cyfrowym bliźniaku przewidują kolejność modeli w środowisku ewaluacyjnym. Moje metody porównam z randomizacją domeny, treningiem domenowo-adwersarialnym, wspólnym treningiem na danych symulowanych i rzeczywistych oraz metodami bazowymi wymienionymi wyżej, przy tej samej liczbie kroków treningu i tej samej ilości danych rzeczywistych dla każdej metody. Aby wyniki były wiarygodne, powtórzę przebiegi dla różnych ziaren losowych i scen, porównania poprę testami statystycznymi i przeprowadzę badania ablacyjne. Dane do treningu, wyboru modelu i końcowej ewaluacji będą rozdzielone.</w:t>
+        <w:t>Dla każdej polityki zmierzę odsetek sukcesów w modelu świata i w środowisku ewaluacyjnym danego zadania, lukę między skutecznością wyobrażoną a rzeczywistą oraz korelację rang między wynikami w modelu świata a wynikami rzeczywistymi. Moje metody porównam z randomizacją domeny [22], wspólnym treningiem na danych wyobrażonych i rzeczywistych [23] oraz metodami bazowymi wymienionymi wyżej, przy tej samej liczbie kroków treningu i tej samej ilości danych rzeczywistych dla każdej metody. Aby wyniki były wiarygodne, powtórzę treningi dla różnych ziaren losowych i scen, porównania poprę testami statystycznymi i przeprowadzę badania ablacyjne. Dane do treningu, wyboru modelu i końcowej ewaluacji będą rozdzielone.</w:t>
       </w:r>
     </w:p>
     <w:p>
       <w:r>
-        <w:t>Eksperymenty uruchomię na superkomputerach WCSS, czyli Wrocławskiego Centrum Sieciowo-Superkomputerowego, gdzie zadaniami zarządza SLURM, oraz na zasobach PLGrid. Zamierzam korzystać z asystentów programowania opartych na sztucznej inteligencji, takich jak Claude Code, aby szybciej pisać i testować kod. Pomogą mi też w rutynowych zadaniach, takich jak monitorowanie długich eksperymentów i korekta tekstu. Przygotowałem ten plan z pomocą Claude, narzędzia sztucznej inteligencji, którego używałem przez Claude Code do wyszukiwania i weryfikacji literatury, pisania wstępnych wersji tekstu, korekty, redakcji i formatowania. Całą treść przejrzałem samodzielnie i każdą pozycję bibliograficzną sprawdziłem w rejestrach wydawców i serwisów z preprintami.</w:t>
+        <w:t>Eksperymenty uruchomię na węzłach z GPU H100 Wrocławskiego Centrum Sieciowo-Superkomputerowego (WCSS), gdzie zadaniami zarządza SLURM, oraz na zasobach PLGrid. Zamierzam korzystać z asystentów programowania opartych na sztucznej inteligencji, takich jak Claude Code, aby szybciej pisać i testować kod. Pomogą mi też w rutynowych zadaniach, takich jak monitorowanie długich eksperymentów i korekta tekstu.</w:t>
       </w:r>
     </w:p>
     <w:p>
@@ -734,7 +739,7 @@
     </w:p>
     <w:p>
       <w:r>
-        <w:t>Roboty coraz częściej uczy się w cyfrowych bliźniakach, czyli wirtualnych kopiach rzeczywistych miejsc odtworzonych na podstawie ich nagrań, ponieważ nauka w prawdziwym świecie jest powolna, kosztowna i czasem niebezpieczna. Taka kopia nigdy nie jest idealna. Na przykład szklane drzwi mogą zostać odtworzone błędnie i zmylić robota. W efekcie model, który dobrze działa w symulacji, w rzeczywistości często zawodzi, zwłaszcza w miejscach, których wcześniej nie widział. Chcę ustalić, które różnice między kopią a rzeczywistością szkodzą modelowi i w którym miejscu wewnątrz modelu zamieniają się w błędy. Chcę też sprawdzić, które nieliczne rzeczywiste przykłady najlepiej poprawiają zarówno model, jak i kopię. Zbadam to w nawigacji robotów oraz w chwytaniu i przestawianiu przedmiotów. Efektem mają być metody, dzięki którym roboty będą mogły szybciej, taniej i bezpieczniej uczyć się pracy w nowych miejscach.</w:t>
+        <w:t>Roboty coraz częściej uczy się we „śnie”, czyli w kopii świata przewidywanej przez sieć neuronową zwaną modelem świata, ponieważ nauka w prawdziwym świecie jest powolna, kosztowna i czasem niebezpieczna. Sieć uczy się z nagrań wideo, co zwykle dzieje się po ruchu robota, ale jej sen nigdy nie jest idealny. Może zignorować ruch, pozwolić, by chwytak przeszedł przez przedmiot, albo oddalić się od rzeczywistości. Dlatego robot, który dobrze radzi sobie we śnie, w prawdziwym świecie często zawodzi, zwłaszcza w nowych miejscach. Chcę ustalić, które błędy snu szkodzą robotowi i gdzie wewnątrz jego sieci neuronowej zamieniają się w błędne działania. Chcę też sprawdzić, które nieliczne prawdziwe próby najlepiej poprawiają zarówno sen, jak i robota. Zbadam nawigację robotów oraz chwytanie i przestawianie przedmiotów. Efektem mają być metody, dzięki którym roboty będą szybciej, taniej i bezpieczniej uczyć się nowej pracy.</w:t>
       </w:r>
     </w:p>
     <w:p>
@@ -747,7 +752,7 @@
     </w:p>
     <w:p>
       <w:r>
-        <w:t>Robots are increasingly trained in digital twins, that is, virtual copies of real places rebuilt from their recordings, because learning in the real world is slow, costly and sometimes unsafe. Such a copy is never perfect. For example, a glass door may be rebuilt incorrectly and mislead the robot. As a result, a model that works well in simulation often fails in reality, especially in places it has not seen before. I want to find out which differences between the copy and reality harm the model and where inside the model they turn into errors. I also want to check which few real examples best correct both the model and the copy. I will study this in robot navigation and in grasping and moving objects. The result should be methods that let robots learn to work in new places faster, more cheaply and more safely.</w:t>
+        <w:t>Robots are increasingly trained in a "dream", a copy of the world predicted by a neural network called a world model, because real-world learning is slow, costly and sometimes unsafe. The network learns from videos what usually happens after a robot moves, but its dream is never perfect. It may ignore a movement, let the gripper pass through an object or drift away from reality. A robot that does well in the dream often fails in reality, especially in new places. I want to find out which mistakes of the dream harm the robot and where inside its neural network they turn into wrong actions. I also want to check which few real trials best correct both the dream and the robot. I will study robot navigation and the grasping and moving of objects. The result should be methods that let robots learn new work faster, more cheaply and more safely.</w:t>
       </w:r>
     </w:p>
     <w:p>
@@ -773,7 +778,7 @@
     </w:p>
     <w:p>
       <w:r>
-        <w:t>Korzystałem z Claude (przez Claude Code) przy wyszukiwaniu literatury, pisaniu wstępnych wersji tekstu i redakcji, a całą treść i wszystkie pozycje bibliografii sprawdziłem samodzielnie.</w:t>
+        <w:t>Korzystałem z Claude (przez Claude Code) przy wyszukiwaniu literatury, pisaniu wstępnych wersji tekstu i redakcji, a całą treść i wszystkie pozycje bibliografii przejrzałem samodzielnie.</w:t>
       </w:r>
     </w:p>
     <w:p>
@@ -786,132 +791,137 @@
     </w:p>
     <w:p>
       <w:r>
-        <w:t>[1] Torne, M., et al. (2024). Reconciling reality through simulation: A real-to-sim-to-real approach for robust manipulation. RSS.</w:t>
+        <w:t>[1] Ha, D., &amp; Schmidhuber, J. (2018). World models. arXiv:1803.10122.</w:t>
       </w:r>
     </w:p>
     <w:p>
       <w:r>
-        <w:t>[2] Chhablani, G., et al. (2025). EmbodiedSplat: Personalized real-to-sim-to-real navigation with Gaussian splats from a mobile device. ICCV.</w:t>
+        <w:t>[2] Yang, S., et al. (2024). Learning interactive real-world simulators. ICLR.</w:t>
       </w:r>
     </w:p>
     <w:p>
       <w:r>
-        <w:t>[3] Jain, A., et al. (2025). PolaRiS: Scalable real-to-sim evaluations for generalist robot policies. arXiv:2512.16881.</w:t>
+        <w:t>[3] Bar, A., et al. (2025). Navigation world models. CVPR.</w:t>
       </w:r>
     </w:p>
     <w:p>
       <w:r>
-        <w:t>[4] Tobin, J., et al. (2017). Domain randomization for transferring deep neural networks from simulation to the real world. IROS.</w:t>
+        <w:t>[4] Agarwal, N., et al. (2025). Cosmos world foundation model platform for physical AI. arXiv:2501.03575.</w:t>
       </w:r>
     </w:p>
     <w:p>
       <w:r>
-        <w:t>[5] Chebotar, Y., et al. (2019). Closing the sim-to-real loop: Adapting simulation randomization with real world experience. ICRA.</w:t>
+        <w:t>[5] Guo, Y., et al. (2026). VLAW: Iterative co-improvement of vision-language-action policy and world model. arXiv:2602.12063.</w:t>
       </w:r>
     </w:p>
     <w:p>
       <w:r>
-        <w:t>[6] Tiboni, G., et al. (2024). Domain randomization via entropy maximization. ICLR.</w:t>
+        <w:t>[6] Zhang, J., et al. (2026). World-in-World: World models in a closed-loop world. ICLR.</w:t>
       </w:r>
     </w:p>
     <w:p>
       <w:r>
-        <w:t>[7] Memmel, M., et al. (2024). ASID: Active exploration for system identification in robotic manipulation. ICLR.</w:t>
+        <w:t>[7] Wang, Z., et al. (2026). Efficient sim-to-real transfer of world-action models from synthetic priors. arXiv:2606.31101.</w:t>
       </w:r>
     </w:p>
     <w:p>
       <w:r>
-        <w:t>[8] Cheng, S., et al. (2025). Generalizable domain adaptation for sim-and-real policy co-training. NeurIPS.</w:t>
+        <w:t>[8] LeCun, Y. (2022). A path towards autonomous machine intelligence. OpenReview.</w:t>
       </w:r>
     </w:p>
     <w:p>
       <w:r>
-        <w:t>[9] Maddukuri, A., et al. (2025). Sim-and-real co-training: A simple recipe for vision-based robotic manipulation. RSS.</w:t>
+        <w:t>[9] Assran, M., et al. (2025). V-JEPA 2: Self-supervised video models enable understanding, prediction and planning. arXiv:2506.09985.</w:t>
       </w:r>
     </w:p>
     <w:p>
       <w:r>
-        <w:t>[10] Jin, R., et al. (2026). Grounding sim-to-real generalization in robotic manipulation: An empirical study with vision-language-action models. ECCV.</w:t>
+        <w:t>[10] Kachaev, N., et al. (2026). Don't blind your VLA: Aligning visual representations for OOD generalization. AAMAS.</w:t>
       </w:r>
     </w:p>
     <w:p>
       <w:r>
-        <w:t>[11] Xie, A., et al. (2024). Decomposing the generalization gap in imitation learning for visual robotic manipulation. ICRA.</w:t>
+        <w:t>[11] Hafner, D., et al. (2025). Mastering diverse control tasks through world models. Nature.</w:t>
       </w:r>
     </w:p>
     <w:p>
       <w:r>
-        <w:t>[12] Ben-David, S., et al. (2010). A theory of learning from different domains. Machine Learning.</w:t>
+        <w:t>[12] Mittal, M., et al. (2025). Isaac Lab: A GPU-accelerated simulation framework for multi-modal robot learning. arXiv:2511.04831.</w:t>
       </w:r>
     </w:p>
     <w:p>
       <w:r>
-        <w:t>[13] Kachaev, N., et al. (2026). Don't blind your VLA: Aligning visual representations for OOD generalization. AAMAS.</w:t>
+        <w:t>[13] Jang, J., et al. (2025). DreamGen: Unlocking generalization in robot learning through video world models. CoRL.</w:t>
       </w:r>
     </w:p>
     <w:p>
       <w:r>
-        <w:t>[14] Kadian, A., et al. (2020). Sim2Real predictivity: Does evaluation in simulation predict real-world performance? RA-L.</w:t>
+        <w:t>[14] Ye, S., et al. (2026). World action models are zero-shot policies. arXiv:2602.15922.</w:t>
       </w:r>
     </w:p>
     <w:p>
       <w:r>
-        <w:t>[15] Zhao, H., et al. (2019). On learning invariant representations for domain adaptation. ICML.</w:t>
+        <w:t>[15] Zhou, G., et al. (2025). DINO-WM: World models on pre-trained visual features enable zero-shot planning. ICML.</w:t>
       </w:r>
     </w:p>
     <w:p>
       <w:r>
-        <w:t>[16] Ganin, Y., et al. (2016). Domain-adversarial training of neural networks. JMLR.</w:t>
+        <w:t>[16] Rao, P., et al. (2026). SkyJEPA: Learning long-horizon world models for zero-shot sim-to-real control of quadrotors. arXiv:2606.23444.</w:t>
       </w:r>
     </w:p>
     <w:p>
       <w:r>
-        <w:t>[17] Lei, Y., et al. (2026). A mechanistic analysis of sim-and-real co-training in generative robot policies. arXiv:2604.13645.</w:t>
+        <w:t>[17] Guo, Y., et al. (2026). Ctrl-World: A controllable generative world model for robot manipulation. ICLR.</w:t>
       </w:r>
     </w:p>
     <w:p>
       <w:r>
-        <w:t>[18] Kerbl, B., et al. (2023). 3D Gaussian splatting for real-time radiance field rendering. ACM TOG.</w:t>
+        <w:t>[18] Gemini Robotics Team (2025). Evaluating Gemini Robotics policies in a Veo world simulator. arXiv:2512.10675.</w:t>
       </w:r>
     </w:p>
     <w:p>
       <w:r>
-        <w:t>[19] Qureshi, M. N., et al. (2025). SplatSim: Zero-shot Sim2Real transfer of RGB manipulation policies using Gaussian splatting. ICRA.</w:t>
+        <w:t>[19] Li, X., et al. (2024). Evaluating real-world robot manipulation policies in simulation. CoRL.</w:t>
       </w:r>
     </w:p>
     <w:p>
       <w:r>
-        <w:t>[20] Xu, Q., et al. (2026). TwinRL: Digital twin-driven reinforcement learning for real-world robotic manipulation. arXiv:2602.09023.</w:t>
+        <w:t>[20] Ben-David, S., et al. (2010). A theory of learning from different domains. Machine Learning.</w:t>
       </w:r>
     </w:p>
     <w:p>
       <w:r>
-        <w:t>[21] Li, X., et al. (2024). Evaluating real-world robot manipulation policies in simulation. CoRL.</w:t>
+        <w:t>[21] Zhao, H., et al. (2019). On learning invariant representations for domain adaptation. ICML.</w:t>
       </w:r>
     </w:p>
     <w:p>
       <w:r>
-        <w:t>[22] Xie, Z., et al. (2025). Vid2Sim: Realistic and interactive simulation from video for urban navigation. CVPR.</w:t>
+        <w:t>[22] Tobin, J., et al. (2017). Domain randomization for transferring deep neural networks from simulation to the real world. IROS.</w:t>
       </w:r>
     </w:p>
     <w:p>
       <w:r>
-        <w:t>[23] Wang, X., et al. (2026). ReVeal: A reconstruction-aware real-to-sim framework for VLA policy evaluation. arXiv:2609.23910.</w:t>
+        <w:t>[23] Maddukuri, A., et al. (2025). Sim-and-real co-training: A simple recipe for vision-based robotic manipulation. RSS.</w:t>
       </w:r>
     </w:p>
     <w:p>
       <w:r>
-        <w:t>[24] Lee, Y., et al. (2023). Surgical fine-tuning improves adaptation to distribution shifts. ICLR.</w:t>
+        <w:t>[24] Lei, Y., et al. (2026). A mechanistic analysis of sim-and-real co-training in generative robot policies. arXiv:2604.13645.</w:t>
       </w:r>
     </w:p>
     <w:p>
       <w:r>
-        <w:t>[25] Agia, C., et al. (2025). CUPID: Curating data your robot loves with influence functions. CoRL.</w:t>
+        <w:t>[25] Lee, Y., et al. (2023). Surgical fine-tuning improves adaptation to distribution shifts. ICLR.</w:t>
       </w:r>
     </w:p>
     <w:p>
       <w:r>
-        <w:t>[26] Liao, A., et al. (2026). Active real-world factor-based evaluation for generalist robot policies. arXiv:2607.14439.</w:t>
+        <w:t>[26] Xu, Q., et al. (2026). TwinRL: Digital twin-driven reinforcement learning for real-world robotic manipulation. arXiv:2602.09023.</w:t>
+      </w:r>
+    </w:p>
+    <w:p>
+      <w:r>
+        <w:t>[27] Xie, A., et al. (2024). Decomposing the generalization gap in imitation learning for visual robotic manipulation. ICRA.</w:t>
       </w:r>
     </w:p>
     <w:p>

</xml_diff>